<commit_message>
Testing to see if I can use VSCode to commit changes instead of manually uploading the main document file in GitHub
</commit_message>
<xml_diff>
--- a/CIS4374 Semester Project Maximiliano Soto.docx
+++ b/CIS4374 Semester Project Maximiliano Soto.docx
@@ -1584,145 +1584,243 @@
           <w:b/>
           <w:bCs/>
         </w:rPr>
-        <w:t xml:space="preserve">Use Case </w:t>
-      </w:r>
-      <w:r>
+        <w:t>Use Case 6</w:t>
+      </w:r>
+    </w:p>
+    <w:p>
+      <w:r>
+        <w:t xml:space="preserve">Title: </w:t>
+      </w:r>
+      <w:r>
+        <w:t>Extending an Active Parked Session</w:t>
+      </w:r>
+    </w:p>
+    <w:p>
+      <w:r>
+        <w:lastRenderedPageBreak/>
+        <w:t>Actor: Driver</w:t>
+      </w:r>
+    </w:p>
+    <w:p>
+      <w:r>
+        <w:t xml:space="preserve">Precondition: </w:t>
+      </w:r>
+      <w:r>
+        <w:t>Driver has an active parking session that has not yet expired.</w:t>
+      </w:r>
+    </w:p>
+    <w:p>
+      <w:r>
+        <w:t>Steps:</w:t>
+      </w:r>
+    </w:p>
+    <w:p>
+      <w:pPr>
+        <w:pStyle w:val="ListParagraph"/>
+        <w:numPr>
+          <w:ilvl w:val="0"/>
+          <w:numId w:val="12"/>
+        </w:numPr>
+      </w:pPr>
+      <w:r>
+        <w:t>Driver receives a notification that their session is about to expire.</w:t>
+      </w:r>
+    </w:p>
+    <w:p>
+      <w:pPr>
+        <w:pStyle w:val="ListParagraph"/>
+        <w:numPr>
+          <w:ilvl w:val="0"/>
+          <w:numId w:val="12"/>
+        </w:numPr>
+      </w:pPr>
+      <w:r>
+        <w:t>Driver opens the app and selects “Extend Session.”</w:t>
+      </w:r>
+    </w:p>
+    <w:p>
+      <w:pPr>
+        <w:pStyle w:val="ListParagraph"/>
+        <w:numPr>
+          <w:ilvl w:val="0"/>
+          <w:numId w:val="12"/>
+        </w:numPr>
+      </w:pPr>
+      <w:r>
+        <w:t>Driver selects the amount of time to extend the session for.</w:t>
+      </w:r>
+    </w:p>
+    <w:p>
+      <w:pPr>
+        <w:pStyle w:val="ListParagraph"/>
+        <w:numPr>
+          <w:ilvl w:val="0"/>
+          <w:numId w:val="12"/>
+        </w:numPr>
+      </w:pPr>
+      <w:r>
+        <w:t xml:space="preserve">System checks if the space is still available for the extended period. </w:t>
+      </w:r>
+    </w:p>
+    <w:p>
+      <w:pPr>
+        <w:pStyle w:val="ListParagraph"/>
+        <w:numPr>
+          <w:ilvl w:val="0"/>
+          <w:numId w:val="12"/>
+        </w:numPr>
+      </w:pPr>
+      <w:r>
+        <w:t>Driver confirms the additional time and associated cost.</w:t>
+      </w:r>
+    </w:p>
+    <w:p>
+      <w:pPr>
+        <w:pStyle w:val="ListParagraph"/>
+        <w:numPr>
+          <w:ilvl w:val="0"/>
+          <w:numId w:val="12"/>
+        </w:numPr>
+      </w:pPr>
+      <w:r>
+        <w:t>System processes the payment and updates the session with additional time.</w:t>
+      </w:r>
+    </w:p>
+    <w:p>
+      <w:r>
+        <w:t>Postcondition: The session is extended and the driver avoids an overstay charge.</w:t>
+      </w:r>
+    </w:p>
+    <w:p>
+      <w:pPr>
         <w:rPr>
           <w:b/>
           <w:bCs/>
         </w:rPr>
-        <w:t>6</w:t>
-      </w:r>
-    </w:p>
-    <w:p>
-      <w:r>
-        <w:t xml:space="preserve">Title: </w:t>
-      </w:r>
-      <w:r>
-        <w:t>Extending an Active Parked Session</w:t>
-      </w:r>
-    </w:p>
-    <w:p>
-      <w:r>
-        <w:lastRenderedPageBreak/>
-        <w:t>Actor: Driver</w:t>
-      </w:r>
-    </w:p>
-    <w:p>
-      <w:r>
-        <w:t xml:space="preserve">Precondition: </w:t>
-      </w:r>
-      <w:r>
-        <w:t>Driver has an active parking session that has not yet expired.</w:t>
-      </w:r>
-    </w:p>
-    <w:p>
-      <w:r>
-        <w:t>Steps:</w:t>
-      </w:r>
-    </w:p>
-    <w:p>
-      <w:pPr>
-        <w:pStyle w:val="ListParagraph"/>
-        <w:numPr>
-          <w:ilvl w:val="0"/>
-          <w:numId w:val="12"/>
-        </w:numPr>
-      </w:pPr>
-      <w:r>
-        <w:t>Driver receives a notification that their session is about to expire.</w:t>
-      </w:r>
-    </w:p>
-    <w:p>
-      <w:pPr>
-        <w:pStyle w:val="ListParagraph"/>
-        <w:numPr>
-          <w:ilvl w:val="0"/>
-          <w:numId w:val="12"/>
-        </w:numPr>
-      </w:pPr>
-      <w:r>
-        <w:t>Driver opens the app and selects “Extend Session.”</w:t>
-      </w:r>
-    </w:p>
-    <w:p>
-      <w:pPr>
-        <w:pStyle w:val="ListParagraph"/>
-        <w:numPr>
-          <w:ilvl w:val="0"/>
-          <w:numId w:val="12"/>
-        </w:numPr>
-      </w:pPr>
-      <w:r>
-        <w:t>Driver selects the amount of time to extend the session for.</w:t>
-      </w:r>
-    </w:p>
-    <w:p>
-      <w:pPr>
-        <w:pStyle w:val="ListParagraph"/>
-        <w:numPr>
-          <w:ilvl w:val="0"/>
-          <w:numId w:val="12"/>
-        </w:numPr>
-      </w:pPr>
-      <w:r>
-        <w:t xml:space="preserve">System checks if the space is still available for the extended period. </w:t>
-      </w:r>
-    </w:p>
-    <w:p>
-      <w:pPr>
-        <w:pStyle w:val="ListParagraph"/>
-        <w:numPr>
-          <w:ilvl w:val="0"/>
-          <w:numId w:val="12"/>
-        </w:numPr>
-      </w:pPr>
-      <w:r>
-        <w:t>Driver confirms the additional time and associated cost.</w:t>
-      </w:r>
-    </w:p>
-    <w:p>
-      <w:pPr>
-        <w:pStyle w:val="ListParagraph"/>
-        <w:numPr>
-          <w:ilvl w:val="0"/>
-          <w:numId w:val="12"/>
-        </w:numPr>
-      </w:pPr>
-      <w:r>
-        <w:t>System processes the payment and updates the session with additional time.</w:t>
-      </w:r>
-    </w:p>
-    <w:p>
-      <w:r>
-        <w:t>Postcondition: The session is extended and the driver avoids an overstay charge.</w:t>
-      </w:r>
-    </w:p>
-    <w:p>
-      <w:pPr>
+      </w:pPr>
+      <w:r>
         <w:rPr>
           <w:b/>
           <w:bCs/>
         </w:rPr>
-      </w:pPr>
-      <w:r>
+        <w:t>Use Case 7</w:t>
+      </w:r>
+    </w:p>
+    <w:p>
+      <w:r>
+        <w:t>Title: Cancelling a Parking Reservation</w:t>
+      </w:r>
+    </w:p>
+    <w:p>
+      <w:r>
+        <w:t>Actor: Driver</w:t>
+      </w:r>
+    </w:p>
+    <w:p>
+      <w:r>
+        <w:t>Precondition: Driver has a future reservation that is not yet active.</w:t>
+      </w:r>
+    </w:p>
+    <w:p>
+      <w:r>
+        <w:t>Steps:</w:t>
+      </w:r>
+    </w:p>
+    <w:p>
+      <w:pPr>
+        <w:pStyle w:val="ListParagraph"/>
+        <w:numPr>
+          <w:ilvl w:val="0"/>
+          <w:numId w:val="13"/>
+        </w:numPr>
+      </w:pPr>
+      <w:r>
+        <w:t>Driver navigates to their “My Reservations” page.</w:t>
+      </w:r>
+    </w:p>
+    <w:p>
+      <w:pPr>
+        <w:pStyle w:val="ListParagraph"/>
+        <w:numPr>
+          <w:ilvl w:val="0"/>
+          <w:numId w:val="13"/>
+        </w:numPr>
+      </w:pPr>
+      <w:r>
+        <w:t>Driver selects a reservation to cancel.</w:t>
+      </w:r>
+    </w:p>
+    <w:p>
+      <w:pPr>
+        <w:pStyle w:val="ListParagraph"/>
+        <w:numPr>
+          <w:ilvl w:val="0"/>
+          <w:numId w:val="13"/>
+        </w:numPr>
+      </w:pPr>
+      <w:r>
+        <w:t>System displays the cancellation policy and refund amount.</w:t>
+      </w:r>
+    </w:p>
+    <w:p>
+      <w:pPr>
+        <w:pStyle w:val="ListParagraph"/>
+        <w:numPr>
+          <w:ilvl w:val="0"/>
+          <w:numId w:val="13"/>
+        </w:numPr>
+      </w:pPr>
+      <w:r>
+        <w:t>Driver confirms the cancellation.</w:t>
+      </w:r>
+    </w:p>
+    <w:p>
+      <w:pPr>
+        <w:pStyle w:val="ListParagraph"/>
+        <w:numPr>
+          <w:ilvl w:val="0"/>
+          <w:numId w:val="13"/>
+        </w:numPr>
+      </w:pPr>
+      <w:r>
+        <w:t>System cancels the reservation</w:t>
+      </w:r>
+      <w:r>
+        <w:t>,</w:t>
+      </w:r>
+      <w:r>
+        <w:t xml:space="preserve"> processes a refund, </w:t>
+      </w:r>
+      <w:r>
+        <w:t>then sends a digital receipt to the driver</w:t>
+      </w:r>
+      <w:r>
+        <w:t>.</w:t>
+      </w:r>
+    </w:p>
+    <w:p>
+      <w:r>
+        <w:t>Postcondition: The driver is refunded and the reservation is cancelled, freeing the space back to availability.</w:t>
+      </w:r>
+    </w:p>
+    <w:p>
+      <w:pPr>
         <w:rPr>
           <w:b/>
           <w:bCs/>
         </w:rPr>
-        <w:t xml:space="preserve">Use Case </w:t>
-      </w:r>
+      </w:pPr>
       <w:r>
         <w:rPr>
           <w:b/>
           <w:bCs/>
         </w:rPr>
-        <w:t>7</w:t>
-      </w:r>
-    </w:p>
-    <w:p>
-      <w:r>
-        <w:t>Title: Cancelling a Parking Reservation</w:t>
+        <w:t>Use Case 8</w:t>
+      </w:r>
+    </w:p>
+    <w:p>
+      <w:r>
+        <w:t>Title: Modifying an Existing Reservation</w:t>
       </w:r>
     </w:p>
     <w:p>
@@ -1732,7 +1830,10 @@
     </w:p>
     <w:p>
       <w:r>
-        <w:t>Precondition: Driver has a future reservation that is not yet active.</w:t>
+        <w:t xml:space="preserve">Precondition: Driver has an existing, </w:t>
+      </w:r>
+      <w:r>
+        <w:t>non-active reservation.</w:t>
       </w:r>
     </w:p>
     <w:p>
@@ -1745,7 +1846,7 @@
         <w:pStyle w:val="ListParagraph"/>
         <w:numPr>
           <w:ilvl w:val="0"/>
-          <w:numId w:val="13"/>
+          <w:numId w:val="14"/>
         </w:numPr>
       </w:pPr>
       <w:r>
@@ -1757,64 +1858,80 @@
         <w:pStyle w:val="ListParagraph"/>
         <w:numPr>
           <w:ilvl w:val="0"/>
-          <w:numId w:val="13"/>
-        </w:numPr>
-      </w:pPr>
-      <w:r>
-        <w:t>Driver selects a reservation to cancel.</w:t>
-      </w:r>
-    </w:p>
-    <w:p>
-      <w:pPr>
-        <w:pStyle w:val="ListParagraph"/>
-        <w:numPr>
-          <w:ilvl w:val="0"/>
-          <w:numId w:val="13"/>
-        </w:numPr>
-      </w:pPr>
-      <w:r>
-        <w:t>System displays the cancellation policy and refund amount.</w:t>
-      </w:r>
-    </w:p>
-    <w:p>
-      <w:pPr>
-        <w:pStyle w:val="ListParagraph"/>
-        <w:numPr>
-          <w:ilvl w:val="0"/>
-          <w:numId w:val="13"/>
-        </w:numPr>
-      </w:pPr>
-      <w:r>
-        <w:t>Driver confirms the cancellation.</w:t>
-      </w:r>
-    </w:p>
-    <w:p>
-      <w:pPr>
-        <w:pStyle w:val="ListParagraph"/>
-        <w:numPr>
-          <w:ilvl w:val="0"/>
-          <w:numId w:val="13"/>
-        </w:numPr>
-      </w:pPr>
-      <w:r>
-        <w:t>System cancels the reservation</w:t>
-      </w:r>
-      <w:r>
-        <w:t>,</w:t>
-      </w:r>
-      <w:r>
-        <w:t xml:space="preserve"> processes a refund, </w:t>
-      </w:r>
-      <w:r>
-        <w:t>then sends a digital receipt to the driver</w:t>
-      </w:r>
-      <w:r>
-        <w:t>.</w:t>
-      </w:r>
-    </w:p>
-    <w:p>
-      <w:r>
-        <w:t>Postcondition: The driver is refunded and the reservation is cancelled, freeing the space back to availability.</w:t>
+          <w:numId w:val="14"/>
+        </w:numPr>
+      </w:pPr>
+      <w:r>
+        <w:t>Driver selects a reservation to modify.</w:t>
+      </w:r>
+    </w:p>
+    <w:p>
+      <w:pPr>
+        <w:pStyle w:val="ListParagraph"/>
+        <w:numPr>
+          <w:ilvl w:val="0"/>
+          <w:numId w:val="14"/>
+        </w:numPr>
+      </w:pPr>
+      <w:r>
+        <w:lastRenderedPageBreak/>
+        <w:t>Driver changes the date, time, or duration.</w:t>
+      </w:r>
+    </w:p>
+    <w:p>
+      <w:pPr>
+        <w:pStyle w:val="ListParagraph"/>
+        <w:numPr>
+          <w:ilvl w:val="0"/>
+          <w:numId w:val="14"/>
+        </w:numPr>
+      </w:pPr>
+      <w:r>
+        <w:t xml:space="preserve">System checks availability </w:t>
+      </w:r>
+      <w:r>
+        <w:t>for updated parameters.</w:t>
+      </w:r>
+    </w:p>
+    <w:p>
+      <w:pPr>
+        <w:pStyle w:val="ListParagraph"/>
+        <w:numPr>
+          <w:ilvl w:val="0"/>
+          <w:numId w:val="14"/>
+        </w:numPr>
+      </w:pPr>
+      <w:r>
+        <w:t>System calculates the price and displays the amount that will be owed or refunded.</w:t>
+      </w:r>
+    </w:p>
+    <w:p>
+      <w:pPr>
+        <w:pStyle w:val="ListParagraph"/>
+        <w:numPr>
+          <w:ilvl w:val="0"/>
+          <w:numId w:val="14"/>
+        </w:numPr>
+      </w:pPr>
+      <w:r>
+        <w:t>Driver confirms the changes.</w:t>
+      </w:r>
+    </w:p>
+    <w:p>
+      <w:pPr>
+        <w:pStyle w:val="ListParagraph"/>
+        <w:numPr>
+          <w:ilvl w:val="0"/>
+          <w:numId w:val="14"/>
+        </w:numPr>
+      </w:pPr>
+      <w:r>
+        <w:t>System processes payment or refund and sends a digital receipt to the driver.</w:t>
+      </w:r>
+    </w:p>
+    <w:p>
+      <w:r>
+        <w:t>Postcondition: The reservation is updated with the new details.</w:t>
       </w:r>
     </w:p>
     <w:p>
@@ -1829,262 +1946,110 @@
           <w:b/>
           <w:bCs/>
         </w:rPr>
-        <w:t xml:space="preserve">Use Case </w:t>
-      </w:r>
-      <w:r>
+        <w:t>Use Case 9</w:t>
+      </w:r>
+    </w:p>
+    <w:p>
+      <w:r>
+        <w:t>Title: Registering a New Driver Account</w:t>
+      </w:r>
+    </w:p>
+    <w:p>
+      <w:r>
+        <w:t>Actor: Driver</w:t>
+      </w:r>
+    </w:p>
+    <w:p>
+      <w:r>
+        <w:t>Precondition: Driver wants to reserve a parking space but does not have an account yet.</w:t>
+      </w:r>
+    </w:p>
+    <w:p>
+      <w:r>
+        <w:t>Steps:</w:t>
+      </w:r>
+    </w:p>
+    <w:p>
+      <w:pPr>
+        <w:pStyle w:val="ListParagraph"/>
+        <w:numPr>
+          <w:ilvl w:val="0"/>
+          <w:numId w:val="15"/>
+        </w:numPr>
+      </w:pPr>
+      <w:r>
+        <w:t>Driver selects “Sign Up” on either the mobile app or web platform.</w:t>
+      </w:r>
+    </w:p>
+    <w:p>
+      <w:pPr>
+        <w:pStyle w:val="ListParagraph"/>
+        <w:numPr>
+          <w:ilvl w:val="0"/>
+          <w:numId w:val="15"/>
+        </w:numPr>
+      </w:pPr>
+      <w:r>
+        <w:t>Driver enters personal information (name, email, phone) and creates a password.</w:t>
+      </w:r>
+    </w:p>
+    <w:p>
+      <w:pPr>
+        <w:pStyle w:val="ListParagraph"/>
+        <w:numPr>
+          <w:ilvl w:val="0"/>
+          <w:numId w:val="15"/>
+        </w:numPr>
+      </w:pPr>
+      <w:r>
+        <w:t>System validates the input and checks if there are existing accounts.</w:t>
+      </w:r>
+    </w:p>
+    <w:p>
+      <w:pPr>
+        <w:pStyle w:val="ListParagraph"/>
+        <w:numPr>
+          <w:ilvl w:val="0"/>
+          <w:numId w:val="15"/>
+        </w:numPr>
+      </w:pPr>
+      <w:r>
+        <w:t>Driver optionally adds payment method and vehicle information.</w:t>
+      </w:r>
+    </w:p>
+    <w:p>
+      <w:pPr>
+        <w:pStyle w:val="ListParagraph"/>
+        <w:numPr>
+          <w:ilvl w:val="0"/>
+          <w:numId w:val="15"/>
+        </w:numPr>
+      </w:pPr>
+      <w:r>
+        <w:t xml:space="preserve">System creates the account and sends a verification email or </w:t>
+      </w:r>
+      <w:r>
+        <w:t>SMS.</w:t>
+      </w:r>
+    </w:p>
+    <w:p>
+      <w:r>
+        <w:t>Postcondition: The driver now has a verified account that exists in the system and is now free to reserve parking space.</w:t>
+      </w:r>
+    </w:p>
+    <w:p>
+      <w:pPr>
         <w:rPr>
           <w:b/>
           <w:bCs/>
         </w:rPr>
-        <w:t>8</w:t>
-      </w:r>
-    </w:p>
-    <w:p>
-      <w:r>
-        <w:t>Title: Modifying an Existing Reservation</w:t>
-      </w:r>
-    </w:p>
-    <w:p>
-      <w:r>
-        <w:t>Actor: Driver</w:t>
-      </w:r>
-    </w:p>
-    <w:p>
-      <w:r>
-        <w:t xml:space="preserve">Precondition: Driver has an existing, </w:t>
-      </w:r>
-      <w:r>
-        <w:t>non-active reservation.</w:t>
-      </w:r>
-    </w:p>
-    <w:p>
-      <w:r>
-        <w:t>Steps:</w:t>
-      </w:r>
-    </w:p>
-    <w:p>
-      <w:pPr>
-        <w:pStyle w:val="ListParagraph"/>
-        <w:numPr>
-          <w:ilvl w:val="0"/>
-          <w:numId w:val="14"/>
-        </w:numPr>
-      </w:pPr>
-      <w:r>
-        <w:t>Driver navigates to their “My Reservations” page.</w:t>
-      </w:r>
-    </w:p>
-    <w:p>
-      <w:pPr>
-        <w:pStyle w:val="ListParagraph"/>
-        <w:numPr>
-          <w:ilvl w:val="0"/>
-          <w:numId w:val="14"/>
-        </w:numPr>
-      </w:pPr>
-      <w:r>
-        <w:t>Driver selects a reservation to modify.</w:t>
-      </w:r>
-    </w:p>
-    <w:p>
-      <w:pPr>
-        <w:pStyle w:val="ListParagraph"/>
-        <w:numPr>
-          <w:ilvl w:val="0"/>
-          <w:numId w:val="14"/>
-        </w:numPr>
-      </w:pPr>
-      <w:r>
-        <w:lastRenderedPageBreak/>
-        <w:t>Driver changes the date, time, or duration.</w:t>
-      </w:r>
-    </w:p>
-    <w:p>
-      <w:pPr>
-        <w:pStyle w:val="ListParagraph"/>
-        <w:numPr>
-          <w:ilvl w:val="0"/>
-          <w:numId w:val="14"/>
-        </w:numPr>
-      </w:pPr>
-      <w:r>
-        <w:t xml:space="preserve">System checks availability </w:t>
-      </w:r>
-      <w:r>
-        <w:t>for updated parameters.</w:t>
-      </w:r>
-    </w:p>
-    <w:p>
-      <w:pPr>
-        <w:pStyle w:val="ListParagraph"/>
-        <w:numPr>
-          <w:ilvl w:val="0"/>
-          <w:numId w:val="14"/>
-        </w:numPr>
-      </w:pPr>
-      <w:r>
-        <w:t>System calculates the price and displays the amount that will be owed or refunded.</w:t>
-      </w:r>
-    </w:p>
-    <w:p>
-      <w:pPr>
-        <w:pStyle w:val="ListParagraph"/>
-        <w:numPr>
-          <w:ilvl w:val="0"/>
-          <w:numId w:val="14"/>
-        </w:numPr>
-      </w:pPr>
-      <w:r>
-        <w:t>Driver confirms the changes.</w:t>
-      </w:r>
-    </w:p>
-    <w:p>
-      <w:pPr>
-        <w:pStyle w:val="ListParagraph"/>
-        <w:numPr>
-          <w:ilvl w:val="0"/>
-          <w:numId w:val="14"/>
-        </w:numPr>
-      </w:pPr>
-      <w:r>
-        <w:t>System processes payment or refund and sends a digital receipt to the driver.</w:t>
-      </w:r>
-    </w:p>
-    <w:p>
-      <w:r>
-        <w:t>Postcondition: The reservation is updated with the new details.</w:t>
-      </w:r>
-    </w:p>
-    <w:p>
-      <w:pPr>
+      </w:pPr>
+      <w:r>
         <w:rPr>
           <w:b/>
           <w:bCs/>
         </w:rPr>
-      </w:pPr>
-      <w:r>
-        <w:rPr>
-          <w:b/>
-          <w:bCs/>
-        </w:rPr>
-        <w:t xml:space="preserve">Use Case </w:t>
-      </w:r>
-      <w:r>
-        <w:rPr>
-          <w:b/>
-          <w:bCs/>
-        </w:rPr>
-        <w:t>9</w:t>
-      </w:r>
-    </w:p>
-    <w:p>
-      <w:r>
-        <w:t>Title: Registering a New Driver Account</w:t>
-      </w:r>
-    </w:p>
-    <w:p>
-      <w:r>
-        <w:t>Actor: Driver</w:t>
-      </w:r>
-    </w:p>
-    <w:p>
-      <w:r>
-        <w:t>Precondition: Driver wants to reserve a parking space but does not have an account yet.</w:t>
-      </w:r>
-    </w:p>
-    <w:p>
-      <w:r>
-        <w:t>Steps:</w:t>
-      </w:r>
-    </w:p>
-    <w:p>
-      <w:pPr>
-        <w:pStyle w:val="ListParagraph"/>
-        <w:numPr>
-          <w:ilvl w:val="0"/>
-          <w:numId w:val="15"/>
-        </w:numPr>
-      </w:pPr>
-      <w:r>
-        <w:t>Driver selects “Sign Up” on either the mobile app or web platform.</w:t>
-      </w:r>
-    </w:p>
-    <w:p>
-      <w:pPr>
-        <w:pStyle w:val="ListParagraph"/>
-        <w:numPr>
-          <w:ilvl w:val="0"/>
-          <w:numId w:val="15"/>
-        </w:numPr>
-      </w:pPr>
-      <w:r>
-        <w:t>Driver enters personal information (name, email, phone) and creates a password.</w:t>
-      </w:r>
-    </w:p>
-    <w:p>
-      <w:pPr>
-        <w:pStyle w:val="ListParagraph"/>
-        <w:numPr>
-          <w:ilvl w:val="0"/>
-          <w:numId w:val="15"/>
-        </w:numPr>
-      </w:pPr>
-      <w:r>
-        <w:t>System validates the input and checks if there are existing accounts.</w:t>
-      </w:r>
-    </w:p>
-    <w:p>
-      <w:pPr>
-        <w:pStyle w:val="ListParagraph"/>
-        <w:numPr>
-          <w:ilvl w:val="0"/>
-          <w:numId w:val="15"/>
-        </w:numPr>
-      </w:pPr>
-      <w:r>
-        <w:t>Driver optionally adds payment method and vehicle information.</w:t>
-      </w:r>
-    </w:p>
-    <w:p>
-      <w:pPr>
-        <w:pStyle w:val="ListParagraph"/>
-        <w:numPr>
-          <w:ilvl w:val="0"/>
-          <w:numId w:val="15"/>
-        </w:numPr>
-      </w:pPr>
-      <w:r>
-        <w:t xml:space="preserve">System creates the account and sends a verification email or </w:t>
-      </w:r>
-      <w:r>
-        <w:t>SMS.</w:t>
-      </w:r>
-    </w:p>
-    <w:p>
-      <w:r>
-        <w:t>Postcondition: The driver now has a verified account that exists in the system and is now free to reserve parking space.</w:t>
-      </w:r>
-    </w:p>
-    <w:p>
-      <w:pPr>
-        <w:rPr>
-          <w:b/>
-          <w:bCs/>
-        </w:rPr>
-      </w:pPr>
-      <w:r>
-        <w:rPr>
-          <w:b/>
-          <w:bCs/>
-        </w:rPr>
-        <w:t xml:space="preserve">Use Case </w:t>
-      </w:r>
-      <w:r>
-        <w:rPr>
-          <w:b/>
-          <w:bCs/>
-        </w:rPr>
-        <w:t>10</w:t>
+        <w:t>Use Case 10</w:t>
       </w:r>
     </w:p>
     <w:p>
@@ -2294,14 +2259,7 @@
           <w:b/>
           <w:bCs/>
         </w:rPr>
-        <w:t>Use Case 1</w:t>
-      </w:r>
-      <w:r>
-        <w:rPr>
-          <w:b/>
-          <w:bCs/>
-        </w:rPr>
-        <w:t>2</w:t>
+        <w:t>Use Case 12</w:t>
       </w:r>
     </w:p>
     <w:p>
@@ -2811,10 +2769,7 @@
     </w:p>
     <w:p>
       <w:r>
-        <w:t xml:space="preserve">Precondition: </w:t>
-      </w:r>
-      <w:r>
-        <w:t>Operator is logged into an approved operator account and has a garage fac</w:t>
+        <w:t>Precondition: Operator is logged into an approved operator account and has a garage fac</w:t>
       </w:r>
       <w:r>
         <w:t xml:space="preserve">ility </w:t>
@@ -3050,7 +3005,103 @@
       <w:r>
         <w:t>Postcondition: The account is updated according to the administrator’s action, and the change is recorded.</w:t>
       </w:r>
-    </w:p>
+      <w:r>
+        <w:t xml:space="preserve"> </w:t>
+      </w:r>
+    </w:p>
+    <w:p>
+      <w:r>
+        <w:br w:type="page"/>
+      </w:r>
+    </w:p>
+    <w:p>
+      <w:pPr>
+        <w:pStyle w:val="Heading1"/>
+        <w:rPr>
+          <w:b/>
+          <w:bCs/>
+          <w:sz w:val="48"/>
+          <w:szCs w:val="48"/>
+        </w:rPr>
+      </w:pPr>
+      <w:r>
+        <w:rPr>
+          <w:b/>
+          <w:bCs/>
+          <w:noProof/>
+        </w:rPr>
+        <w:lastRenderedPageBreak/>
+        <mc:AlternateContent>
+          <mc:Choice Requires="wps">
+            <w:drawing>
+              <wp:anchor distT="0" distB="0" distL="114300" distR="114300" simplePos="0" relativeHeight="251665408" behindDoc="0" locked="0" layoutInCell="1" allowOverlap="1" wp14:anchorId="756E0E7D" wp14:editId="5926BBD3">
+                <wp:simplePos x="0" y="0"/>
+                <wp:positionH relativeFrom="margin">
+                  <wp:align>center</wp:align>
+                </wp:positionH>
+                <wp:positionV relativeFrom="paragraph">
+                  <wp:posOffset>361950</wp:posOffset>
+                </wp:positionV>
+                <wp:extent cx="6286500" cy="9525"/>
+                <wp:effectExtent l="0" t="0" r="19050" b="28575"/>
+                <wp:wrapNone/>
+                <wp:docPr id="460061269" name="Straight Connector 1"/>
+                <wp:cNvGraphicFramePr/>
+                <a:graphic xmlns:a="http://schemas.openxmlformats.org/drawingml/2006/main">
+                  <a:graphicData uri="http://schemas.microsoft.com/office/word/2010/wordprocessingShape">
+                    <wps:wsp>
+                      <wps:cNvCnPr/>
+                      <wps:spPr>
+                        <a:xfrm>
+                          <a:off x="0" y="0"/>
+                          <a:ext cx="6286500" cy="9525"/>
+                        </a:xfrm>
+                        <a:prstGeom prst="line">
+                          <a:avLst/>
+                        </a:prstGeom>
+                      </wps:spPr>
+                      <wps:style>
+                        <a:lnRef idx="1">
+                          <a:schemeClr val="accent1"/>
+                        </a:lnRef>
+                        <a:fillRef idx="0">
+                          <a:schemeClr val="accent1"/>
+                        </a:fillRef>
+                        <a:effectRef idx="0">
+                          <a:schemeClr val="accent1"/>
+                        </a:effectRef>
+                        <a:fontRef idx="minor">
+                          <a:schemeClr val="tx1"/>
+                        </a:fontRef>
+                      </wps:style>
+                      <wps:bodyPr/>
+                    </wps:wsp>
+                  </a:graphicData>
+                </a:graphic>
+              </wp:anchor>
+            </w:drawing>
+          </mc:Choice>
+          <mc:Fallback>
+            <w:pict>
+              <v:line w14:anchorId="1357B68E" id="Straight Connector 1" o:spid="_x0000_s1026" style="position:absolute;z-index:251665408;visibility:visible;mso-wrap-style:square;mso-wrap-distance-left:9pt;mso-wrap-distance-top:0;mso-wrap-distance-right:9pt;mso-wrap-distance-bottom:0;mso-position-horizontal:center;mso-position-horizontal-relative:margin;mso-position-vertical:absolute;mso-position-vertical-relative:text" from="0,28.5pt" to="495pt,29.25pt" o:gfxdata="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" strokecolor="#156082 [3204]" strokeweight=".5pt">
+                <v:stroke joinstyle="miter"/>
+                <w10:wrap anchorx="margin"/>
+              </v:line>
+            </w:pict>
+          </mc:Fallback>
+        </mc:AlternateContent>
+      </w:r>
+      <w:r>
+        <w:rPr>
+          <w:b/>
+          <w:bCs/>
+          <w:sz w:val="48"/>
+          <w:szCs w:val="48"/>
+        </w:rPr>
+        <w:t>WBS</w:t>
+      </w:r>
+    </w:p>
+    <w:p/>
     <w:sectPr>
       <w:pgSz w:w="12240" w:h="15840"/>
       <w:pgMar w:top="1440" w:right="1440" w:bottom="1440" w:left="1440" w:header="720" w:footer="720" w:gutter="0"/>
@@ -6476,6 +6527,23 @@
 </file>
 
 <file path=customXml/item1.xml><?xml version="1.0" encoding="utf-8"?>
+<p:properties xmlns:p="http://schemas.microsoft.com/office/2006/metadata/properties" xmlns:xsi="http://www.w3.org/2001/XMLSchema-instance" xmlns:pc="http://schemas.microsoft.com/office/infopath/2007/PartnerControls">
+  <documentManagement>
+    <_activity xmlns="7c904bd3-ab19-431b-8878-400d77873c6b" xsi:nil="true"/>
+  </documentManagement>
+</p:properties>
+</file>
+
+<file path=customXml/item2.xml><?xml version="1.0" encoding="utf-8"?>
+<?mso-contentType ?>
+<FormTemplates xmlns="http://schemas.microsoft.com/sharepoint/v3/contenttype/forms">
+  <Display>DocumentLibraryForm</Display>
+  <Edit>DocumentLibraryForm</Edit>
+  <New>DocumentLibraryForm</New>
+</FormTemplates>
+</file>
+
+<file path=customXml/item3.xml><?xml version="1.0" encoding="utf-8"?>
 <ct:contentTypeSchema xmlns:ct="http://schemas.microsoft.com/office/2006/metadata/contentType" xmlns:ma="http://schemas.microsoft.com/office/2006/metadata/properties/metaAttributes" ct:_="" ma:_="" ma:contentTypeName="Document" ma:contentTypeID="0x01010051F921AF06037640B1C033B8C780879E" ma:contentTypeVersion="11" ma:contentTypeDescription="Create a new document." ma:contentTypeScope="" ma:versionID="5e8acc71b10a0f3f6ad7453ce98c6da5">
   <xsd:schema xmlns:xsd="http://www.w3.org/2001/XMLSchema" xmlns:xs="http://www.w3.org/2001/XMLSchema" xmlns:p="http://schemas.microsoft.com/office/2006/metadata/properties" xmlns:ns3="7c904bd3-ab19-431b-8878-400d77873c6b" targetNamespace="http://schemas.microsoft.com/office/2006/metadata/properties" ma:root="true" ma:fieldsID="550c14f6091b965fd1e27842c5f72f12" ns3:_="">
     <xsd:import namespace="7c904bd3-ab19-431b-8878-400d77873c6b"/>
@@ -6663,24 +6731,25 @@
 </ct:contentTypeSchema>
 </file>
 
-<file path=customXml/item2.xml><?xml version="1.0" encoding="utf-8"?>
-<?mso-contentType ?>
-<FormTemplates xmlns="http://schemas.microsoft.com/sharepoint/v3/contenttype/forms">
-  <Display>DocumentLibraryForm</Display>
-  <Edit>DocumentLibraryForm</Edit>
-  <New>DocumentLibraryForm</New>
-</FormTemplates>
+<file path=customXml/itemProps1.xml><?xml version="1.0" encoding="utf-8"?>
+<ds:datastoreItem xmlns:ds="http://schemas.openxmlformats.org/officeDocument/2006/customXml" ds:itemID="{81DE79A3-CFAE-4F95-87AB-1B8A80DE321E}">
+  <ds:schemaRefs>
+    <ds:schemaRef ds:uri="http://schemas.microsoft.com/office/2006/metadata/properties"/>
+    <ds:schemaRef ds:uri="http://schemas.microsoft.com/office/infopath/2007/PartnerControls"/>
+    <ds:schemaRef ds:uri="7c904bd3-ab19-431b-8878-400d77873c6b"/>
+  </ds:schemaRefs>
+</ds:datastoreItem>
 </file>
 
-<file path=customXml/item3.xml><?xml version="1.0" encoding="utf-8"?>
-<p:properties xmlns:p="http://schemas.microsoft.com/office/2006/metadata/properties" xmlns:xsi="http://www.w3.org/2001/XMLSchema-instance" xmlns:pc="http://schemas.microsoft.com/office/infopath/2007/PartnerControls">
-  <documentManagement>
-    <_activity xmlns="7c904bd3-ab19-431b-8878-400d77873c6b" xsi:nil="true"/>
-  </documentManagement>
-</p:properties>
+<file path=customXml/itemProps2.xml><?xml version="1.0" encoding="utf-8"?>
+<ds:datastoreItem xmlns:ds="http://schemas.openxmlformats.org/officeDocument/2006/customXml" ds:itemID="{22F055DB-AC2F-48AE-9352-119FE8067BAD}">
+  <ds:schemaRefs>
+    <ds:schemaRef ds:uri="http://schemas.microsoft.com/sharepoint/v3/contenttype/forms"/>
+  </ds:schemaRefs>
+</ds:datastoreItem>
 </file>
 
-<file path=customXml/itemProps1.xml><?xml version="1.0" encoding="utf-8"?>
+<file path=customXml/itemProps3.xml><?xml version="1.0" encoding="utf-8"?>
 <ds:datastoreItem xmlns:ds="http://schemas.openxmlformats.org/officeDocument/2006/customXml" ds:itemID="{9E5F2A95-5E43-48E7-9346-AFAA9E6C9C31}">
   <ds:schemaRefs>
     <ds:schemaRef ds:uri="http://schemas.microsoft.com/office/2006/metadata/contentType"/>
@@ -6696,22 +6765,4 @@
     <ds:schemaRef ds:uri="http://schemas.microsoft.com/internal/obd"/>
   </ds:schemaRefs>
 </ds:datastoreItem>
-</file>
-
-<file path=customXml/itemProps2.xml><?xml version="1.0" encoding="utf-8"?>
-<ds:datastoreItem xmlns:ds="http://schemas.openxmlformats.org/officeDocument/2006/customXml" ds:itemID="{22F055DB-AC2F-48AE-9352-119FE8067BAD}">
-  <ds:schemaRefs>
-    <ds:schemaRef ds:uri="http://schemas.microsoft.com/sharepoint/v3/contenttype/forms"/>
-  </ds:schemaRefs>
-</ds:datastoreItem>
-</file>
-
-<file path=customXml/itemProps3.xml><?xml version="1.0" encoding="utf-8"?>
-<ds:datastoreItem xmlns:ds="http://schemas.openxmlformats.org/officeDocument/2006/customXml" ds:itemID="{81DE79A3-CFAE-4F95-87AB-1B8A80DE321E}">
-  <ds:schemaRefs>
-    <ds:schemaRef ds:uri="http://schemas.microsoft.com/office/2006/metadata/properties"/>
-    <ds:schemaRef ds:uri="http://schemas.microsoft.com/office/infopath/2007/PartnerControls"/>
-    <ds:schemaRef ds:uri="7c904bd3-ab19-431b-8878-400d77873c6b"/>
-  </ds:schemaRefs>
-</ds:datastoreItem>
 </file>
</xml_diff>

<commit_message>
Finished Assignment 2, which included a WBS and a Gantt chart.
</commit_message>
<xml_diff>
--- a/CIS4374 Semester Project Maximiliano Soto.docx
+++ b/CIS4374 Semester Project Maximiliano Soto.docx
@@ -242,34 +242,17 @@
         <w:t xml:space="preserve">a problem </w:t>
       </w:r>
       <w:r>
-        <w:t xml:space="preserve">in the real-time parking platform software landscape by investigating the internal market and technology surrounding these platforms. After reviewing real-time parking applications (including </w:t>
-      </w:r>
-      <w:proofErr w:type="spellStart"/>
-      <w:r>
-        <w:t>ParkWhiz</w:t>
-      </w:r>
-      <w:proofErr w:type="spellEnd"/>
+        <w:t>in the real-time parking platform software landscape by investigating the internal market and technology surrounding these platforms. After reviewing real-time parking applications (including ParkWhiz, SpotHero, and ParkMobile)</w:t>
+      </w:r>
       <w:r>
         <w:t xml:space="preserve">, </w:t>
       </w:r>
-      <w:proofErr w:type="spellStart"/>
-      <w:r>
-        <w:t>SpotHero</w:t>
-      </w:r>
-      <w:proofErr w:type="spellEnd"/>
-      <w:r>
-        <w:t>, and ParkMobile)</w:t>
-      </w:r>
-      <w:r>
-        <w:t xml:space="preserve">, </w:t>
-      </w:r>
       <w:r>
         <w:t>the studio</w:t>
       </w:r>
       <w:r>
         <w:t xml:space="preserve"> concluded that there’s currently no solution that offers a unified experience serving both drivers and operators equally. </w:t>
       </w:r>
-      <w:proofErr w:type="spellStart"/>
       <w:r>
         <w:t>Park</w:t>
       </w:r>
@@ -277,19 +260,7 @@
         <w:t>W</w:t>
       </w:r>
       <w:r>
-        <w:t>hiz</w:t>
-      </w:r>
-      <w:proofErr w:type="spellEnd"/>
-      <w:r>
-        <w:t xml:space="preserve"> and </w:t>
-      </w:r>
-      <w:proofErr w:type="spellStart"/>
-      <w:r>
-        <w:t>SpotHero</w:t>
-      </w:r>
-      <w:proofErr w:type="spellEnd"/>
-      <w:r>
-        <w:t xml:space="preserve"> primarily focused on reserving parking spots for drivers and </w:t>
+        <w:t xml:space="preserve">hiz and SpotHero primarily focused on reserving parking spots for drivers and </w:t>
       </w:r>
       <w:r>
         <w:t xml:space="preserve">providing parking information for events, while ParkMobile primarily focused itself towards assisting drivers with meter/municipal payments. </w:t>
@@ -459,7 +430,10 @@
     </w:p>
     <w:p>
       <w:r>
-        <w:t>Version: 1.0</w:t>
+        <w:t>Version: 1.</w:t>
+      </w:r>
+      <w:r>
+        <w:t>1</w:t>
       </w:r>
     </w:p>
     <w:p>
@@ -643,6 +617,19 @@
       <w:r>
         <w:t xml:space="preserve"> threshold.</w:t>
       </w:r>
+      <w:r>
+        <w:t xml:space="preserve"> The timeline is fixed to one semester. The </w:t>
+      </w:r>
+      <w:r>
+        <w:lastRenderedPageBreak/>
+        <w:t>application will depend on third-party services and APIs. Application must be compliant with security and privacy requirements, as well as city ordinance and laws</w:t>
+      </w:r>
+      <w:r>
+        <w:t xml:space="preserve"> (Payment Card Industry Data Security Standard and others)</w:t>
+      </w:r>
+      <w:r>
+        <w:t>.</w:t>
+      </w:r>
     </w:p>
     <w:p>
       <w:pPr>
@@ -653,7 +640,6 @@
         </w:numPr>
       </w:pPr>
       <w:r>
-        <w:lastRenderedPageBreak/>
         <w:t>Assumptions:</w:t>
       </w:r>
       <w:r>
@@ -975,6 +961,7 @@
     </w:p>
     <w:p>
       <w:r>
+        <w:lastRenderedPageBreak/>
         <w:t>Steps:</w:t>
       </w:r>
     </w:p>
@@ -999,7 +986,6 @@
         </w:numPr>
       </w:pPr>
       <w:r>
-        <w:lastRenderedPageBreak/>
         <w:t>Driver allows the app to use their current location.</w:t>
       </w:r>
     </w:p>
@@ -1333,6 +1319,7 @@
         </w:numPr>
       </w:pPr>
       <w:r>
+        <w:lastRenderedPageBreak/>
         <w:t>System confirms the session and sends a digital receipt to the driver.</w:t>
       </w:r>
     </w:p>
@@ -1345,7 +1332,6 @@
         </w:numPr>
       </w:pPr>
       <w:r>
-        <w:lastRenderedPageBreak/>
         <w:t>System sends an entry code or uses the driver’s vehicle information to activate license-plate recognition for entry.</w:t>
       </w:r>
     </w:p>
@@ -3101,7 +3087,1518 @@
         <w:t>WBS</w:t>
       </w:r>
     </w:p>
+    <w:p>
+      <w:r>
+        <w:t>Work Breakdown Structure</w:t>
+      </w:r>
+    </w:p>
+    <w:p>
+      <w:r>
+        <w:t>Project: Smart Parking Platform</w:t>
+      </w:r>
+    </w:p>
+    <w:p>
+      <w:r>
+        <w:t>Version: 1.0</w:t>
+      </w:r>
+    </w:p>
+    <w:p>
+      <w:r>
+        <w:t>Date: 9/17/2026</w:t>
+      </w:r>
+    </w:p>
     <w:p/>
+    <w:p>
+      <w:pPr>
+        <w:pStyle w:val="ListParagraph"/>
+        <w:numPr>
+          <w:ilvl w:val="0"/>
+          <w:numId w:val="3"/>
+        </w:numPr>
+      </w:pPr>
+      <w:r>
+        <w:t xml:space="preserve">1.0 </w:t>
+      </w:r>
+      <w:r>
+        <w:t>Driver-Facing Features</w:t>
+      </w:r>
+    </w:p>
+    <w:p>
+      <w:pPr>
+        <w:pStyle w:val="ListParagraph"/>
+        <w:numPr>
+          <w:ilvl w:val="1"/>
+          <w:numId w:val="3"/>
+        </w:numPr>
+      </w:pPr>
+      <w:r>
+        <w:t>1.1 Driver Registration and Profile Management</w:t>
+      </w:r>
+    </w:p>
+    <w:p>
+      <w:pPr>
+        <w:pStyle w:val="ListParagraph"/>
+        <w:numPr>
+          <w:ilvl w:val="2"/>
+          <w:numId w:val="3"/>
+        </w:numPr>
+      </w:pPr>
+      <w:r>
+        <w:t xml:space="preserve">1.1.1 </w:t>
+      </w:r>
+      <w:r>
+        <w:t>Account Registration and Profile Setup</w:t>
+      </w:r>
+    </w:p>
+    <w:p>
+      <w:pPr>
+        <w:pStyle w:val="ListParagraph"/>
+        <w:numPr>
+          <w:ilvl w:val="2"/>
+          <w:numId w:val="3"/>
+        </w:numPr>
+      </w:pPr>
+      <w:r>
+        <w:t>1.1.2 Vehicle and Payment Method Management</w:t>
+      </w:r>
+    </w:p>
+    <w:p>
+      <w:pPr>
+        <w:pStyle w:val="ListParagraph"/>
+        <w:numPr>
+          <w:ilvl w:val="2"/>
+          <w:numId w:val="3"/>
+        </w:numPr>
+      </w:pPr>
+      <w:r>
+        <w:t>1.1.3 Testing: Driver Account Flows</w:t>
+      </w:r>
+    </w:p>
+    <w:p>
+      <w:pPr>
+        <w:pStyle w:val="ListParagraph"/>
+        <w:numPr>
+          <w:ilvl w:val="1"/>
+          <w:numId w:val="3"/>
+        </w:numPr>
+      </w:pPr>
+      <w:r>
+        <w:t>1.2 Parking, Search, Reservation, and Navigation</w:t>
+      </w:r>
+    </w:p>
+    <w:p>
+      <w:pPr>
+        <w:pStyle w:val="ListParagraph"/>
+        <w:numPr>
+          <w:ilvl w:val="2"/>
+          <w:numId w:val="3"/>
+        </w:numPr>
+      </w:pPr>
+      <w:r>
+        <w:t xml:space="preserve">1.2.1 </w:t>
+      </w:r>
+      <w:r>
+        <w:t>Real-Time Availability Search</w:t>
+      </w:r>
+    </w:p>
+    <w:p>
+      <w:pPr>
+        <w:pStyle w:val="ListParagraph"/>
+        <w:numPr>
+          <w:ilvl w:val="2"/>
+          <w:numId w:val="3"/>
+        </w:numPr>
+      </w:pPr>
+      <w:r>
+        <w:t>1.2.2 Advance Reservation Handling</w:t>
+      </w:r>
+    </w:p>
+    <w:p>
+      <w:pPr>
+        <w:pStyle w:val="ListParagraph"/>
+        <w:numPr>
+          <w:ilvl w:val="2"/>
+          <w:numId w:val="3"/>
+        </w:numPr>
+      </w:pPr>
+      <w:r>
+        <w:t>1.2.3 On-Demand Reservation Handling</w:t>
+      </w:r>
+    </w:p>
+    <w:p>
+      <w:pPr>
+        <w:pStyle w:val="ListParagraph"/>
+        <w:numPr>
+          <w:ilvl w:val="2"/>
+          <w:numId w:val="3"/>
+        </w:numPr>
+      </w:pPr>
+      <w:r>
+        <w:t>1.2.4 Reservation Modification Handling</w:t>
+      </w:r>
+    </w:p>
+    <w:p>
+      <w:pPr>
+        <w:pStyle w:val="ListParagraph"/>
+        <w:numPr>
+          <w:ilvl w:val="2"/>
+          <w:numId w:val="3"/>
+        </w:numPr>
+      </w:pPr>
+      <w:r>
+        <w:t>1.2.</w:t>
+      </w:r>
+      <w:r>
+        <w:t>5</w:t>
+      </w:r>
+      <w:r>
+        <w:t xml:space="preserve"> </w:t>
+      </w:r>
+      <w:r>
+        <w:t>Interactive Map and Navigation Integration</w:t>
+      </w:r>
+    </w:p>
+    <w:p>
+      <w:pPr>
+        <w:pStyle w:val="ListParagraph"/>
+        <w:numPr>
+          <w:ilvl w:val="2"/>
+          <w:numId w:val="3"/>
+        </w:numPr>
+      </w:pPr>
+      <w:r>
+        <w:t>1.2.</w:t>
+      </w:r>
+      <w:r>
+        <w:t>6</w:t>
+      </w:r>
+      <w:r>
+        <w:t xml:space="preserve"> Reservation History </w:t>
+      </w:r>
+      <w:r>
+        <w:t>Search</w:t>
+      </w:r>
+    </w:p>
+    <w:p>
+      <w:pPr>
+        <w:pStyle w:val="ListParagraph"/>
+        <w:numPr>
+          <w:ilvl w:val="2"/>
+          <w:numId w:val="3"/>
+        </w:numPr>
+      </w:pPr>
+      <w:r>
+        <w:t>1.2.7 Testing: Search and Reservation Flows</w:t>
+      </w:r>
+    </w:p>
+    <w:p>
+      <w:pPr>
+        <w:pStyle w:val="ListParagraph"/>
+        <w:numPr>
+          <w:ilvl w:val="1"/>
+          <w:numId w:val="3"/>
+        </w:numPr>
+      </w:pPr>
+      <w:r>
+        <w:t>1.3 Driver Payments</w:t>
+      </w:r>
+    </w:p>
+    <w:p>
+      <w:pPr>
+        <w:pStyle w:val="ListParagraph"/>
+        <w:numPr>
+          <w:ilvl w:val="2"/>
+          <w:numId w:val="3"/>
+        </w:numPr>
+      </w:pPr>
+      <w:r>
+        <w:t xml:space="preserve">1.3.1 Payment Method </w:t>
+      </w:r>
+      <w:r>
+        <w:t>Entry and Checkout</w:t>
+      </w:r>
+    </w:p>
+    <w:p>
+      <w:pPr>
+        <w:pStyle w:val="ListParagraph"/>
+        <w:numPr>
+          <w:ilvl w:val="2"/>
+          <w:numId w:val="3"/>
+        </w:numPr>
+      </w:pPr>
+      <w:r>
+        <w:t>1.3.2 Reservation and Session Billing</w:t>
+      </w:r>
+    </w:p>
+    <w:p>
+      <w:pPr>
+        <w:pStyle w:val="ListParagraph"/>
+        <w:numPr>
+          <w:ilvl w:val="2"/>
+          <w:numId w:val="3"/>
+        </w:numPr>
+      </w:pPr>
+      <w:r>
+        <w:t>1.3.3 Refund and Cancellation Requests</w:t>
+      </w:r>
+    </w:p>
+    <w:p>
+      <w:pPr>
+        <w:pStyle w:val="ListParagraph"/>
+        <w:numPr>
+          <w:ilvl w:val="2"/>
+          <w:numId w:val="3"/>
+        </w:numPr>
+      </w:pPr>
+      <w:r>
+        <w:t>1.3.4 Testing: Payment Flows</w:t>
+      </w:r>
+    </w:p>
+    <w:p>
+      <w:pPr>
+        <w:pStyle w:val="ListParagraph"/>
+        <w:numPr>
+          <w:ilvl w:val="0"/>
+          <w:numId w:val="25"/>
+        </w:numPr>
+      </w:pPr>
+      <w:r>
+        <w:t>2.0 Operator-Facing Features</w:t>
+      </w:r>
+    </w:p>
+    <w:p>
+      <w:pPr>
+        <w:pStyle w:val="ListParagraph"/>
+        <w:numPr>
+          <w:ilvl w:val="1"/>
+          <w:numId w:val="25"/>
+        </w:numPr>
+      </w:pPr>
+      <w:r>
+        <w:t>2.1 Operator Account Application and Onboarding</w:t>
+      </w:r>
+    </w:p>
+    <w:p>
+      <w:pPr>
+        <w:pStyle w:val="ListParagraph"/>
+        <w:numPr>
+          <w:ilvl w:val="2"/>
+          <w:numId w:val="25"/>
+        </w:numPr>
+      </w:pPr>
+      <w:r>
+        <w:t>2.1.1 Operator Application and Approval Workflow</w:t>
+      </w:r>
+    </w:p>
+    <w:p>
+      <w:pPr>
+        <w:pStyle w:val="ListParagraph"/>
+        <w:numPr>
+          <w:ilvl w:val="2"/>
+          <w:numId w:val="25"/>
+        </w:numPr>
+      </w:pPr>
+      <w:r>
+        <w:t xml:space="preserve">2.1.2 </w:t>
+      </w:r>
+      <w:r>
+        <w:t xml:space="preserve">Garage Onboarding </w:t>
+      </w:r>
+      <w:r>
+        <w:t>Setup</w:t>
+      </w:r>
+    </w:p>
+    <w:p>
+      <w:pPr>
+        <w:pStyle w:val="ListParagraph"/>
+        <w:numPr>
+          <w:ilvl w:val="2"/>
+          <w:numId w:val="25"/>
+        </w:numPr>
+      </w:pPr>
+      <w:r>
+        <w:t>2.1.3 Garage Details Management</w:t>
+      </w:r>
+    </w:p>
+    <w:p>
+      <w:pPr>
+        <w:pStyle w:val="ListParagraph"/>
+        <w:numPr>
+          <w:ilvl w:val="2"/>
+          <w:numId w:val="25"/>
+        </w:numPr>
+      </w:pPr>
+      <w:r>
+        <w:t>2.1.4 Testing: Operator Onboarding and Garage Management Flows</w:t>
+      </w:r>
+    </w:p>
+    <w:p>
+      <w:pPr>
+        <w:pStyle w:val="ListParagraph"/>
+        <w:numPr>
+          <w:ilvl w:val="1"/>
+          <w:numId w:val="25"/>
+        </w:numPr>
+      </w:pPr>
+      <w:r>
+        <w:t>2.2 Garage Monitoring</w:t>
+      </w:r>
+    </w:p>
+    <w:p>
+      <w:pPr>
+        <w:pStyle w:val="ListParagraph"/>
+        <w:numPr>
+          <w:ilvl w:val="2"/>
+          <w:numId w:val="25"/>
+        </w:numPr>
+      </w:pPr>
+      <w:r>
+        <w:t>2.2.1 Real-Time Occupancy Dashboard</w:t>
+      </w:r>
+    </w:p>
+    <w:p>
+      <w:pPr>
+        <w:pStyle w:val="ListParagraph"/>
+        <w:numPr>
+          <w:ilvl w:val="2"/>
+          <w:numId w:val="25"/>
+        </w:numPr>
+      </w:pPr>
+      <w:r>
+        <w:t>2.2.2 Sensor/Gate Hardware Integration</w:t>
+      </w:r>
+    </w:p>
+    <w:p>
+      <w:pPr>
+        <w:pStyle w:val="ListParagraph"/>
+        <w:numPr>
+          <w:ilvl w:val="2"/>
+          <w:numId w:val="25"/>
+        </w:numPr>
+      </w:pPr>
+      <w:r>
+        <w:t xml:space="preserve">2.2.3 Manual Occupancy Update </w:t>
+      </w:r>
+      <w:r>
+        <w:t>Fallback</w:t>
+      </w:r>
+    </w:p>
+    <w:p>
+      <w:pPr>
+        <w:pStyle w:val="ListParagraph"/>
+        <w:numPr>
+          <w:ilvl w:val="2"/>
+          <w:numId w:val="25"/>
+        </w:numPr>
+      </w:pPr>
+      <w:r>
+        <w:lastRenderedPageBreak/>
+        <w:t xml:space="preserve">2.2.4 </w:t>
+      </w:r>
+      <w:r>
+        <w:t>Testing: Occupancy Monitoring Accuracy</w:t>
+      </w:r>
+    </w:p>
+    <w:p>
+      <w:pPr>
+        <w:pStyle w:val="ListParagraph"/>
+        <w:numPr>
+          <w:ilvl w:val="1"/>
+          <w:numId w:val="25"/>
+        </w:numPr>
+      </w:pPr>
+      <w:r>
+        <w:t xml:space="preserve">2.3 Pricing </w:t>
+      </w:r>
+    </w:p>
+    <w:p>
+      <w:pPr>
+        <w:pStyle w:val="ListParagraph"/>
+        <w:numPr>
+          <w:ilvl w:val="2"/>
+          <w:numId w:val="25"/>
+        </w:numPr>
+      </w:pPr>
+      <w:r>
+        <w:t xml:space="preserve">2.3.1 </w:t>
+      </w:r>
+      <w:r>
+        <w:t>Dynamic/Configurable Pricing Management</w:t>
+      </w:r>
+    </w:p>
+    <w:p>
+      <w:pPr>
+        <w:pStyle w:val="ListParagraph"/>
+        <w:numPr>
+          <w:ilvl w:val="2"/>
+          <w:numId w:val="25"/>
+        </w:numPr>
+      </w:pPr>
+      <w:r>
+        <w:t>2.3.2 Testing: Pricing Configuration Accuracy</w:t>
+      </w:r>
+    </w:p>
+    <w:p>
+      <w:pPr>
+        <w:pStyle w:val="ListParagraph"/>
+        <w:numPr>
+          <w:ilvl w:val="1"/>
+          <w:numId w:val="25"/>
+        </w:numPr>
+      </w:pPr>
+      <w:r>
+        <w:t>2.4 Reporting and Analytics</w:t>
+      </w:r>
+    </w:p>
+    <w:p>
+      <w:pPr>
+        <w:pStyle w:val="ListParagraph"/>
+        <w:numPr>
+          <w:ilvl w:val="2"/>
+          <w:numId w:val="25"/>
+        </w:numPr>
+      </w:pPr>
+      <w:r>
+        <w:t>2.</w:t>
+      </w:r>
+      <w:r>
+        <w:t>4</w:t>
+      </w:r>
+      <w:r>
+        <w:t>.</w:t>
+      </w:r>
+      <w:r>
+        <w:t>1</w:t>
+      </w:r>
+      <w:r>
+        <w:t xml:space="preserve"> Utilization Analytics</w:t>
+      </w:r>
+    </w:p>
+    <w:p>
+      <w:pPr>
+        <w:pStyle w:val="ListParagraph"/>
+        <w:numPr>
+          <w:ilvl w:val="2"/>
+          <w:numId w:val="25"/>
+        </w:numPr>
+      </w:pPr>
+      <w:r>
+        <w:t>2.</w:t>
+      </w:r>
+      <w:r>
+        <w:t>4</w:t>
+      </w:r>
+      <w:r>
+        <w:t>.</w:t>
+      </w:r>
+      <w:r>
+        <w:t>2</w:t>
+      </w:r>
+      <w:r>
+        <w:t xml:space="preserve"> </w:t>
+      </w:r>
+      <w:r>
+        <w:t>Occupancy and Turnover Reporting</w:t>
+      </w:r>
+    </w:p>
+    <w:p>
+      <w:pPr>
+        <w:pStyle w:val="ListParagraph"/>
+        <w:numPr>
+          <w:ilvl w:val="2"/>
+          <w:numId w:val="25"/>
+        </w:numPr>
+      </w:pPr>
+      <w:r>
+        <w:t>2.</w:t>
+      </w:r>
+      <w:r>
+        <w:t>4</w:t>
+      </w:r>
+      <w:r>
+        <w:t>.</w:t>
+      </w:r>
+      <w:r>
+        <w:t>3</w:t>
+      </w:r>
+      <w:r>
+        <w:t xml:space="preserve"> Peak Demand Reporting</w:t>
+      </w:r>
+    </w:p>
+    <w:p>
+      <w:pPr>
+        <w:pStyle w:val="ListParagraph"/>
+        <w:numPr>
+          <w:ilvl w:val="2"/>
+          <w:numId w:val="25"/>
+        </w:numPr>
+      </w:pPr>
+      <w:r>
+        <w:t>2.</w:t>
+      </w:r>
+      <w:r>
+        <w:t>4</w:t>
+      </w:r>
+      <w:r>
+        <w:t>.</w:t>
+      </w:r>
+      <w:r>
+        <w:t>4</w:t>
+      </w:r>
+      <w:r>
+        <w:t xml:space="preserve"> Reservation Behavior Reporting </w:t>
+      </w:r>
+      <w:r>
+        <w:t>(No-Shows, Cancellations, Arrival Times)</w:t>
+      </w:r>
+    </w:p>
+    <w:p>
+      <w:pPr>
+        <w:pStyle w:val="ListParagraph"/>
+        <w:numPr>
+          <w:ilvl w:val="2"/>
+          <w:numId w:val="25"/>
+        </w:numPr>
+      </w:pPr>
+      <w:r>
+        <w:t>2.</w:t>
+      </w:r>
+      <w:r>
+        <w:t>4</w:t>
+      </w:r>
+      <w:r>
+        <w:t>.</w:t>
+      </w:r>
+      <w:r>
+        <w:t>5</w:t>
+      </w:r>
+      <w:r>
+        <w:t xml:space="preserve"> Revenue Breakdown Reporting</w:t>
+      </w:r>
+      <w:r>
+        <w:t xml:space="preserve"> (Rate Type and Payment Method)</w:t>
+      </w:r>
+    </w:p>
+    <w:p>
+      <w:pPr>
+        <w:pStyle w:val="ListParagraph"/>
+        <w:numPr>
+          <w:ilvl w:val="2"/>
+          <w:numId w:val="25"/>
+        </w:numPr>
+      </w:pPr>
+      <w:r>
+        <w:t>2.</w:t>
+      </w:r>
+      <w:r>
+        <w:t>4</w:t>
+      </w:r>
+      <w:r>
+        <w:t>.</w:t>
+      </w:r>
+      <w:r>
+        <w:t>6</w:t>
+      </w:r>
+      <w:r>
+        <w:t xml:space="preserve"> Regulatory</w:t>
+      </w:r>
+      <w:r>
+        <w:t>/Audit Reporting</w:t>
+      </w:r>
+    </w:p>
+    <w:p>
+      <w:pPr>
+        <w:pStyle w:val="ListParagraph"/>
+        <w:numPr>
+          <w:ilvl w:val="2"/>
+          <w:numId w:val="25"/>
+        </w:numPr>
+      </w:pPr>
+      <w:r>
+        <w:t>2.</w:t>
+      </w:r>
+      <w:r>
+        <w:t>4</w:t>
+      </w:r>
+      <w:r>
+        <w:t>.</w:t>
+      </w:r>
+      <w:r>
+        <w:t>7</w:t>
+      </w:r>
+      <w:r>
+        <w:t xml:space="preserve"> Exportable Reports (CSV, PDF, XLSX)</w:t>
+      </w:r>
+    </w:p>
+    <w:p>
+      <w:pPr>
+        <w:pStyle w:val="ListParagraph"/>
+        <w:numPr>
+          <w:ilvl w:val="2"/>
+          <w:numId w:val="25"/>
+        </w:numPr>
+      </w:pPr>
+      <w:r>
+        <w:t>2.</w:t>
+      </w:r>
+      <w:r>
+        <w:t>4</w:t>
+      </w:r>
+      <w:r>
+        <w:t>.</w:t>
+      </w:r>
+      <w:r>
+        <w:t>8</w:t>
+      </w:r>
+      <w:r>
+        <w:t xml:space="preserve"> Testing: Pricing and Reporting Accuracy</w:t>
+      </w:r>
+    </w:p>
+    <w:p>
+      <w:pPr>
+        <w:pStyle w:val="ListParagraph"/>
+        <w:numPr>
+          <w:ilvl w:val="0"/>
+          <w:numId w:val="25"/>
+        </w:numPr>
+      </w:pPr>
+      <w:r>
+        <w:t>3.0 Platform, Infrastructure, and Project Management</w:t>
+      </w:r>
+    </w:p>
+    <w:p>
+      <w:pPr>
+        <w:pStyle w:val="ListParagraph"/>
+        <w:numPr>
+          <w:ilvl w:val="1"/>
+          <w:numId w:val="25"/>
+        </w:numPr>
+      </w:pPr>
+      <w:r>
+        <w:t>3.1 Project Management</w:t>
+      </w:r>
+    </w:p>
+    <w:p>
+      <w:pPr>
+        <w:pStyle w:val="ListParagraph"/>
+        <w:numPr>
+          <w:ilvl w:val="2"/>
+          <w:numId w:val="25"/>
+        </w:numPr>
+      </w:pPr>
+      <w:r>
+        <w:t xml:space="preserve">3.1.1 </w:t>
+      </w:r>
+      <w:r>
+        <w:t>Project Planning and Charter</w:t>
+      </w:r>
+    </w:p>
+    <w:p>
+      <w:pPr>
+        <w:pStyle w:val="ListParagraph"/>
+        <w:numPr>
+          <w:ilvl w:val="2"/>
+          <w:numId w:val="25"/>
+        </w:numPr>
+      </w:pPr>
+      <w:r>
+        <w:t xml:space="preserve">3.1.2 </w:t>
+      </w:r>
+      <w:r>
+        <w:t>Sprint Planning and Status Reporting</w:t>
+      </w:r>
+    </w:p>
+    <w:p>
+      <w:pPr>
+        <w:pStyle w:val="ListParagraph"/>
+        <w:numPr>
+          <w:ilvl w:val="1"/>
+          <w:numId w:val="25"/>
+        </w:numPr>
+      </w:pPr>
+      <w:r>
+        <w:t>3.2 Requirements and Design</w:t>
+      </w:r>
+    </w:p>
+    <w:p>
+      <w:pPr>
+        <w:pStyle w:val="ListParagraph"/>
+        <w:numPr>
+          <w:ilvl w:val="2"/>
+          <w:numId w:val="25"/>
+        </w:numPr>
+      </w:pPr>
+      <w:r>
+        <w:t>3.2.1 Driver Side UI/UX Design and Wireframing</w:t>
+      </w:r>
+    </w:p>
+    <w:p>
+      <w:pPr>
+        <w:pStyle w:val="ListParagraph"/>
+        <w:numPr>
+          <w:ilvl w:val="2"/>
+          <w:numId w:val="25"/>
+        </w:numPr>
+      </w:pPr>
+      <w:r>
+        <w:t>3.2.2 Operator Side UI/UX Design and Wireframing</w:t>
+      </w:r>
+    </w:p>
+    <w:p>
+      <w:pPr>
+        <w:pStyle w:val="ListParagraph"/>
+        <w:numPr>
+          <w:ilvl w:val="2"/>
+          <w:numId w:val="25"/>
+        </w:numPr>
+      </w:pPr>
+      <w:r>
+        <w:t>3.2.3 Design Review and Stakeholder Sign-Off</w:t>
+      </w:r>
+    </w:p>
+    <w:p>
+      <w:pPr>
+        <w:pStyle w:val="ListParagraph"/>
+        <w:numPr>
+          <w:ilvl w:val="1"/>
+          <w:numId w:val="25"/>
+        </w:numPr>
+      </w:pPr>
+      <w:r>
+        <w:t>3.</w:t>
+      </w:r>
+      <w:r>
+        <w:t>3</w:t>
+      </w:r>
+      <w:r>
+        <w:t xml:space="preserve"> Core Platform Architecture</w:t>
+      </w:r>
+    </w:p>
+    <w:p>
+      <w:pPr>
+        <w:pStyle w:val="ListParagraph"/>
+        <w:numPr>
+          <w:ilvl w:val="2"/>
+          <w:numId w:val="25"/>
+        </w:numPr>
+      </w:pPr>
+      <w:r>
+        <w:t>3.</w:t>
+      </w:r>
+      <w:r>
+        <w:t>3</w:t>
+      </w:r>
+      <w:r>
+        <w:t>.1 System Architecture and Database Design</w:t>
+      </w:r>
+    </w:p>
+    <w:p>
+      <w:pPr>
+        <w:pStyle w:val="ListParagraph"/>
+        <w:numPr>
+          <w:ilvl w:val="2"/>
+          <w:numId w:val="25"/>
+        </w:numPr>
+      </w:pPr>
+      <w:r>
+        <w:t>3.</w:t>
+      </w:r>
+      <w:r>
+        <w:t>3</w:t>
+      </w:r>
+      <w:r>
+        <w:t>.2 Login and Role-Based Access Control Core Logic</w:t>
+      </w:r>
+    </w:p>
+    <w:p>
+      <w:pPr>
+        <w:pStyle w:val="ListParagraph"/>
+        <w:numPr>
+          <w:ilvl w:val="2"/>
+          <w:numId w:val="25"/>
+        </w:numPr>
+      </w:pPr>
+      <w:r>
+        <w:t>3.</w:t>
+      </w:r>
+      <w:r>
+        <w:t>3</w:t>
+      </w:r>
+      <w:r>
+        <w:t>.3 Backend Payment API and Payment Gateway Integration</w:t>
+      </w:r>
+    </w:p>
+    <w:p>
+      <w:pPr>
+        <w:pStyle w:val="ListParagraph"/>
+        <w:numPr>
+          <w:ilvl w:val="2"/>
+          <w:numId w:val="25"/>
+        </w:numPr>
+      </w:pPr>
+      <w:r>
+        <w:t>3.</w:t>
+      </w:r>
+      <w:r>
+        <w:t>3</w:t>
+      </w:r>
+      <w:r>
+        <w:t>.4 Notification Service Integration (SMS/Email/Push)</w:t>
+      </w:r>
+    </w:p>
+    <w:p>
+      <w:pPr>
+        <w:pStyle w:val="ListParagraph"/>
+        <w:numPr>
+          <w:ilvl w:val="2"/>
+          <w:numId w:val="25"/>
+        </w:numPr>
+      </w:pPr>
+      <w:r>
+        <w:t>3.</w:t>
+      </w:r>
+      <w:r>
+        <w:t>3</w:t>
+      </w:r>
+      <w:r>
+        <w:t>.5 Testing: Core Infrastructure Functionality</w:t>
+      </w:r>
+    </w:p>
+    <w:p>
+      <w:pPr>
+        <w:pStyle w:val="ListParagraph"/>
+        <w:numPr>
+          <w:ilvl w:val="1"/>
+          <w:numId w:val="25"/>
+        </w:numPr>
+      </w:pPr>
+      <w:r>
+        <w:t>3.</w:t>
+      </w:r>
+      <w:r>
+        <w:t>4</w:t>
+      </w:r>
+      <w:r>
+        <w:t xml:space="preserve"> Security and Compliance</w:t>
+      </w:r>
+    </w:p>
+    <w:p>
+      <w:pPr>
+        <w:pStyle w:val="ListParagraph"/>
+        <w:numPr>
+          <w:ilvl w:val="2"/>
+          <w:numId w:val="25"/>
+        </w:numPr>
+      </w:pPr>
+      <w:r>
+        <w:t>3.</w:t>
+      </w:r>
+      <w:r>
+        <w:t>4</w:t>
+      </w:r>
+      <w:r>
+        <w:t xml:space="preserve">.1 Authentication </w:t>
+      </w:r>
+      <w:r>
+        <w:t>Security and Password Reset/Recovery</w:t>
+      </w:r>
+    </w:p>
+    <w:p>
+      <w:pPr>
+        <w:pStyle w:val="ListParagraph"/>
+        <w:numPr>
+          <w:ilvl w:val="2"/>
+          <w:numId w:val="25"/>
+        </w:numPr>
+      </w:pPr>
+      <w:r>
+        <w:t>3.</w:t>
+      </w:r>
+      <w:r>
+        <w:t>4</w:t>
+      </w:r>
+      <w:r>
+        <w:t>.2 Data Encryption and PCI-DSS Compliance</w:t>
+      </w:r>
+    </w:p>
+    <w:p>
+      <w:pPr>
+        <w:pStyle w:val="ListParagraph"/>
+        <w:numPr>
+          <w:ilvl w:val="2"/>
+          <w:numId w:val="25"/>
+        </w:numPr>
+      </w:pPr>
+      <w:r>
+        <w:t>3.</w:t>
+      </w:r>
+      <w:r>
+        <w:t>4</w:t>
+      </w:r>
+      <w:r>
+        <w:t>.3 Role-Based Access Control Enforcement</w:t>
+      </w:r>
+    </w:p>
+    <w:p>
+      <w:pPr>
+        <w:pStyle w:val="ListParagraph"/>
+        <w:numPr>
+          <w:ilvl w:val="2"/>
+          <w:numId w:val="25"/>
+        </w:numPr>
+      </w:pPr>
+      <w:r>
+        <w:t>3.</w:t>
+      </w:r>
+      <w:r>
+        <w:t>4</w:t>
+      </w:r>
+      <w:r>
+        <w:t xml:space="preserve">.4 </w:t>
+      </w:r>
+      <w:r>
+        <w:t>Vulnerability Assessment and Penetration Testing</w:t>
+      </w:r>
+    </w:p>
+    <w:p>
+      <w:pPr>
+        <w:pStyle w:val="ListParagraph"/>
+        <w:numPr>
+          <w:ilvl w:val="2"/>
+          <w:numId w:val="25"/>
+        </w:numPr>
+      </w:pPr>
+      <w:r>
+        <w:t>3.</w:t>
+      </w:r>
+      <w:r>
+        <w:t>4</w:t>
+      </w:r>
+      <w:r>
+        <w:t>.5 Security Regression Testing Per Release</w:t>
+      </w:r>
+    </w:p>
+    <w:p>
+      <w:pPr>
+        <w:pStyle w:val="ListParagraph"/>
+        <w:numPr>
+          <w:ilvl w:val="1"/>
+          <w:numId w:val="25"/>
+        </w:numPr>
+      </w:pPr>
+      <w:r>
+        <w:t>3.</w:t>
+      </w:r>
+      <w:r>
+        <w:t>5</w:t>
+      </w:r>
+      <w:r>
+        <w:t xml:space="preserve"> Risk Management</w:t>
+      </w:r>
+    </w:p>
+    <w:p>
+      <w:pPr>
+        <w:pStyle w:val="ListParagraph"/>
+        <w:numPr>
+          <w:ilvl w:val="2"/>
+          <w:numId w:val="25"/>
+        </w:numPr>
+      </w:pPr>
+      <w:r>
+        <w:t>3.</w:t>
+      </w:r>
+      <w:r>
+        <w:t>5</w:t>
+      </w:r>
+      <w:r>
+        <w:t xml:space="preserve">.1 Risk Identification </w:t>
+      </w:r>
+    </w:p>
+    <w:p>
+      <w:pPr>
+        <w:pStyle w:val="ListParagraph"/>
+        <w:numPr>
+          <w:ilvl w:val="2"/>
+          <w:numId w:val="25"/>
+        </w:numPr>
+      </w:pPr>
+      <w:r>
+        <w:t>3.</w:t>
+      </w:r>
+      <w:r>
+        <w:t>5</w:t>
+      </w:r>
+      <w:r>
+        <w:t>.2 Third-Party Service and API Dependency Risk Assessment</w:t>
+      </w:r>
+    </w:p>
+    <w:p>
+      <w:pPr>
+        <w:pStyle w:val="ListParagraph"/>
+        <w:numPr>
+          <w:ilvl w:val="2"/>
+          <w:numId w:val="25"/>
+        </w:numPr>
+      </w:pPr>
+      <w:r>
+        <w:t>3.</w:t>
+      </w:r>
+      <w:r>
+        <w:t>5</w:t>
+      </w:r>
+      <w:r>
+        <w:t>.3 Regulatory and City Ordinance Compliance Risk Assessment</w:t>
+      </w:r>
+    </w:p>
+    <w:p>
+      <w:pPr>
+        <w:pStyle w:val="ListParagraph"/>
+        <w:numPr>
+          <w:ilvl w:val="2"/>
+          <w:numId w:val="25"/>
+        </w:numPr>
+      </w:pPr>
+      <w:r>
+        <w:lastRenderedPageBreak/>
+        <w:t>3.</w:t>
+      </w:r>
+      <w:r>
+        <w:t>5</w:t>
+      </w:r>
+      <w:r>
+        <w:t xml:space="preserve">.4 Risk Monitoring, Response, and Mitigation </w:t>
+      </w:r>
+      <w:r>
+        <w:t>Tracking</w:t>
+      </w:r>
+    </w:p>
+    <w:p>
+      <w:pPr>
+        <w:pStyle w:val="ListParagraph"/>
+        <w:numPr>
+          <w:ilvl w:val="1"/>
+          <w:numId w:val="25"/>
+        </w:numPr>
+      </w:pPr>
+      <w:r>
+        <w:t>3.</w:t>
+      </w:r>
+      <w:r>
+        <w:t>6</w:t>
+      </w:r>
+      <w:r>
+        <w:t xml:space="preserve"> Administrative Console</w:t>
+      </w:r>
+    </w:p>
+    <w:p>
+      <w:pPr>
+        <w:pStyle w:val="ListParagraph"/>
+        <w:numPr>
+          <w:ilvl w:val="2"/>
+          <w:numId w:val="25"/>
+        </w:numPr>
+      </w:pPr>
+      <w:r>
+        <w:t>3.</w:t>
+      </w:r>
+      <w:r>
+        <w:t>6</w:t>
+      </w:r>
+      <w:r>
+        <w:t>.1 Admin User and Account Management</w:t>
+      </w:r>
+    </w:p>
+    <w:p>
+      <w:pPr>
+        <w:pStyle w:val="ListParagraph"/>
+        <w:numPr>
+          <w:ilvl w:val="2"/>
+          <w:numId w:val="25"/>
+        </w:numPr>
+      </w:pPr>
+      <w:r>
+        <w:t>3.</w:t>
+      </w:r>
+      <w:r>
+        <w:t>6</w:t>
+      </w:r>
+      <w:r>
+        <w:t>.2 Garage Listing Approval Tools</w:t>
+      </w:r>
+    </w:p>
+    <w:p>
+      <w:pPr>
+        <w:pStyle w:val="ListParagraph"/>
+        <w:numPr>
+          <w:ilvl w:val="2"/>
+          <w:numId w:val="25"/>
+        </w:numPr>
+      </w:pPr>
+      <w:r>
+        <w:t>3.</w:t>
+      </w:r>
+      <w:r>
+        <w:t>6</w:t>
+      </w:r>
+      <w:r>
+        <w:t>.3 Platform-Wide Configuration and Audit Logging</w:t>
+      </w:r>
+    </w:p>
+    <w:p>
+      <w:pPr>
+        <w:pStyle w:val="ListParagraph"/>
+        <w:numPr>
+          <w:ilvl w:val="1"/>
+          <w:numId w:val="25"/>
+        </w:numPr>
+      </w:pPr>
+      <w:r>
+        <w:t>3.</w:t>
+      </w:r>
+      <w:r>
+        <w:t>7</w:t>
+      </w:r>
+      <w:r>
+        <w:t xml:space="preserve"> System-Wide Integration and Quality Assurance</w:t>
+      </w:r>
+    </w:p>
+    <w:p>
+      <w:pPr>
+        <w:pStyle w:val="ListParagraph"/>
+        <w:numPr>
+          <w:ilvl w:val="2"/>
+          <w:numId w:val="25"/>
+        </w:numPr>
+      </w:pPr>
+      <w:r>
+        <w:t>3.</w:t>
+      </w:r>
+      <w:r>
+        <w:t>7</w:t>
+      </w:r>
+      <w:r>
+        <w:t>.1 Cross-Feature Integration Testing</w:t>
+      </w:r>
+    </w:p>
+    <w:p>
+      <w:pPr>
+        <w:pStyle w:val="ListParagraph"/>
+        <w:numPr>
+          <w:ilvl w:val="2"/>
+          <w:numId w:val="25"/>
+        </w:numPr>
+      </w:pPr>
+      <w:r>
+        <w:t>3.</w:t>
+      </w:r>
+      <w:r>
+        <w:t>7</w:t>
+      </w:r>
+      <w:r>
+        <w:t>.2 Full System User Acceptance Testing</w:t>
+      </w:r>
+    </w:p>
+    <w:p>
+      <w:pPr>
+        <w:pStyle w:val="ListParagraph"/>
+        <w:numPr>
+          <w:ilvl w:val="2"/>
+          <w:numId w:val="25"/>
+        </w:numPr>
+      </w:pPr>
+      <w:r>
+        <w:t>3.</w:t>
+      </w:r>
+      <w:r>
+        <w:t>7</w:t>
+      </w:r>
+      <w:r>
+        <w:t>.3 Performance and Load Testing</w:t>
+      </w:r>
+    </w:p>
+    <w:p>
+      <w:pPr>
+        <w:pStyle w:val="ListParagraph"/>
+        <w:numPr>
+          <w:ilvl w:val="2"/>
+          <w:numId w:val="25"/>
+        </w:numPr>
+      </w:pPr>
+      <w:r>
+        <w:t>3.</w:t>
+      </w:r>
+      <w:r>
+        <w:t>7</w:t>
+      </w:r>
+      <w:r>
+        <w:t xml:space="preserve">.4 </w:t>
+      </w:r>
+      <w:r>
+        <w:t>Functional Regression Testing Per Release</w:t>
+      </w:r>
+    </w:p>
+    <w:p>
+      <w:pPr>
+        <w:pStyle w:val="ListParagraph"/>
+        <w:numPr>
+          <w:ilvl w:val="1"/>
+          <w:numId w:val="25"/>
+        </w:numPr>
+      </w:pPr>
+      <w:r>
+        <w:t>3.</w:t>
+      </w:r>
+      <w:r>
+        <w:t>8</w:t>
+      </w:r>
+      <w:r>
+        <w:t xml:space="preserve"> Deployment and Release</w:t>
+      </w:r>
+    </w:p>
+    <w:p>
+      <w:pPr>
+        <w:pStyle w:val="ListParagraph"/>
+        <w:numPr>
+          <w:ilvl w:val="2"/>
+          <w:numId w:val="25"/>
+        </w:numPr>
+      </w:pPr>
+      <w:r>
+        <w:t>3.</w:t>
+      </w:r>
+      <w:r>
+        <w:t>8</w:t>
+      </w:r>
+      <w:r>
+        <w:t>.1 Cloud Environment Setup</w:t>
+      </w:r>
+    </w:p>
+    <w:p>
+      <w:pPr>
+        <w:pStyle w:val="ListParagraph"/>
+        <w:numPr>
+          <w:ilvl w:val="2"/>
+          <w:numId w:val="25"/>
+        </w:numPr>
+      </w:pPr>
+      <w:r>
+        <w:t>3.</w:t>
+      </w:r>
+      <w:r>
+        <w:t>8</w:t>
+      </w:r>
+      <w:r>
+        <w:t>.2 App Store/Play Store Release</w:t>
+      </w:r>
+    </w:p>
+    <w:p>
+      <w:pPr>
+        <w:pStyle w:val="ListParagraph"/>
+        <w:numPr>
+          <w:ilvl w:val="2"/>
+          <w:numId w:val="25"/>
+        </w:numPr>
+      </w:pPr>
+      <w:r>
+        <w:t>3.</w:t>
+      </w:r>
+      <w:r>
+        <w:t>8</w:t>
+      </w:r>
+      <w:r>
+        <w:t xml:space="preserve">.3 </w:t>
+      </w:r>
+      <w:r>
+        <w:t xml:space="preserve">Phased </w:t>
+      </w:r>
+      <w:r>
+        <w:t>Production Rollout</w:t>
+      </w:r>
+      <w:r>
+        <w:t xml:space="preserve"> and Monitoring</w:t>
+      </w:r>
+    </w:p>
+    <w:p>
+      <w:pPr>
+        <w:pStyle w:val="ListParagraph"/>
+        <w:numPr>
+          <w:ilvl w:val="2"/>
+          <w:numId w:val="25"/>
+        </w:numPr>
+      </w:pPr>
+      <w:r>
+        <w:t>3.</w:t>
+      </w:r>
+      <w:r>
+        <w:t>8</w:t>
+      </w:r>
+      <w:r>
+        <w:t>.4 Post-Launch Support and Maintenance</w:t>
+      </w:r>
+    </w:p>
+    <w:p>
+      <w:r>
+        <w:br w:type="page"/>
+      </w:r>
+    </w:p>
+    <w:p>
+      <w:pPr>
+        <w:pStyle w:val="Heading1"/>
+        <w:rPr>
+          <w:b/>
+          <w:bCs/>
+          <w:sz w:val="48"/>
+          <w:szCs w:val="48"/>
+        </w:rPr>
+      </w:pPr>
+      <w:r>
+        <w:rPr>
+          <w:b/>
+          <w:bCs/>
+          <w:noProof/>
+        </w:rPr>
+        <w:lastRenderedPageBreak/>
+        <mc:AlternateContent>
+          <mc:Choice Requires="wps">
+            <w:drawing>
+              <wp:anchor distT="0" distB="0" distL="114300" distR="114300" simplePos="0" relativeHeight="251667456" behindDoc="0" locked="0" layoutInCell="1" allowOverlap="1" wp14:anchorId="7A2F40F5" wp14:editId="01DBE108">
+                <wp:simplePos x="0" y="0"/>
+                <wp:positionH relativeFrom="margin">
+                  <wp:align>center</wp:align>
+                </wp:positionH>
+                <wp:positionV relativeFrom="paragraph">
+                  <wp:posOffset>361950</wp:posOffset>
+                </wp:positionV>
+                <wp:extent cx="6286500" cy="9525"/>
+                <wp:effectExtent l="0" t="0" r="19050" b="28575"/>
+                <wp:wrapNone/>
+                <wp:docPr id="1" name="Straight Connector 1"/>
+                <wp:cNvGraphicFramePr/>
+                <a:graphic xmlns:a="http://schemas.openxmlformats.org/drawingml/2006/main">
+                  <a:graphicData uri="http://schemas.microsoft.com/office/word/2010/wordprocessingShape">
+                    <wps:wsp>
+                      <wps:cNvCnPr/>
+                      <wps:spPr>
+                        <a:xfrm>
+                          <a:off x="0" y="0"/>
+                          <a:ext cx="6286500" cy="9525"/>
+                        </a:xfrm>
+                        <a:prstGeom prst="line">
+                          <a:avLst/>
+                        </a:prstGeom>
+                      </wps:spPr>
+                      <wps:style>
+                        <a:lnRef idx="1">
+                          <a:schemeClr val="accent1"/>
+                        </a:lnRef>
+                        <a:fillRef idx="0">
+                          <a:schemeClr val="accent1"/>
+                        </a:fillRef>
+                        <a:effectRef idx="0">
+                          <a:schemeClr val="accent1"/>
+                        </a:effectRef>
+                        <a:fontRef idx="minor">
+                          <a:schemeClr val="tx1"/>
+                        </a:fontRef>
+                      </wps:style>
+                      <wps:bodyPr/>
+                    </wps:wsp>
+                  </a:graphicData>
+                </a:graphic>
+              </wp:anchor>
+            </w:drawing>
+          </mc:Choice>
+          <mc:Fallback>
+            <w:pict>
+              <v:line w14:anchorId="1575FECC" id="Straight Connector 1" o:spid="_x0000_s1026" style="position:absolute;z-index:251667456;visibility:visible;mso-wrap-style:square;mso-wrap-distance-left:9pt;mso-wrap-distance-top:0;mso-wrap-distance-right:9pt;mso-wrap-distance-bottom:0;mso-position-horizontal:center;mso-position-horizontal-relative:margin;mso-position-vertical:absolute;mso-position-vertical-relative:text" from="0,28.5pt" to="495pt,29.25pt" o:gfxdata="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" strokecolor="#156082 [3204]" strokeweight=".5pt">
+                <v:stroke joinstyle="miter"/>
+                <w10:wrap anchorx="margin"/>
+              </v:line>
+            </w:pict>
+          </mc:Fallback>
+        </mc:AlternateContent>
+      </w:r>
+      <w:r>
+        <w:rPr>
+          <w:b/>
+          <w:bCs/>
+          <w:sz w:val="48"/>
+          <w:szCs w:val="48"/>
+        </w:rPr>
+        <w:t>Gantt Chart</w:t>
+      </w:r>
+    </w:p>
+    <w:p>
+      <w:r>
+        <w:t xml:space="preserve">The figure below illustrates the Gantt chart created in MS Professional Project after importing the WBS into it. </w:t>
+      </w:r>
+      <w:r>
+        <w:t xml:space="preserve">Along with all the tasks and categories included in the WBS, the creation of estimated time of completion for each task and which teams would handle them was necessary for Professional Project to accurately generate the Gantt chart. All time estimates are rough estimates and not based on real data </w:t>
+      </w:r>
+      <w:r>
+        <w:t>now</w:t>
+      </w:r>
+      <w:r>
+        <w:t xml:space="preserve">, since </w:t>
+      </w:r>
+      <w:r>
+        <w:t>we have no internal data history and need time to find external data sources.</w:t>
+      </w:r>
+    </w:p>
+    <w:p>
+      <w:r>
+        <w:br w:type="page"/>
+      </w:r>
+    </w:p>
+    <w:p>
+      <w:r>
+        <w:rPr>
+          <w:noProof/>
+        </w:rPr>
+        <w:lastRenderedPageBreak/>
+        <w:drawing>
+          <wp:inline distT="0" distB="0" distL="0" distR="0" wp14:anchorId="0558232D" wp14:editId="35F2E507">
+            <wp:extent cx="3470275" cy="8229600"/>
+            <wp:effectExtent l="0" t="0" r="0" b="0"/>
+            <wp:docPr id="1139412688" name="Picture 6"/>
+            <wp:cNvGraphicFramePr>
+              <a:graphicFrameLocks xmlns:a="http://schemas.openxmlformats.org/drawingml/2006/main" noChangeAspect="1"/>
+            </wp:cNvGraphicFramePr>
+            <a:graphic xmlns:a="http://schemas.openxmlformats.org/drawingml/2006/main">
+              <a:graphicData uri="http://schemas.openxmlformats.org/drawingml/2006/picture">
+                <pic:pic xmlns:pic="http://schemas.openxmlformats.org/drawingml/2006/picture">
+                  <pic:nvPicPr>
+                    <pic:cNvPr id="1139412688" name="Picture 1139412688"/>
+                    <pic:cNvPicPr/>
+                  </pic:nvPicPr>
+                  <pic:blipFill>
+                    <a:blip r:embed="rId8" cstate="print">
+                      <a:extLst>
+                        <a:ext uri="{28A0092B-C50C-407E-A947-70E740481C1C}">
+                          <a14:useLocalDpi xmlns:a14="http://schemas.microsoft.com/office/drawing/2010/main" val="0"/>
+                        </a:ext>
+                      </a:extLst>
+                    </a:blip>
+                    <a:stretch>
+                      <a:fillRect/>
+                    </a:stretch>
+                  </pic:blipFill>
+                  <pic:spPr>
+                    <a:xfrm>
+                      <a:off x="0" y="0"/>
+                      <a:ext cx="3470275" cy="8229600"/>
+                    </a:xfrm>
+                    <a:prstGeom prst="rect">
+                      <a:avLst/>
+                    </a:prstGeom>
+                  </pic:spPr>
+                </pic:pic>
+              </a:graphicData>
+            </a:graphic>
+          </wp:inline>
+        </w:drawing>
+      </w:r>
+    </w:p>
     <w:sectPr>
       <w:pgSz w:w="12240" w:h="15840"/>
       <w:pgMar w:top="1440" w:right="1440" w:bottom="1440" w:left="1440" w:header="720" w:footer="720" w:gutter="0"/>
@@ -4732,7 +6229,7 @@
         <w:rFonts w:ascii="Symbol" w:eastAsiaTheme="minorHAnsi" w:hAnsi="Symbol" w:cstheme="minorBidi" w:hint="default"/>
       </w:rPr>
     </w:lvl>
-    <w:lvl w:ilvl="1" w:tplc="04090003" w:tentative="1">
+    <w:lvl w:ilvl="1" w:tplc="04090003">
       <w:start w:val="1"/>
       <w:numFmt w:val="bullet"/>
       <w:lvlText w:val="o"/>
@@ -4744,7 +6241,7 @@
         <w:rFonts w:ascii="Courier New" w:hAnsi="Courier New" w:cs="Courier New" w:hint="default"/>
       </w:rPr>
     </w:lvl>
-    <w:lvl w:ilvl="2" w:tplc="04090005" w:tentative="1">
+    <w:lvl w:ilvl="2" w:tplc="04090005">
       <w:start w:val="1"/>
       <w:numFmt w:val="bullet"/>
       <w:lvlText w:val=""/>
@@ -5121,6 +6618,232 @@
     </w:lvl>
   </w:abstractNum>
   <w:abstractNum w:abstractNumId="22" w15:restartNumberingAfterBreak="0">
+    <w:nsid w:val="6B2D7D2E"/>
+    <w:multiLevelType w:val="multilevel"/>
+    <w:tmpl w:val="1F429998"/>
+    <w:lvl w:ilvl="0">
+      <w:start w:val="1"/>
+      <w:numFmt w:val="decimal"/>
+      <w:lvlText w:val="%1.0"/>
+      <w:lvlJc w:val="left"/>
+      <w:pPr>
+        <w:ind w:left="360" w:hanging="360"/>
+      </w:pPr>
+      <w:rPr>
+        <w:rFonts w:hint="default"/>
+      </w:rPr>
+    </w:lvl>
+    <w:lvl w:ilvl="1">
+      <w:start w:val="1"/>
+      <w:numFmt w:val="decimal"/>
+      <w:lvlText w:val="%1.%2"/>
+      <w:lvlJc w:val="left"/>
+      <w:pPr>
+        <w:ind w:left="1080" w:hanging="360"/>
+      </w:pPr>
+      <w:rPr>
+        <w:rFonts w:hint="default"/>
+      </w:rPr>
+    </w:lvl>
+    <w:lvl w:ilvl="2">
+      <w:start w:val="1"/>
+      <w:numFmt w:val="decimal"/>
+      <w:lvlText w:val="%1.%2.%3"/>
+      <w:lvlJc w:val="left"/>
+      <w:pPr>
+        <w:ind w:left="2160" w:hanging="720"/>
+      </w:pPr>
+      <w:rPr>
+        <w:rFonts w:hint="default"/>
+      </w:rPr>
+    </w:lvl>
+    <w:lvl w:ilvl="3">
+      <w:start w:val="1"/>
+      <w:numFmt w:val="decimal"/>
+      <w:lvlText w:val="%1.%2.%3.%4"/>
+      <w:lvlJc w:val="left"/>
+      <w:pPr>
+        <w:ind w:left="2880" w:hanging="720"/>
+      </w:pPr>
+      <w:rPr>
+        <w:rFonts w:hint="default"/>
+      </w:rPr>
+    </w:lvl>
+    <w:lvl w:ilvl="4">
+      <w:start w:val="1"/>
+      <w:numFmt w:val="decimal"/>
+      <w:lvlText w:val="%1.%2.%3.%4.%5"/>
+      <w:lvlJc w:val="left"/>
+      <w:pPr>
+        <w:ind w:left="3960" w:hanging="1080"/>
+      </w:pPr>
+      <w:rPr>
+        <w:rFonts w:hint="default"/>
+      </w:rPr>
+    </w:lvl>
+    <w:lvl w:ilvl="5">
+      <w:start w:val="1"/>
+      <w:numFmt w:val="decimal"/>
+      <w:lvlText w:val="%1.%2.%3.%4.%5.%6"/>
+      <w:lvlJc w:val="left"/>
+      <w:pPr>
+        <w:ind w:left="4680" w:hanging="1080"/>
+      </w:pPr>
+      <w:rPr>
+        <w:rFonts w:hint="default"/>
+      </w:rPr>
+    </w:lvl>
+    <w:lvl w:ilvl="6">
+      <w:start w:val="1"/>
+      <w:numFmt w:val="decimal"/>
+      <w:lvlText w:val="%1.%2.%3.%4.%5.%6.%7"/>
+      <w:lvlJc w:val="left"/>
+      <w:pPr>
+        <w:ind w:left="5760" w:hanging="1440"/>
+      </w:pPr>
+      <w:rPr>
+        <w:rFonts w:hint="default"/>
+      </w:rPr>
+    </w:lvl>
+    <w:lvl w:ilvl="7">
+      <w:start w:val="1"/>
+      <w:numFmt w:val="decimal"/>
+      <w:lvlText w:val="%1.%2.%3.%4.%5.%6.%7.%8"/>
+      <w:lvlJc w:val="left"/>
+      <w:pPr>
+        <w:ind w:left="6480" w:hanging="1440"/>
+      </w:pPr>
+      <w:rPr>
+        <w:rFonts w:hint="default"/>
+      </w:rPr>
+    </w:lvl>
+    <w:lvl w:ilvl="8">
+      <w:start w:val="1"/>
+      <w:numFmt w:val="decimal"/>
+      <w:lvlText w:val="%1.%2.%3.%4.%5.%6.%7.%8.%9"/>
+      <w:lvlJc w:val="left"/>
+      <w:pPr>
+        <w:ind w:left="7560" w:hanging="1800"/>
+      </w:pPr>
+      <w:rPr>
+        <w:rFonts w:hint="default"/>
+      </w:rPr>
+    </w:lvl>
+  </w:abstractNum>
+  <w:abstractNum w:abstractNumId="23" w15:restartNumberingAfterBreak="0">
+    <w:nsid w:val="6B7531CF"/>
+    <w:multiLevelType w:val="hybridMultilevel"/>
+    <w:tmpl w:val="0C661E4E"/>
+    <w:lvl w:ilvl="0" w:tplc="3F8C2BF0">
+      <w:start w:val="2"/>
+      <w:numFmt w:val="bullet"/>
+      <w:lvlText w:val=""/>
+      <w:lvlJc w:val="left"/>
+      <w:pPr>
+        <w:ind w:left="720" w:hanging="360"/>
+      </w:pPr>
+      <w:rPr>
+        <w:rFonts w:ascii="Symbol" w:eastAsiaTheme="minorHAnsi" w:hAnsi="Symbol" w:cstheme="minorBidi" w:hint="default"/>
+      </w:rPr>
+    </w:lvl>
+    <w:lvl w:ilvl="1" w:tplc="04090003">
+      <w:start w:val="1"/>
+      <w:numFmt w:val="bullet"/>
+      <w:lvlText w:val="o"/>
+      <w:lvlJc w:val="left"/>
+      <w:pPr>
+        <w:ind w:left="1440" w:hanging="360"/>
+      </w:pPr>
+      <w:rPr>
+        <w:rFonts w:ascii="Courier New" w:hAnsi="Courier New" w:cs="Courier New" w:hint="default"/>
+      </w:rPr>
+    </w:lvl>
+    <w:lvl w:ilvl="2" w:tplc="04090005">
+      <w:start w:val="1"/>
+      <w:numFmt w:val="bullet"/>
+      <w:lvlText w:val=""/>
+      <w:lvlJc w:val="left"/>
+      <w:pPr>
+        <w:ind w:left="2160" w:hanging="360"/>
+      </w:pPr>
+      <w:rPr>
+        <w:rFonts w:ascii="Wingdings" w:hAnsi="Wingdings" w:hint="default"/>
+      </w:rPr>
+    </w:lvl>
+    <w:lvl w:ilvl="3" w:tplc="04090001">
+      <w:start w:val="1"/>
+      <w:numFmt w:val="bullet"/>
+      <w:lvlText w:val=""/>
+      <w:lvlJc w:val="left"/>
+      <w:pPr>
+        <w:ind w:left="2880" w:hanging="360"/>
+      </w:pPr>
+      <w:rPr>
+        <w:rFonts w:ascii="Symbol" w:hAnsi="Symbol" w:hint="default"/>
+      </w:rPr>
+    </w:lvl>
+    <w:lvl w:ilvl="4" w:tplc="04090003" w:tentative="1">
+      <w:start w:val="1"/>
+      <w:numFmt w:val="bullet"/>
+      <w:lvlText w:val="o"/>
+      <w:lvlJc w:val="left"/>
+      <w:pPr>
+        <w:ind w:left="3600" w:hanging="360"/>
+      </w:pPr>
+      <w:rPr>
+        <w:rFonts w:ascii="Courier New" w:hAnsi="Courier New" w:cs="Courier New" w:hint="default"/>
+      </w:rPr>
+    </w:lvl>
+    <w:lvl w:ilvl="5" w:tplc="04090005" w:tentative="1">
+      <w:start w:val="1"/>
+      <w:numFmt w:val="bullet"/>
+      <w:lvlText w:val=""/>
+      <w:lvlJc w:val="left"/>
+      <w:pPr>
+        <w:ind w:left="4320" w:hanging="360"/>
+      </w:pPr>
+      <w:rPr>
+        <w:rFonts w:ascii="Wingdings" w:hAnsi="Wingdings" w:hint="default"/>
+      </w:rPr>
+    </w:lvl>
+    <w:lvl w:ilvl="6" w:tplc="04090001" w:tentative="1">
+      <w:start w:val="1"/>
+      <w:numFmt w:val="bullet"/>
+      <w:lvlText w:val=""/>
+      <w:lvlJc w:val="left"/>
+      <w:pPr>
+        <w:ind w:left="5040" w:hanging="360"/>
+      </w:pPr>
+      <w:rPr>
+        <w:rFonts w:ascii="Symbol" w:hAnsi="Symbol" w:hint="default"/>
+      </w:rPr>
+    </w:lvl>
+    <w:lvl w:ilvl="7" w:tplc="04090003" w:tentative="1">
+      <w:start w:val="1"/>
+      <w:numFmt w:val="bullet"/>
+      <w:lvlText w:val="o"/>
+      <w:lvlJc w:val="left"/>
+      <w:pPr>
+        <w:ind w:left="5760" w:hanging="360"/>
+      </w:pPr>
+      <w:rPr>
+        <w:rFonts w:ascii="Courier New" w:hAnsi="Courier New" w:cs="Courier New" w:hint="default"/>
+      </w:rPr>
+    </w:lvl>
+    <w:lvl w:ilvl="8" w:tplc="04090005" w:tentative="1">
+      <w:start w:val="1"/>
+      <w:numFmt w:val="bullet"/>
+      <w:lvlText w:val=""/>
+      <w:lvlJc w:val="left"/>
+      <w:pPr>
+        <w:ind w:left="6480" w:hanging="360"/>
+      </w:pPr>
+      <w:rPr>
+        <w:rFonts w:ascii="Wingdings" w:hAnsi="Wingdings" w:hint="default"/>
+      </w:rPr>
+    </w:lvl>
+  </w:abstractNum>
+  <w:abstractNum w:abstractNumId="24" w15:restartNumberingAfterBreak="0">
     <w:nsid w:val="75B32A7A"/>
     <w:multiLevelType w:val="multilevel"/>
     <w:tmpl w:val="CA28FF00"/>
@@ -5241,74 +6964,80 @@
       </w:rPr>
     </w:lvl>
   </w:abstractNum>
-  <w:num w:numId="1" w16cid:durableId="2036346028">
+  <w:num w:numId="1" w16cid:durableId="1979450348">
+    <w:abstractNumId w:val="24"/>
+  </w:num>
+  <w:num w:numId="2" w16cid:durableId="1097408708">
+    <w:abstractNumId w:val="19"/>
+  </w:num>
+  <w:num w:numId="3" w16cid:durableId="2040886575">
+    <w:abstractNumId w:val="18"/>
+  </w:num>
+  <w:num w:numId="4" w16cid:durableId="237984452">
+    <w:abstractNumId w:val="12"/>
+  </w:num>
+  <w:num w:numId="5" w16cid:durableId="2087917693">
+    <w:abstractNumId w:val="8"/>
+  </w:num>
+  <w:num w:numId="6" w16cid:durableId="1305087170">
+    <w:abstractNumId w:val="16"/>
+  </w:num>
+  <w:num w:numId="7" w16cid:durableId="1507748982">
+    <w:abstractNumId w:val="4"/>
+  </w:num>
+  <w:num w:numId="8" w16cid:durableId="1282959147">
+    <w:abstractNumId w:val="0"/>
+  </w:num>
+  <w:num w:numId="9" w16cid:durableId="1402824843">
+    <w:abstractNumId w:val="7"/>
+  </w:num>
+  <w:num w:numId="10" w16cid:durableId="1957633126">
+    <w:abstractNumId w:val="6"/>
+  </w:num>
+  <w:num w:numId="11" w16cid:durableId="1979412746">
+    <w:abstractNumId w:val="17"/>
+  </w:num>
+  <w:num w:numId="12" w16cid:durableId="480343513">
+    <w:abstractNumId w:val="5"/>
+  </w:num>
+  <w:num w:numId="13" w16cid:durableId="1515414818">
+    <w:abstractNumId w:val="15"/>
+  </w:num>
+  <w:num w:numId="14" w16cid:durableId="591204239">
+    <w:abstractNumId w:val="9"/>
+  </w:num>
+  <w:num w:numId="15" w16cid:durableId="1752120828">
+    <w:abstractNumId w:val="13"/>
+  </w:num>
+  <w:num w:numId="16" w16cid:durableId="384258906">
+    <w:abstractNumId w:val="11"/>
+  </w:num>
+  <w:num w:numId="17" w16cid:durableId="1010295">
+    <w:abstractNumId w:val="10"/>
+  </w:num>
+  <w:num w:numId="18" w16cid:durableId="1182664399">
+    <w:abstractNumId w:val="3"/>
+  </w:num>
+  <w:num w:numId="19" w16cid:durableId="624894307">
+    <w:abstractNumId w:val="14"/>
+  </w:num>
+  <w:num w:numId="20" w16cid:durableId="2052874863">
+    <w:abstractNumId w:val="20"/>
+  </w:num>
+  <w:num w:numId="21" w16cid:durableId="61561100">
+    <w:abstractNumId w:val="2"/>
+  </w:num>
+  <w:num w:numId="22" w16cid:durableId="841941311">
+    <w:abstractNumId w:val="21"/>
+  </w:num>
+  <w:num w:numId="23" w16cid:durableId="248199759">
+    <w:abstractNumId w:val="1"/>
+  </w:num>
+  <w:num w:numId="24" w16cid:durableId="1670867755">
     <w:abstractNumId w:val="22"/>
   </w:num>
-  <w:num w:numId="2" w16cid:durableId="772285345">
-    <w:abstractNumId w:val="19"/>
-  </w:num>
-  <w:num w:numId="3" w16cid:durableId="508328034">
-    <w:abstractNumId w:val="18"/>
-  </w:num>
-  <w:num w:numId="4" w16cid:durableId="1526016936">
-    <w:abstractNumId w:val="12"/>
-  </w:num>
-  <w:num w:numId="5" w16cid:durableId="756365598">
-    <w:abstractNumId w:val="8"/>
-  </w:num>
-  <w:num w:numId="6" w16cid:durableId="428047326">
-    <w:abstractNumId w:val="16"/>
-  </w:num>
-  <w:num w:numId="7" w16cid:durableId="854272829">
-    <w:abstractNumId w:val="4"/>
-  </w:num>
-  <w:num w:numId="8" w16cid:durableId="1448499652">
-    <w:abstractNumId w:val="0"/>
-  </w:num>
-  <w:num w:numId="9" w16cid:durableId="592321792">
-    <w:abstractNumId w:val="7"/>
-  </w:num>
-  <w:num w:numId="10" w16cid:durableId="185139243">
-    <w:abstractNumId w:val="6"/>
-  </w:num>
-  <w:num w:numId="11" w16cid:durableId="1669939943">
-    <w:abstractNumId w:val="17"/>
-  </w:num>
-  <w:num w:numId="12" w16cid:durableId="1122573545">
-    <w:abstractNumId w:val="5"/>
-  </w:num>
-  <w:num w:numId="13" w16cid:durableId="1674799030">
-    <w:abstractNumId w:val="15"/>
-  </w:num>
-  <w:num w:numId="14" w16cid:durableId="1648509839">
-    <w:abstractNumId w:val="9"/>
-  </w:num>
-  <w:num w:numId="15" w16cid:durableId="147090609">
-    <w:abstractNumId w:val="13"/>
-  </w:num>
-  <w:num w:numId="16" w16cid:durableId="1159692251">
-    <w:abstractNumId w:val="11"/>
-  </w:num>
-  <w:num w:numId="17" w16cid:durableId="78605416">
-    <w:abstractNumId w:val="10"/>
-  </w:num>
-  <w:num w:numId="18" w16cid:durableId="1947734979">
-    <w:abstractNumId w:val="3"/>
-  </w:num>
-  <w:num w:numId="19" w16cid:durableId="1916548010">
-    <w:abstractNumId w:val="14"/>
-  </w:num>
-  <w:num w:numId="20" w16cid:durableId="213272936">
-    <w:abstractNumId w:val="20"/>
-  </w:num>
-  <w:num w:numId="21" w16cid:durableId="476649694">
-    <w:abstractNumId w:val="2"/>
-  </w:num>
-  <w:num w:numId="22" w16cid:durableId="1166747068">
-    <w:abstractNumId w:val="21"/>
-  </w:num>
-  <w:num w:numId="23" w16cid:durableId="1630471768">
-    <w:abstractNumId w:val="1"/>
+  <w:num w:numId="25" w16cid:durableId="52317453">
+    <w:abstractNumId w:val="23"/>
   </w:num>
 </w:numbering>
 </file>

</xml_diff>

<commit_message>
Finished Assignment 3 backlog and sprint 1 planning
</commit_message>
<xml_diff>
--- a/CIS4374 Semester Project Maximiliano Soto.docx
+++ b/CIS4374 Semester Project Maximiliano Soto.docx
@@ -3099,12 +3099,21 @@
     </w:p>
     <w:p>
       <w:r>
-        <w:t>Version: 1.0</w:t>
-      </w:r>
-    </w:p>
-    <w:p>
-      <w:r>
-        <w:t>Date: 9/17/2026</w:t>
+        <w:t>Version: 1.</w:t>
+      </w:r>
+      <w:r>
+        <w:t>1</w:t>
+      </w:r>
+    </w:p>
+    <w:p>
+      <w:r>
+        <w:t>Date: 9/</w:t>
+      </w:r>
+      <w:r>
+        <w:t>24</w:t>
+      </w:r>
+      <w:r>
+        <w:t>/2026</w:t>
       </w:r>
     </w:p>
     <w:p/>
@@ -3508,7 +3517,13 @@
         </w:numPr>
       </w:pPr>
       <w:r>
-        <w:t xml:space="preserve">2.3 Pricing </w:t>
+        <w:t xml:space="preserve">2.3 </w:t>
+      </w:r>
+      <w:r>
+        <w:t xml:space="preserve">Garage </w:t>
+      </w:r>
+      <w:r>
+        <w:t xml:space="preserve">Pricing </w:t>
       </w:r>
     </w:p>
     <w:p>
@@ -4599,6 +4614,953 @@
         </w:drawing>
       </w:r>
     </w:p>
+    <w:p>
+      <w:pPr>
+        <w:pStyle w:val="Heading1"/>
+        <w:rPr>
+          <w:b/>
+          <w:bCs/>
+          <w:sz w:val="48"/>
+          <w:szCs w:val="48"/>
+        </w:rPr>
+      </w:pPr>
+      <w:r>
+        <w:rPr>
+          <w:b/>
+          <w:bCs/>
+          <w:noProof/>
+        </w:rPr>
+        <w:lastRenderedPageBreak/>
+        <mc:AlternateContent>
+          <mc:Choice Requires="wps">
+            <w:drawing>
+              <wp:anchor distT="0" distB="0" distL="114300" distR="114300" simplePos="0" relativeHeight="251669504" behindDoc="0" locked="0" layoutInCell="1" allowOverlap="1" wp14:anchorId="7193FB52" wp14:editId="551D79E4">
+                <wp:simplePos x="0" y="0"/>
+                <wp:positionH relativeFrom="margin">
+                  <wp:align>center</wp:align>
+                </wp:positionH>
+                <wp:positionV relativeFrom="paragraph">
+                  <wp:posOffset>361950</wp:posOffset>
+                </wp:positionV>
+                <wp:extent cx="6286500" cy="9525"/>
+                <wp:effectExtent l="0" t="0" r="19050" b="28575"/>
+                <wp:wrapNone/>
+                <wp:docPr id="1148914834" name="Straight Connector 1148914834"/>
+                <wp:cNvGraphicFramePr/>
+                <a:graphic xmlns:a="http://schemas.openxmlformats.org/drawingml/2006/main">
+                  <a:graphicData uri="http://schemas.microsoft.com/office/word/2010/wordprocessingShape">
+                    <wps:wsp>
+                      <wps:cNvCnPr/>
+                      <wps:spPr>
+                        <a:xfrm>
+                          <a:off x="0" y="0"/>
+                          <a:ext cx="6286500" cy="9525"/>
+                        </a:xfrm>
+                        <a:prstGeom prst="line">
+                          <a:avLst/>
+                        </a:prstGeom>
+                      </wps:spPr>
+                      <wps:style>
+                        <a:lnRef idx="1">
+                          <a:schemeClr val="accent1"/>
+                        </a:lnRef>
+                        <a:fillRef idx="0">
+                          <a:schemeClr val="accent1"/>
+                        </a:fillRef>
+                        <a:effectRef idx="0">
+                          <a:schemeClr val="accent1"/>
+                        </a:effectRef>
+                        <a:fontRef idx="minor">
+                          <a:schemeClr val="tx1"/>
+                        </a:fontRef>
+                      </wps:style>
+                      <wps:bodyPr/>
+                    </wps:wsp>
+                  </a:graphicData>
+                </a:graphic>
+              </wp:anchor>
+            </w:drawing>
+          </mc:Choice>
+          <mc:Fallback>
+            <w:pict>
+              <v:line w14:anchorId="1D199DC3" id="Straight Connector 1148914834" o:spid="_x0000_s1026" style="position:absolute;z-index:251669504;visibility:visible;mso-wrap-style:square;mso-wrap-distance-left:9pt;mso-wrap-distance-top:0;mso-wrap-distance-right:9pt;mso-wrap-distance-bottom:0;mso-position-horizontal:center;mso-position-horizontal-relative:margin;mso-position-vertical:absolute;mso-position-vertical-relative:text" from="0,28.5pt" to="495pt,29.25pt" o:gfxdata="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" strokecolor="#156082 [3204]" strokeweight=".5pt">
+                <v:stroke joinstyle="miter"/>
+                <w10:wrap anchorx="margin"/>
+              </v:line>
+            </w:pict>
+          </mc:Fallback>
+        </mc:AlternateContent>
+      </w:r>
+      <w:r>
+        <w:rPr>
+          <w:b/>
+          <w:bCs/>
+          <w:sz w:val="48"/>
+          <w:szCs w:val="48"/>
+        </w:rPr>
+        <w:t>Backlog</w:t>
+      </w:r>
+    </w:p>
+    <w:p>
+      <w:r>
+        <w:t>Backlog</w:t>
+      </w:r>
+    </w:p>
+    <w:p>
+      <w:r>
+        <w:t>Project: Smart Parking Platform</w:t>
+      </w:r>
+    </w:p>
+    <w:p>
+      <w:r>
+        <w:t>Version: 1.</w:t>
+      </w:r>
+      <w:r>
+        <w:t>0</w:t>
+      </w:r>
+    </w:p>
+    <w:p>
+      <w:r>
+        <w:t>Date: 9/</w:t>
+      </w:r>
+      <w:r>
+        <w:t>24</w:t>
+      </w:r>
+      <w:r>
+        <w:t>/2026</w:t>
+      </w:r>
+    </w:p>
+    <w:p/>
+    <w:p>
+      <w:r>
+        <w:t xml:space="preserve">The backlog carries some key differences between itself and the WBS, since the </w:t>
+      </w:r>
+      <w:r>
+        <w:t>focus</w:t>
+      </w:r>
+      <w:r>
+        <w:t xml:space="preserve"> of the backlog is to </w:t>
+      </w:r>
+      <w:r>
+        <w:t xml:space="preserve">list features that are shippable to users. Because of this, the sprints created in Jira may not be completely accurate to the Gantt chart. For example, the first sprint in the Gantt chart covers early setup work such as the project charter and system architecture, which aren’t features a user would be able to try out yet. Therefore, </w:t>
+      </w:r>
+      <w:r>
+        <w:t>we</w:t>
+      </w:r>
+      <w:r>
+        <w:t xml:space="preserve"> opted to start the first sprint in Jira to be entirely focused </w:t>
+      </w:r>
+      <w:r>
+        <w:t>on</w:t>
+      </w:r>
+      <w:r>
+        <w:t xml:space="preserve"> account login and access.</w:t>
+      </w:r>
+      <w:r>
+        <w:t xml:space="preserve"> For now, we’ve only created the backlog item titles; however, for future reference, we’ve created user stories for each item in sprint 1 so that we may format future stories similarly.</w:t>
+      </w:r>
+    </w:p>
+    <w:p/>
+    <w:p>
+      <w:r>
+        <w:t>Login Backlog Items:</w:t>
+      </w:r>
+    </w:p>
+    <w:p>
+      <w:pPr>
+        <w:pStyle w:val="ListParagraph"/>
+        <w:numPr>
+          <w:ilvl w:val="0"/>
+          <w:numId w:val="26"/>
+        </w:numPr>
+      </w:pPr>
+      <w:r>
+        <w:t>Driver Account Registration</w:t>
+      </w:r>
+      <w:r>
+        <w:t xml:space="preserve"> </w:t>
+      </w:r>
+      <w:r>
+        <w:t>-</w:t>
+      </w:r>
+      <w:r>
+        <w:t xml:space="preserve"> </w:t>
+      </w:r>
+      <w:r>
+        <w:rPr>
+          <w:i/>
+          <w:iCs/>
+        </w:rPr>
+        <w:t>As a new driver, I want to create an account to access the platform's booking features.</w:t>
+      </w:r>
+    </w:p>
+    <w:p>
+      <w:pPr>
+        <w:pStyle w:val="ListParagraph"/>
+        <w:numPr>
+          <w:ilvl w:val="0"/>
+          <w:numId w:val="26"/>
+        </w:numPr>
+      </w:pPr>
+      <w:r>
+        <w:t>Operator Account Application &amp; Approval</w:t>
+      </w:r>
+      <w:r>
+        <w:t xml:space="preserve"> - </w:t>
+      </w:r>
+      <w:r>
+        <w:rPr>
+          <w:i/>
+          <w:iCs/>
+        </w:rPr>
+        <w:t>As a prospective parking operator, I want to apply for an operator account to list and manage my garage.</w:t>
+      </w:r>
+    </w:p>
+    <w:p>
+      <w:pPr>
+        <w:pStyle w:val="ListParagraph"/>
+        <w:numPr>
+          <w:ilvl w:val="0"/>
+          <w:numId w:val="26"/>
+        </w:numPr>
+      </w:pPr>
+      <w:r>
+        <w:t>Role-Based Login</w:t>
+      </w:r>
+      <w:r>
+        <w:t xml:space="preserve"> - </w:t>
+      </w:r>
+      <w:r>
+        <w:rPr>
+          <w:i/>
+          <w:iCs/>
+        </w:rPr>
+        <w:t>As a registered user, I want to log in and be routed to the correct role-based interface so I can see features relevant to me.</w:t>
+      </w:r>
+    </w:p>
+    <w:p>
+      <w:pPr>
+        <w:pStyle w:val="ListParagraph"/>
+        <w:numPr>
+          <w:ilvl w:val="0"/>
+          <w:numId w:val="26"/>
+        </w:numPr>
+        <w:rPr>
+          <w:i/>
+          <w:iCs/>
+        </w:rPr>
+      </w:pPr>
+      <w:r>
+        <w:t>Password Reset/Recovery</w:t>
+      </w:r>
+      <w:r>
+        <w:t xml:space="preserve"> - </w:t>
+      </w:r>
+      <w:r>
+        <w:rPr>
+          <w:i/>
+          <w:iCs/>
+        </w:rPr>
+        <w:t>As a user who forgot my password, I want to reset it via email to regain access to my account.</w:t>
+      </w:r>
+    </w:p>
+    <w:p>
+      <w:pPr>
+        <w:pStyle w:val="ListParagraph"/>
+        <w:numPr>
+          <w:ilvl w:val="0"/>
+          <w:numId w:val="26"/>
+        </w:numPr>
+        <w:rPr>
+          <w:i/>
+          <w:iCs/>
+        </w:rPr>
+      </w:pPr>
+      <w:r>
+        <w:t>Role-Based Access Enforcement</w:t>
+      </w:r>
+      <w:r>
+        <w:t xml:space="preserve"> - </w:t>
+      </w:r>
+      <w:r>
+        <w:rPr>
+          <w:i/>
+          <w:iCs/>
+        </w:rPr>
+        <w:t>As the system, I want to restrict screens and actions by role, so that users can't access functionality outside their permissions.</w:t>
+      </w:r>
+    </w:p>
+    <w:p>
+      <w:pPr>
+        <w:pStyle w:val="ListParagraph"/>
+        <w:numPr>
+          <w:ilvl w:val="0"/>
+          <w:numId w:val="26"/>
+        </w:numPr>
+      </w:pPr>
+      <w:r>
+        <w:t>Session/Authentication Security</w:t>
+      </w:r>
+      <w:r>
+        <w:t xml:space="preserve"> - </w:t>
+      </w:r>
+      <w:r>
+        <w:rPr>
+          <w:i/>
+          <w:iCs/>
+        </w:rPr>
+        <w:t>As a user, I want my login session to be securely managed so that my account can't be hijacked.</w:t>
+      </w:r>
+    </w:p>
+    <w:p>
+      <w:pPr>
+        <w:pStyle w:val="ListParagraph"/>
+        <w:numPr>
+          <w:ilvl w:val="0"/>
+          <w:numId w:val="26"/>
+        </w:numPr>
+      </w:pPr>
+      <w:r>
+        <w:t>Failed Login Attempt Protection</w:t>
+      </w:r>
+      <w:r>
+        <w:t xml:space="preserve"> - </w:t>
+      </w:r>
+      <w:r>
+        <w:rPr>
+          <w:i/>
+          <w:iCs/>
+        </w:rPr>
+        <w:t>As the system, I want to limit repeated failed login attempts to protect accounts from brute-force attacks.</w:t>
+      </w:r>
+    </w:p>
+    <w:p/>
+    <w:p>
+      <w:r>
+        <w:t>UI Backlog Items:</w:t>
+      </w:r>
+    </w:p>
+    <w:p>
+      <w:pPr>
+        <w:pStyle w:val="ListParagraph"/>
+        <w:numPr>
+          <w:ilvl w:val="0"/>
+          <w:numId w:val="26"/>
+        </w:numPr>
+      </w:pPr>
+      <w:r>
+        <w:lastRenderedPageBreak/>
+        <w:t>Search Results/Map View</w:t>
+      </w:r>
+    </w:p>
+    <w:p>
+      <w:pPr>
+        <w:pStyle w:val="ListParagraph"/>
+        <w:numPr>
+          <w:ilvl w:val="0"/>
+          <w:numId w:val="26"/>
+        </w:numPr>
+      </w:pPr>
+      <w:r>
+        <w:t>Reservation Confirmation Screen</w:t>
+      </w:r>
+    </w:p>
+    <w:p>
+      <w:pPr>
+        <w:pStyle w:val="ListParagraph"/>
+        <w:numPr>
+          <w:ilvl w:val="0"/>
+          <w:numId w:val="26"/>
+        </w:numPr>
+      </w:pPr>
+      <w:r>
+        <w:t>On-Demand Quick-Reserve Screen</w:t>
+      </w:r>
+    </w:p>
+    <w:p>
+      <w:pPr>
+        <w:pStyle w:val="ListParagraph"/>
+        <w:numPr>
+          <w:ilvl w:val="0"/>
+          <w:numId w:val="26"/>
+        </w:numPr>
+      </w:pPr>
+      <w:r>
+        <w:t>Payment/Checkout Screen</w:t>
+      </w:r>
+    </w:p>
+    <w:p>
+      <w:pPr>
+        <w:pStyle w:val="ListParagraph"/>
+        <w:numPr>
+          <w:ilvl w:val="0"/>
+          <w:numId w:val="26"/>
+        </w:numPr>
+      </w:pPr>
+      <w:r>
+        <w:t>In-App Navigation View</w:t>
+      </w:r>
+    </w:p>
+    <w:p>
+      <w:pPr>
+        <w:pStyle w:val="ListParagraph"/>
+        <w:numPr>
+          <w:ilvl w:val="0"/>
+          <w:numId w:val="26"/>
+        </w:numPr>
+      </w:pPr>
+      <w:r>
+        <w:t>Active Session Screen</w:t>
+      </w:r>
+    </w:p>
+    <w:p>
+      <w:pPr>
+        <w:pStyle w:val="ListParagraph"/>
+        <w:numPr>
+          <w:ilvl w:val="0"/>
+          <w:numId w:val="26"/>
+        </w:numPr>
+      </w:pPr>
+      <w:r>
+        <w:t>Reservation Management Screen</w:t>
+      </w:r>
+    </w:p>
+    <w:p>
+      <w:pPr>
+        <w:pStyle w:val="ListParagraph"/>
+        <w:numPr>
+          <w:ilvl w:val="0"/>
+          <w:numId w:val="26"/>
+        </w:numPr>
+      </w:pPr>
+      <w:r>
+        <w:t>Driver Profile &amp; Payment Method Screen</w:t>
+      </w:r>
+    </w:p>
+    <w:p>
+      <w:pPr>
+        <w:pStyle w:val="ListParagraph"/>
+        <w:numPr>
+          <w:ilvl w:val="0"/>
+          <w:numId w:val="26"/>
+        </w:numPr>
+      </w:pPr>
+      <w:r>
+        <w:t>Reservation History &amp; Receipts Screen</w:t>
+      </w:r>
+    </w:p>
+    <w:p>
+      <w:pPr>
+        <w:pStyle w:val="ListParagraph"/>
+        <w:numPr>
+          <w:ilvl w:val="0"/>
+          <w:numId w:val="26"/>
+        </w:numPr>
+      </w:pPr>
+      <w:r>
+        <w:t>Operator Application Form</w:t>
+      </w:r>
+    </w:p>
+    <w:p>
+      <w:pPr>
+        <w:pStyle w:val="ListParagraph"/>
+        <w:numPr>
+          <w:ilvl w:val="0"/>
+          <w:numId w:val="26"/>
+        </w:numPr>
+      </w:pPr>
+      <w:r>
+        <w:t>Garage Listing Creation &amp; Edit Screen</w:t>
+      </w:r>
+    </w:p>
+    <w:p>
+      <w:pPr>
+        <w:pStyle w:val="ListParagraph"/>
+        <w:numPr>
+          <w:ilvl w:val="0"/>
+          <w:numId w:val="26"/>
+        </w:numPr>
+      </w:pPr>
+      <w:r>
+        <w:t>Real-Time Occupancy Dashboard</w:t>
+      </w:r>
+    </w:p>
+    <w:p>
+      <w:pPr>
+        <w:pStyle w:val="ListParagraph"/>
+        <w:numPr>
+          <w:ilvl w:val="0"/>
+          <w:numId w:val="26"/>
+        </w:numPr>
+      </w:pPr>
+      <w:r>
+        <w:t>Pricing Configuration Screen</w:t>
+      </w:r>
+    </w:p>
+    <w:p>
+      <w:pPr>
+        <w:pStyle w:val="ListParagraph"/>
+        <w:numPr>
+          <w:ilvl w:val="0"/>
+          <w:numId w:val="26"/>
+        </w:numPr>
+      </w:pPr>
+      <w:r>
+        <w:t>Reporting Overview Dashboard</w:t>
+      </w:r>
+    </w:p>
+    <w:p>
+      <w:pPr>
+        <w:pStyle w:val="ListParagraph"/>
+        <w:numPr>
+          <w:ilvl w:val="0"/>
+          <w:numId w:val="26"/>
+        </w:numPr>
+      </w:pPr>
+      <w:r>
+        <w:t>Admin Console User/Account Management Screen</w:t>
+      </w:r>
+    </w:p>
+    <w:p>
+      <w:pPr>
+        <w:pStyle w:val="ListParagraph"/>
+        <w:numPr>
+          <w:ilvl w:val="0"/>
+          <w:numId w:val="26"/>
+        </w:numPr>
+      </w:pPr>
+      <w:r>
+        <w:t>Notifications/Alerts UI Component</w:t>
+      </w:r>
+    </w:p>
+    <w:p>
+      <w:pPr>
+        <w:pStyle w:val="ListParagraph"/>
+        <w:numPr>
+          <w:ilvl w:val="0"/>
+          <w:numId w:val="26"/>
+        </w:numPr>
+      </w:pPr>
+      <w:r>
+        <w:t>Mobile/Web Parity</w:t>
+      </w:r>
+    </w:p>
+    <w:p/>
+    <w:p>
+      <w:r>
+        <w:t>Backend Process Backlog Items:</w:t>
+      </w:r>
+    </w:p>
+    <w:p>
+      <w:pPr>
+        <w:pStyle w:val="ListParagraph"/>
+        <w:numPr>
+          <w:ilvl w:val="0"/>
+          <w:numId w:val="26"/>
+        </w:numPr>
+      </w:pPr>
+      <w:r>
+        <w:t>Account Registration &amp; Auth Logic</w:t>
+      </w:r>
+    </w:p>
+    <w:p>
+      <w:pPr>
+        <w:pStyle w:val="ListParagraph"/>
+        <w:numPr>
+          <w:ilvl w:val="0"/>
+          <w:numId w:val="26"/>
+        </w:numPr>
+      </w:pPr>
+      <w:r>
+        <w:t>Real-Time Availability Search Engine</w:t>
+      </w:r>
+    </w:p>
+    <w:p>
+      <w:pPr>
+        <w:pStyle w:val="ListParagraph"/>
+        <w:numPr>
+          <w:ilvl w:val="0"/>
+          <w:numId w:val="26"/>
+        </w:numPr>
+      </w:pPr>
+      <w:r>
+        <w:t>Reservation Creation &amp; Hold-Window Logic</w:t>
+      </w:r>
+    </w:p>
+    <w:p>
+      <w:pPr>
+        <w:pStyle w:val="ListParagraph"/>
+        <w:numPr>
+          <w:ilvl w:val="0"/>
+          <w:numId w:val="26"/>
+        </w:numPr>
+      </w:pPr>
+      <w:r>
+        <w:t>Reservation Modification &amp; Cancellation Logic</w:t>
+      </w:r>
+    </w:p>
+    <w:p>
+      <w:pPr>
+        <w:pStyle w:val="ListParagraph"/>
+        <w:numPr>
+          <w:ilvl w:val="0"/>
+          <w:numId w:val="26"/>
+        </w:numPr>
+      </w:pPr>
+      <w:r>
+        <w:t>Payment Processing &amp; Gateway Integration</w:t>
+      </w:r>
+    </w:p>
+    <w:p>
+      <w:pPr>
+        <w:pStyle w:val="ListParagraph"/>
+        <w:numPr>
+          <w:ilvl w:val="0"/>
+          <w:numId w:val="26"/>
+        </w:numPr>
+      </w:pPr>
+      <w:r>
+        <w:t>Refund Processing Logic</w:t>
+      </w:r>
+    </w:p>
+    <w:p>
+      <w:pPr>
+        <w:pStyle w:val="ListParagraph"/>
+        <w:numPr>
+          <w:ilvl w:val="0"/>
+          <w:numId w:val="26"/>
+        </w:numPr>
+      </w:pPr>
+      <w:r>
+        <w:t>Navigation/Map Data Integration</w:t>
+      </w:r>
+    </w:p>
+    <w:p>
+      <w:pPr>
+        <w:pStyle w:val="ListParagraph"/>
+        <w:numPr>
+          <w:ilvl w:val="0"/>
+          <w:numId w:val="26"/>
+        </w:numPr>
+      </w:pPr>
+      <w:r>
+        <w:t>Notification Service Backend</w:t>
+      </w:r>
+    </w:p>
+    <w:p>
+      <w:pPr>
+        <w:pStyle w:val="ListParagraph"/>
+        <w:numPr>
+          <w:ilvl w:val="0"/>
+          <w:numId w:val="26"/>
+        </w:numPr>
+      </w:pPr>
+      <w:r>
+        <w:t>Operator Application/Approval Workflow Logic</w:t>
+      </w:r>
+    </w:p>
+    <w:p>
+      <w:pPr>
+        <w:pStyle w:val="ListParagraph"/>
+        <w:numPr>
+          <w:ilvl w:val="0"/>
+          <w:numId w:val="26"/>
+        </w:numPr>
+      </w:pPr>
+      <w:r>
+        <w:t>Garage Onboarding Data Handling</w:t>
+      </w:r>
+    </w:p>
+    <w:p>
+      <w:pPr>
+        <w:pStyle w:val="ListParagraph"/>
+        <w:numPr>
+          <w:ilvl w:val="0"/>
+          <w:numId w:val="26"/>
+        </w:numPr>
+      </w:pPr>
+      <w:r>
+        <w:t>Garage Details Update Logic</w:t>
+      </w:r>
+    </w:p>
+    <w:p>
+      <w:pPr>
+        <w:pStyle w:val="ListParagraph"/>
+        <w:numPr>
+          <w:ilvl w:val="0"/>
+          <w:numId w:val="26"/>
+        </w:numPr>
+      </w:pPr>
+      <w:r>
+        <w:t>Real-Time Occupancy Data Ingestion</w:t>
+      </w:r>
+    </w:p>
+    <w:p>
+      <w:pPr>
+        <w:pStyle w:val="ListParagraph"/>
+        <w:numPr>
+          <w:ilvl w:val="0"/>
+          <w:numId w:val="26"/>
+        </w:numPr>
+      </w:pPr>
+      <w:r>
+        <w:t>Sensor/Gate Hardware Integration</w:t>
+      </w:r>
+    </w:p>
+    <w:p>
+      <w:pPr>
+        <w:pStyle w:val="ListParagraph"/>
+        <w:numPr>
+          <w:ilvl w:val="0"/>
+          <w:numId w:val="26"/>
+        </w:numPr>
+      </w:pPr>
+      <w:r>
+        <w:t>Manual Occupancy Fallback Logic</w:t>
+      </w:r>
+    </w:p>
+    <w:p>
+      <w:pPr>
+        <w:pStyle w:val="ListParagraph"/>
+        <w:numPr>
+          <w:ilvl w:val="0"/>
+          <w:numId w:val="26"/>
+        </w:numPr>
+      </w:pPr>
+      <w:r>
+        <w:t>Dynamic Pricing Engine</w:t>
+      </w:r>
+    </w:p>
+    <w:p>
+      <w:pPr>
+        <w:pStyle w:val="ListParagraph"/>
+        <w:numPr>
+          <w:ilvl w:val="0"/>
+          <w:numId w:val="26"/>
+        </w:numPr>
+      </w:pPr>
+      <w:r>
+        <w:t>Admin Account Management Backend</w:t>
+      </w:r>
+    </w:p>
+    <w:p>
+      <w:pPr>
+        <w:pStyle w:val="ListParagraph"/>
+        <w:numPr>
+          <w:ilvl w:val="0"/>
+          <w:numId w:val="26"/>
+        </w:numPr>
+      </w:pPr>
+      <w:r>
+        <w:t>Role-Based Access Control Enforcement Logic</w:t>
+      </w:r>
+    </w:p>
+    <w:p/>
+    <w:p>
+      <w:r>
+        <w:t>Reporting Backlog Items:</w:t>
+      </w:r>
+    </w:p>
+    <w:p>
+      <w:pPr>
+        <w:pStyle w:val="ListParagraph"/>
+        <w:numPr>
+          <w:ilvl w:val="0"/>
+          <w:numId w:val="26"/>
+        </w:numPr>
+      </w:pPr>
+      <w:r>
+        <w:t>Utilization Analytics</w:t>
+      </w:r>
+    </w:p>
+    <w:p>
+      <w:pPr>
+        <w:pStyle w:val="ListParagraph"/>
+        <w:numPr>
+          <w:ilvl w:val="0"/>
+          <w:numId w:val="26"/>
+        </w:numPr>
+      </w:pPr>
+      <w:r>
+        <w:t>Occupancy &amp; Turnover Reporting</w:t>
+      </w:r>
+    </w:p>
+    <w:p>
+      <w:pPr>
+        <w:pStyle w:val="ListParagraph"/>
+        <w:numPr>
+          <w:ilvl w:val="0"/>
+          <w:numId w:val="26"/>
+        </w:numPr>
+      </w:pPr>
+      <w:r>
+        <w:t>Peak Demand Reporting</w:t>
+      </w:r>
+    </w:p>
+    <w:p>
+      <w:pPr>
+        <w:pStyle w:val="ListParagraph"/>
+        <w:numPr>
+          <w:ilvl w:val="0"/>
+          <w:numId w:val="26"/>
+        </w:numPr>
+      </w:pPr>
+      <w:r>
+        <w:t>Reservation Behavior Reporting</w:t>
+      </w:r>
+    </w:p>
+    <w:p>
+      <w:pPr>
+        <w:pStyle w:val="ListParagraph"/>
+        <w:numPr>
+          <w:ilvl w:val="0"/>
+          <w:numId w:val="26"/>
+        </w:numPr>
+      </w:pPr>
+      <w:r>
+        <w:t>Revenue Breakdown Reporting</w:t>
+      </w:r>
+    </w:p>
+    <w:p>
+      <w:pPr>
+        <w:pStyle w:val="ListParagraph"/>
+        <w:numPr>
+          <w:ilvl w:val="0"/>
+          <w:numId w:val="26"/>
+        </w:numPr>
+      </w:pPr>
+      <w:r>
+        <w:t>Regulatory/Audit Reporting</w:t>
+      </w:r>
+    </w:p>
+    <w:p>
+      <w:pPr>
+        <w:pStyle w:val="ListParagraph"/>
+        <w:numPr>
+          <w:ilvl w:val="0"/>
+          <w:numId w:val="26"/>
+        </w:numPr>
+      </w:pPr>
+      <w:r>
+        <w:t>Exportable Reports</w:t>
+      </w:r>
+    </w:p>
+    <w:p>
+      <w:pPr>
+        <w:pStyle w:val="ListParagraph"/>
+        <w:numPr>
+          <w:ilvl w:val="0"/>
+          <w:numId w:val="26"/>
+        </w:numPr>
+      </w:pPr>
+      <w:r>
+        <w:t>Driver Reservation History/Receipt Report</w:t>
+      </w:r>
+    </w:p>
+    <w:p>
+      <w:pPr>
+        <w:pStyle w:val="ListParagraph"/>
+        <w:numPr>
+          <w:ilvl w:val="0"/>
+          <w:numId w:val="26"/>
+        </w:numPr>
+      </w:pPr>
+      <w:r>
+        <w:t>Pricing &amp; Reporting Accuracy Validation</w:t>
+      </w:r>
+    </w:p>
+    <w:p>
+      <w:pPr>
+        <w:pStyle w:val="ListParagraph"/>
+        <w:numPr>
+          <w:ilvl w:val="0"/>
+          <w:numId w:val="26"/>
+        </w:numPr>
+      </w:pPr>
+      <w:r>
+        <w:t>Multi-Garage Comparison Reporting</w:t>
+      </w:r>
+    </w:p>
+    <w:p>
+      <w:pPr>
+        <w:pStyle w:val="ListParagraph"/>
+        <w:numPr>
+          <w:ilvl w:val="0"/>
+          <w:numId w:val="26"/>
+        </w:numPr>
+      </w:pPr>
+      <w:r>
+        <w:t>Demand Forecasting Reporting</w:t>
+      </w:r>
+    </w:p>
+    <w:p>
+      <w:pPr>
+        <w:pStyle w:val="ListParagraph"/>
+        <w:numPr>
+          <w:ilvl w:val="0"/>
+          <w:numId w:val="26"/>
+        </w:numPr>
+      </w:pPr>
+      <w:r>
+        <w:t>Refund/Cancellation Financial Impact Report</w:t>
+      </w:r>
+    </w:p>
+    <w:p/>
+    <w:p>
+      <w:pPr>
+        <w:pStyle w:val="Heading2"/>
+        <w:rPr>
+          <w:b/>
+          <w:bCs/>
+        </w:rPr>
+      </w:pPr>
+      <w:r>
+        <w:rPr>
+          <w:b/>
+          <w:bCs/>
+        </w:rPr>
+        <w:t>Sprint 1 Board</w:t>
+      </w:r>
+    </w:p>
+    <w:p>
+      <w:r>
+        <w:drawing>
+          <wp:inline distT="0" distB="0" distL="0" distR="0" wp14:anchorId="39467CB1" wp14:editId="2539D386">
+            <wp:extent cx="5943600" cy="2872740"/>
+            <wp:effectExtent l="0" t="0" r="0" b="3810"/>
+            <wp:docPr id="1797186463" name="Picture 1"/>
+            <wp:cNvGraphicFramePr>
+              <a:graphicFrameLocks xmlns:a="http://schemas.openxmlformats.org/drawingml/2006/main" noChangeAspect="1"/>
+            </wp:cNvGraphicFramePr>
+            <a:graphic xmlns:a="http://schemas.openxmlformats.org/drawingml/2006/main">
+              <a:graphicData uri="http://schemas.openxmlformats.org/drawingml/2006/picture">
+                <pic:pic xmlns:pic="http://schemas.openxmlformats.org/drawingml/2006/picture">
+                  <pic:nvPicPr>
+                    <pic:cNvPr id="1797186463" name=""/>
+                    <pic:cNvPicPr/>
+                  </pic:nvPicPr>
+                  <pic:blipFill>
+                    <a:blip r:embed="rId9"/>
+                    <a:stretch>
+                      <a:fillRect/>
+                    </a:stretch>
+                  </pic:blipFill>
+                  <pic:spPr>
+                    <a:xfrm>
+                      <a:off x="0" y="0"/>
+                      <a:ext cx="5943600" cy="2872740"/>
+                    </a:xfrm>
+                    <a:prstGeom prst="rect">
+                      <a:avLst/>
+                    </a:prstGeom>
+                  </pic:spPr>
+                </pic:pic>
+              </a:graphicData>
+            </a:graphic>
+          </wp:inline>
+        </w:drawing>
+      </w:r>
+    </w:p>
     <w:sectPr>
       <w:pgSz w:w="12240" w:h="15840"/>
       <w:pgMar w:top="1440" w:right="1440" w:bottom="1440" w:left="1440" w:header="720" w:footer="720" w:gutter="0"/>
@@ -6327,6 +7289,95 @@
     </w:lvl>
   </w:abstractNum>
   <w:abstractNum w:abstractNumId="19" w15:restartNumberingAfterBreak="0">
+    <w:nsid w:val="57BD252E"/>
+    <w:multiLevelType w:val="hybridMultilevel"/>
+    <w:tmpl w:val="EC087AE0"/>
+    <w:lvl w:ilvl="0" w:tplc="0409000F">
+      <w:start w:val="1"/>
+      <w:numFmt w:val="decimal"/>
+      <w:lvlText w:val="%1."/>
+      <w:lvlJc w:val="left"/>
+      <w:pPr>
+        <w:ind w:left="720" w:hanging="360"/>
+      </w:pPr>
+      <w:rPr>
+        <w:rFonts w:hint="default"/>
+      </w:rPr>
+    </w:lvl>
+    <w:lvl w:ilvl="1" w:tplc="04090019" w:tentative="1">
+      <w:start w:val="1"/>
+      <w:numFmt w:val="lowerLetter"/>
+      <w:lvlText w:val="%2."/>
+      <w:lvlJc w:val="left"/>
+      <w:pPr>
+        <w:ind w:left="1440" w:hanging="360"/>
+      </w:pPr>
+    </w:lvl>
+    <w:lvl w:ilvl="2" w:tplc="0409001B" w:tentative="1">
+      <w:start w:val="1"/>
+      <w:numFmt w:val="lowerRoman"/>
+      <w:lvlText w:val="%3."/>
+      <w:lvlJc w:val="right"/>
+      <w:pPr>
+        <w:ind w:left="2160" w:hanging="180"/>
+      </w:pPr>
+    </w:lvl>
+    <w:lvl w:ilvl="3" w:tplc="0409000F" w:tentative="1">
+      <w:start w:val="1"/>
+      <w:numFmt w:val="decimal"/>
+      <w:lvlText w:val="%4."/>
+      <w:lvlJc w:val="left"/>
+      <w:pPr>
+        <w:ind w:left="2880" w:hanging="360"/>
+      </w:pPr>
+    </w:lvl>
+    <w:lvl w:ilvl="4" w:tplc="04090019" w:tentative="1">
+      <w:start w:val="1"/>
+      <w:numFmt w:val="lowerLetter"/>
+      <w:lvlText w:val="%5."/>
+      <w:lvlJc w:val="left"/>
+      <w:pPr>
+        <w:ind w:left="3600" w:hanging="360"/>
+      </w:pPr>
+    </w:lvl>
+    <w:lvl w:ilvl="5" w:tplc="0409001B" w:tentative="1">
+      <w:start w:val="1"/>
+      <w:numFmt w:val="lowerRoman"/>
+      <w:lvlText w:val="%6."/>
+      <w:lvlJc w:val="right"/>
+      <w:pPr>
+        <w:ind w:left="4320" w:hanging="180"/>
+      </w:pPr>
+    </w:lvl>
+    <w:lvl w:ilvl="6" w:tplc="0409000F" w:tentative="1">
+      <w:start w:val="1"/>
+      <w:numFmt w:val="decimal"/>
+      <w:lvlText w:val="%7."/>
+      <w:lvlJc w:val="left"/>
+      <w:pPr>
+        <w:ind w:left="5040" w:hanging="360"/>
+      </w:pPr>
+    </w:lvl>
+    <w:lvl w:ilvl="7" w:tplc="04090019" w:tentative="1">
+      <w:start w:val="1"/>
+      <w:numFmt w:val="lowerLetter"/>
+      <w:lvlText w:val="%8."/>
+      <w:lvlJc w:val="left"/>
+      <w:pPr>
+        <w:ind w:left="5760" w:hanging="360"/>
+      </w:pPr>
+    </w:lvl>
+    <w:lvl w:ilvl="8" w:tplc="0409001B" w:tentative="1">
+      <w:start w:val="1"/>
+      <w:numFmt w:val="lowerRoman"/>
+      <w:lvlText w:val="%9."/>
+      <w:lvlJc w:val="right"/>
+      <w:pPr>
+        <w:ind w:left="6480" w:hanging="180"/>
+      </w:pPr>
+    </w:lvl>
+  </w:abstractNum>
+  <w:abstractNum w:abstractNumId="20" w15:restartNumberingAfterBreak="0">
     <w:nsid w:val="5A0B3075"/>
     <w:multiLevelType w:val="hybridMultilevel"/>
     <w:tmpl w:val="A6DCD23A"/>
@@ -6439,7 +7490,7 @@
       </w:rPr>
     </w:lvl>
   </w:abstractNum>
-  <w:abstractNum w:abstractNumId="20" w15:restartNumberingAfterBreak="0">
+  <w:abstractNum w:abstractNumId="21" w15:restartNumberingAfterBreak="0">
     <w:nsid w:val="5E761FA3"/>
     <w:multiLevelType w:val="hybridMultilevel"/>
     <w:tmpl w:val="DA7AF96C"/>
@@ -6528,7 +7579,7 @@
       </w:pPr>
     </w:lvl>
   </w:abstractNum>
-  <w:abstractNum w:abstractNumId="21" w15:restartNumberingAfterBreak="0">
+  <w:abstractNum w:abstractNumId="22" w15:restartNumberingAfterBreak="0">
     <w:nsid w:val="61827201"/>
     <w:multiLevelType w:val="hybridMultilevel"/>
     <w:tmpl w:val="CFAA42D4"/>
@@ -6617,7 +7668,7 @@
       </w:pPr>
     </w:lvl>
   </w:abstractNum>
-  <w:abstractNum w:abstractNumId="22" w15:restartNumberingAfterBreak="0">
+  <w:abstractNum w:abstractNumId="23" w15:restartNumberingAfterBreak="0">
     <w:nsid w:val="6B2D7D2E"/>
     <w:multiLevelType w:val="multilevel"/>
     <w:tmpl w:val="1F429998"/>
@@ -6730,7 +7781,7 @@
       </w:rPr>
     </w:lvl>
   </w:abstractNum>
-  <w:abstractNum w:abstractNumId="23" w15:restartNumberingAfterBreak="0">
+  <w:abstractNum w:abstractNumId="24" w15:restartNumberingAfterBreak="0">
     <w:nsid w:val="6B7531CF"/>
     <w:multiLevelType w:val="hybridMultilevel"/>
     <w:tmpl w:val="0C661E4E"/>
@@ -6843,7 +7894,7 @@
       </w:rPr>
     </w:lvl>
   </w:abstractNum>
-  <w:abstractNum w:abstractNumId="24" w15:restartNumberingAfterBreak="0">
+  <w:abstractNum w:abstractNumId="25" w15:restartNumberingAfterBreak="0">
     <w:nsid w:val="75B32A7A"/>
     <w:multiLevelType w:val="multilevel"/>
     <w:tmpl w:val="CA28FF00"/>
@@ -6965,10 +8016,10 @@
     </w:lvl>
   </w:abstractNum>
   <w:num w:numId="1" w16cid:durableId="1979450348">
-    <w:abstractNumId w:val="24"/>
+    <w:abstractNumId w:val="25"/>
   </w:num>
   <w:num w:numId="2" w16cid:durableId="1097408708">
-    <w:abstractNumId w:val="19"/>
+    <w:abstractNumId w:val="20"/>
   </w:num>
   <w:num w:numId="3" w16cid:durableId="2040886575">
     <w:abstractNumId w:val="18"/>
@@ -7022,22 +8073,25 @@
     <w:abstractNumId w:val="14"/>
   </w:num>
   <w:num w:numId="20" w16cid:durableId="2052874863">
-    <w:abstractNumId w:val="20"/>
+    <w:abstractNumId w:val="21"/>
   </w:num>
   <w:num w:numId="21" w16cid:durableId="61561100">
     <w:abstractNumId w:val="2"/>
   </w:num>
   <w:num w:numId="22" w16cid:durableId="841941311">
-    <w:abstractNumId w:val="21"/>
+    <w:abstractNumId w:val="22"/>
   </w:num>
   <w:num w:numId="23" w16cid:durableId="248199759">
     <w:abstractNumId w:val="1"/>
   </w:num>
   <w:num w:numId="24" w16cid:durableId="1670867755">
-    <w:abstractNumId w:val="22"/>
+    <w:abstractNumId w:val="23"/>
   </w:num>
   <w:num w:numId="25" w16cid:durableId="52317453">
-    <w:abstractNumId w:val="23"/>
+    <w:abstractNumId w:val="24"/>
+  </w:num>
+  <w:num w:numId="26" w16cid:durableId="1889028053">
+    <w:abstractNumId w:val="19"/>
   </w:num>
 </w:numbering>
 </file>
@@ -7644,7 +8698,6 @@
   <w:style w:type="character" w:default="1" w:styleId="DefaultParagraphFont">
     <w:name w:val="Default Paragraph Font"/>
     <w:uiPriority w:val="1"/>
-    <w:semiHidden/>
     <w:unhideWhenUsed/>
   </w:style>
   <w:style w:type="table" w:default="1" w:styleId="TableNormal">

</xml_diff>

<commit_message>
Finished Assignment 4, risk assessment and communication plan
</commit_message>
<xml_diff>
--- a/CIS4374 Semester Project Maximiliano Soto.docx
+++ b/CIS4374 Semester Project Maximiliano Soto.docx
@@ -4713,21 +4713,12 @@
     </w:p>
     <w:p>
       <w:r>
-        <w:t>Version: 1.</w:t>
-      </w:r>
-      <w:r>
-        <w:t>0</w:t>
-      </w:r>
-    </w:p>
-    <w:p>
-      <w:r>
-        <w:t>Date: 9/</w:t>
-      </w:r>
-      <w:r>
-        <w:t>24</w:t>
-      </w:r>
-      <w:r>
-        <w:t>/2026</w:t>
+        <w:t>Version: 1.0</w:t>
+      </w:r>
+    </w:p>
+    <w:p>
+      <w:r>
+        <w:t>Date: 9/24/2026</w:t>
       </w:r>
     </w:p>
     <w:p/>
@@ -5524,6 +5515,9 @@
     </w:p>
     <w:p>
       <w:r>
+        <w:rPr>
+          <w:noProof/>
+        </w:rPr>
         <w:drawing>
           <wp:inline distT="0" distB="0" distL="0" distR="0" wp14:anchorId="39467CB1" wp14:editId="2539D386">
             <wp:extent cx="5943600" cy="2872740"/>
@@ -5561,6 +5555,2986 @@
         </w:drawing>
       </w:r>
     </w:p>
+    <w:p/>
+    <w:p>
+      <w:r>
+        <w:br w:type="page"/>
+      </w:r>
+    </w:p>
+    <w:p>
+      <w:pPr>
+        <w:pStyle w:val="Heading1"/>
+        <w:rPr>
+          <w:b/>
+          <w:bCs/>
+          <w:sz w:val="48"/>
+          <w:szCs w:val="48"/>
+        </w:rPr>
+      </w:pPr>
+      <w:r>
+        <w:rPr>
+          <w:b/>
+          <w:bCs/>
+          <w:noProof/>
+        </w:rPr>
+        <w:lastRenderedPageBreak/>
+        <mc:AlternateContent>
+          <mc:Choice Requires="wps">
+            <w:drawing>
+              <wp:anchor distT="0" distB="0" distL="114300" distR="114300" simplePos="0" relativeHeight="251671552" behindDoc="0" locked="0" layoutInCell="1" allowOverlap="1" wp14:anchorId="5196613F" wp14:editId="111D8CC0">
+                <wp:simplePos x="0" y="0"/>
+                <wp:positionH relativeFrom="margin">
+                  <wp:align>center</wp:align>
+                </wp:positionH>
+                <wp:positionV relativeFrom="paragraph">
+                  <wp:posOffset>361950</wp:posOffset>
+                </wp:positionV>
+                <wp:extent cx="6286500" cy="9525"/>
+                <wp:effectExtent l="0" t="0" r="19050" b="28575"/>
+                <wp:wrapNone/>
+                <wp:docPr id="1578455267" name="Straight Connector 1578455267"/>
+                <wp:cNvGraphicFramePr/>
+                <a:graphic xmlns:a="http://schemas.openxmlformats.org/drawingml/2006/main">
+                  <a:graphicData uri="http://schemas.microsoft.com/office/word/2010/wordprocessingShape">
+                    <wps:wsp>
+                      <wps:cNvCnPr/>
+                      <wps:spPr>
+                        <a:xfrm>
+                          <a:off x="0" y="0"/>
+                          <a:ext cx="6286500" cy="9525"/>
+                        </a:xfrm>
+                        <a:prstGeom prst="line">
+                          <a:avLst/>
+                        </a:prstGeom>
+                      </wps:spPr>
+                      <wps:style>
+                        <a:lnRef idx="1">
+                          <a:schemeClr val="accent1"/>
+                        </a:lnRef>
+                        <a:fillRef idx="0">
+                          <a:schemeClr val="accent1"/>
+                        </a:fillRef>
+                        <a:effectRef idx="0">
+                          <a:schemeClr val="accent1"/>
+                        </a:effectRef>
+                        <a:fontRef idx="minor">
+                          <a:schemeClr val="tx1"/>
+                        </a:fontRef>
+                      </wps:style>
+                      <wps:bodyPr/>
+                    </wps:wsp>
+                  </a:graphicData>
+                </a:graphic>
+              </wp:anchor>
+            </w:drawing>
+          </mc:Choice>
+          <mc:Fallback>
+            <w:pict>
+              <v:line w14:anchorId="7B32F8DA" id="Straight Connector 1578455267" o:spid="_x0000_s1026" style="position:absolute;z-index:251671552;visibility:visible;mso-wrap-style:square;mso-wrap-distance-left:9pt;mso-wrap-distance-top:0;mso-wrap-distance-right:9pt;mso-wrap-distance-bottom:0;mso-position-horizontal:center;mso-position-horizontal-relative:margin;mso-position-vertical:absolute;mso-position-vertical-relative:text" from="0,28.5pt" to="495pt,29.25pt" o:gfxdata="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" strokecolor="#156082 [3204]" strokeweight=".5pt">
+                <v:stroke joinstyle="miter"/>
+                <w10:wrap anchorx="margin"/>
+              </v:line>
+            </w:pict>
+          </mc:Fallback>
+        </mc:AlternateContent>
+      </w:r>
+      <w:r>
+        <w:rPr>
+          <w:b/>
+          <w:bCs/>
+          <w:sz w:val="48"/>
+          <w:szCs w:val="48"/>
+        </w:rPr>
+        <w:t>Risk Management</w:t>
+      </w:r>
+    </w:p>
+    <w:p>
+      <w:pPr>
+        <w:pStyle w:val="Heading3"/>
+      </w:pPr>
+      <w:r>
+        <w:t>Risk Identification:</w:t>
+      </w:r>
+    </w:p>
+    <w:p>
+      <w:r>
+        <w:t>Technical Risks:</w:t>
+      </w:r>
+    </w:p>
+    <w:p>
+      <w:pPr>
+        <w:pStyle w:val="ListParagraph"/>
+        <w:numPr>
+          <w:ilvl w:val="0"/>
+          <w:numId w:val="27"/>
+        </w:numPr>
+      </w:pPr>
+      <w:r>
+        <w:t>Sensor/Gate Hardware Integration Failure</w:t>
+      </w:r>
+    </w:p>
+    <w:p>
+      <w:pPr>
+        <w:pStyle w:val="ListParagraph"/>
+        <w:numPr>
+          <w:ilvl w:val="0"/>
+          <w:numId w:val="27"/>
+        </w:numPr>
+      </w:pPr>
+      <w:r>
+        <w:t>Payment Gateway Security Vulnerability</w:t>
+      </w:r>
+    </w:p>
+    <w:p>
+      <w:pPr>
+        <w:pStyle w:val="ListParagraph"/>
+        <w:numPr>
+          <w:ilvl w:val="0"/>
+          <w:numId w:val="27"/>
+        </w:numPr>
+      </w:pPr>
+      <w:r>
+        <w:t>System Performance</w:t>
+      </w:r>
+      <w:r>
+        <w:t xml:space="preserve"> Failure</w:t>
+      </w:r>
+      <w:r>
+        <w:t xml:space="preserve"> Under Load</w:t>
+      </w:r>
+    </w:p>
+    <w:p>
+      <w:pPr>
+        <w:pStyle w:val="ListParagraph"/>
+        <w:numPr>
+          <w:ilvl w:val="0"/>
+          <w:numId w:val="27"/>
+        </w:numPr>
+      </w:pPr>
+      <w:r>
+        <w:t>Role-Based Access Control Failure</w:t>
+      </w:r>
+    </w:p>
+    <w:p>
+      <w:pPr>
+        <w:pStyle w:val="ListParagraph"/>
+        <w:numPr>
+          <w:ilvl w:val="0"/>
+          <w:numId w:val="27"/>
+        </w:numPr>
+      </w:pPr>
+      <w:r>
+        <w:t>Database &amp; Third-Party API Failures</w:t>
+      </w:r>
+    </w:p>
+    <w:p>
+      <w:r>
+        <w:t>Schedule Risks:</w:t>
+      </w:r>
+    </w:p>
+    <w:p>
+      <w:pPr>
+        <w:pStyle w:val="ListParagraph"/>
+        <w:numPr>
+          <w:ilvl w:val="0"/>
+          <w:numId w:val="27"/>
+        </w:numPr>
+      </w:pPr>
+      <w:r>
+        <w:t>Semester Long Timeline</w:t>
+      </w:r>
+      <w:r>
+        <w:t xml:space="preserve"> and Loaded Schedule</w:t>
+      </w:r>
+      <w:r>
+        <w:t xml:space="preserve"> Leaves Little Slack</w:t>
+      </w:r>
+    </w:p>
+    <w:p>
+      <w:pPr>
+        <w:pStyle w:val="ListParagraph"/>
+        <w:numPr>
+          <w:ilvl w:val="0"/>
+          <w:numId w:val="27"/>
+        </w:numPr>
+      </w:pPr>
+      <w:r>
+        <w:t>Time Estimates Could Be Overly Optimistic</w:t>
+      </w:r>
+    </w:p>
+    <w:p>
+      <w:pPr>
+        <w:pStyle w:val="ListParagraph"/>
+        <w:numPr>
+          <w:ilvl w:val="0"/>
+          <w:numId w:val="27"/>
+        </w:numPr>
+      </w:pPr>
+      <w:r>
+        <w:t>Scope Creep Threatens Timeline Target with Already Loaded Schedule</w:t>
+      </w:r>
+    </w:p>
+    <w:p>
+      <w:pPr>
+        <w:pStyle w:val="ListParagraph"/>
+        <w:numPr>
+          <w:ilvl w:val="0"/>
+          <w:numId w:val="27"/>
+        </w:numPr>
+      </w:pPr>
+      <w:r>
+        <w:t>Third-Party Service Timelines Are Outside Our Control and Could Take Longer Than Expected</w:t>
+      </w:r>
+    </w:p>
+    <w:p>
+      <w:pPr>
+        <w:pStyle w:val="ListParagraph"/>
+        <w:numPr>
+          <w:ilvl w:val="0"/>
+          <w:numId w:val="27"/>
+        </w:numPr>
+      </w:pPr>
+      <w:r>
+        <w:t>Project Team</w:t>
+      </w:r>
+      <w:r>
+        <w:t xml:space="preserve"> </w:t>
+      </w:r>
+      <w:r>
+        <w:t>Members’</w:t>
+      </w:r>
+      <w:r>
+        <w:t xml:space="preserve"> Availability Could Possibly Not Match </w:t>
+      </w:r>
+      <w:r>
+        <w:t>with the Project Schedule</w:t>
+      </w:r>
+    </w:p>
+    <w:p>
+      <w:r>
+        <w:t>Financial Risks:</w:t>
+      </w:r>
+    </w:p>
+    <w:p>
+      <w:pPr>
+        <w:pStyle w:val="ListParagraph"/>
+        <w:numPr>
+          <w:ilvl w:val="0"/>
+          <w:numId w:val="27"/>
+        </w:numPr>
+      </w:pPr>
+      <w:r>
+        <w:t>Variable Third-Party Service Costs</w:t>
+      </w:r>
+    </w:p>
+    <w:p>
+      <w:pPr>
+        <w:pStyle w:val="ListParagraph"/>
+        <w:numPr>
+          <w:ilvl w:val="0"/>
+          <w:numId w:val="27"/>
+        </w:numPr>
+      </w:pPr>
+      <w:r>
+        <w:t>Costs May Vary Across Jurisdiction Due to Regulatory Compliance</w:t>
+      </w:r>
+    </w:p>
+    <w:p>
+      <w:pPr>
+        <w:pStyle w:val="ListParagraph"/>
+        <w:numPr>
+          <w:ilvl w:val="0"/>
+          <w:numId w:val="27"/>
+        </w:numPr>
+      </w:pPr>
+      <w:r>
+        <w:t>Data Breaches Could Lead to Financial Exposure</w:t>
+      </w:r>
+    </w:p>
+    <w:p>
+      <w:pPr>
+        <w:pStyle w:val="ListParagraph"/>
+        <w:numPr>
+          <w:ilvl w:val="0"/>
+          <w:numId w:val="27"/>
+        </w:numPr>
+      </w:pPr>
+      <w:r>
+        <w:t>Technical Debt Could Result in Expensive Fixes Later in the Project.</w:t>
+      </w:r>
+    </w:p>
+    <w:p>
+      <w:pPr>
+        <w:pStyle w:val="ListParagraph"/>
+        <w:numPr>
+          <w:ilvl w:val="0"/>
+          <w:numId w:val="27"/>
+        </w:numPr>
+      </w:pPr>
+      <w:r>
+        <w:t>Legal and Security Failures Could Lead to Legal Fines or Expensive Emergency Fixes.</w:t>
+      </w:r>
+    </w:p>
+    <w:p>
+      <w:r>
+        <w:t>People Risks:</w:t>
+      </w:r>
+    </w:p>
+    <w:p>
+      <w:pPr>
+        <w:pStyle w:val="ListParagraph"/>
+        <w:numPr>
+          <w:ilvl w:val="0"/>
+          <w:numId w:val="27"/>
+        </w:numPr>
+      </w:pPr>
+      <w:r>
+        <w:t>Skill Shortage &amp; Gaps Could Lead to Poor System Quality or Delays</w:t>
+      </w:r>
+    </w:p>
+    <w:p>
+      <w:pPr>
+        <w:pStyle w:val="ListParagraph"/>
+        <w:numPr>
+          <w:ilvl w:val="0"/>
+          <w:numId w:val="27"/>
+        </w:numPr>
+      </w:pPr>
+      <w:r>
+        <w:t>Communication Could Easily Become Out of Sync Due to Heavy Task Parallelization</w:t>
+      </w:r>
+    </w:p>
+    <w:p>
+      <w:pPr>
+        <w:pStyle w:val="ListParagraph"/>
+        <w:numPr>
+          <w:ilvl w:val="0"/>
+          <w:numId w:val="27"/>
+        </w:numPr>
+      </w:pPr>
+      <w:r>
+        <w:t>Lack of Stakeholder Engagement Could Lead to a System That Doesn’t Meet Business Requirements</w:t>
+      </w:r>
+    </w:p>
+    <w:p>
+      <w:pPr>
+        <w:pStyle w:val="ListParagraph"/>
+        <w:numPr>
+          <w:ilvl w:val="0"/>
+          <w:numId w:val="27"/>
+        </w:numPr>
+      </w:pPr>
+      <w:r>
+        <w:t xml:space="preserve">Staff Quitting Could Lead to Delays, Knowledge Gaps, and Tension in the Team </w:t>
+      </w:r>
+    </w:p>
+    <w:p>
+      <w:pPr>
+        <w:pStyle w:val="ListParagraph"/>
+        <w:numPr>
+          <w:ilvl w:val="0"/>
+          <w:numId w:val="27"/>
+        </w:numPr>
+      </w:pPr>
+      <w:r>
+        <w:t xml:space="preserve">Some Teams Such as the QA Team Could Experience Burnout </w:t>
+      </w:r>
+      <w:r>
+        <w:t>from</w:t>
+      </w:r>
+      <w:r>
+        <w:t xml:space="preserve"> Being Allocated Too Many Tasks Throughout the Project</w:t>
+      </w:r>
+    </w:p>
+    <w:p>
+      <w:r>
+        <w:br w:type="page"/>
+      </w:r>
+    </w:p>
+    <w:p>
+      <w:pPr>
+        <w:pStyle w:val="Heading3"/>
+      </w:pPr>
+      <w:r>
+        <w:lastRenderedPageBreak/>
+        <w:t>Risk Registration:</w:t>
+      </w:r>
+    </w:p>
+    <w:tbl>
+      <w:tblPr>
+        <w:tblStyle w:val="TableGrid"/>
+        <w:tblW w:w="0" w:type="auto"/>
+        <w:tblLook w:val="04A0" w:firstRow="1" w:lastRow="0" w:firstColumn="1" w:lastColumn="0" w:noHBand="0" w:noVBand="1"/>
+      </w:tblPr>
+      <w:tblGrid>
+        <w:gridCol w:w="581"/>
+        <w:gridCol w:w="1800"/>
+        <w:gridCol w:w="1136"/>
+        <w:gridCol w:w="826"/>
+        <w:gridCol w:w="1800"/>
+        <w:gridCol w:w="1779"/>
+        <w:gridCol w:w="1428"/>
+      </w:tblGrid>
+      <w:tr>
+        <w:tc>
+          <w:tcPr>
+            <w:tcW w:w="581" w:type="dxa"/>
+          </w:tcPr>
+          <w:p>
+            <w:r>
+              <w:t>Risk ID</w:t>
+            </w:r>
+          </w:p>
+        </w:tc>
+        <w:tc>
+          <w:tcPr>
+            <w:tcW w:w="1800" w:type="dxa"/>
+          </w:tcPr>
+          <w:p>
+            <w:r>
+              <w:t>Description</w:t>
+            </w:r>
+          </w:p>
+        </w:tc>
+        <w:tc>
+          <w:tcPr>
+            <w:tcW w:w="1136" w:type="dxa"/>
+          </w:tcPr>
+          <w:p>
+            <w:r>
+              <w:t>Probability</w:t>
+            </w:r>
+          </w:p>
+        </w:tc>
+        <w:tc>
+          <w:tcPr>
+            <w:tcW w:w="826" w:type="dxa"/>
+          </w:tcPr>
+          <w:p>
+            <w:r>
+              <w:t>Impact</w:t>
+            </w:r>
+          </w:p>
+        </w:tc>
+        <w:tc>
+          <w:tcPr>
+            <w:tcW w:w="1800" w:type="dxa"/>
+          </w:tcPr>
+          <w:p>
+            <w:r>
+              <w:t>Owner</w:t>
+            </w:r>
+          </w:p>
+        </w:tc>
+        <w:tc>
+          <w:tcPr>
+            <w:tcW w:w="1779" w:type="dxa"/>
+          </w:tcPr>
+          <w:p>
+            <w:r>
+              <w:t>Response Strategy</w:t>
+            </w:r>
+          </w:p>
+        </w:tc>
+        <w:tc>
+          <w:tcPr>
+            <w:tcW w:w="1428" w:type="dxa"/>
+          </w:tcPr>
+          <w:p>
+            <w:r>
+              <w:t>Status/Notes</w:t>
+            </w:r>
+          </w:p>
+        </w:tc>
+      </w:tr>
+      <w:tr>
+        <w:tc>
+          <w:tcPr>
+            <w:tcW w:w="581" w:type="dxa"/>
+          </w:tcPr>
+          <w:p>
+            <w:r>
+              <w:t>1</w:t>
+            </w:r>
+          </w:p>
+        </w:tc>
+        <w:tc>
+          <w:tcPr>
+            <w:tcW w:w="1800" w:type="dxa"/>
+          </w:tcPr>
+          <w:p>
+            <w:r>
+              <w:t xml:space="preserve">Garage sensor/gate hardware </w:t>
+            </w:r>
+            <w:r>
+              <w:t>integration may fail or return inaccurate occupancy data, which can degrade real-time availability accuracy for drivers.</w:t>
+            </w:r>
+          </w:p>
+        </w:tc>
+        <w:tc>
+          <w:tcPr>
+            <w:tcW w:w="1136" w:type="dxa"/>
+          </w:tcPr>
+          <w:p>
+            <w:r>
+              <w:t>3</w:t>
+            </w:r>
+          </w:p>
+        </w:tc>
+        <w:tc>
+          <w:tcPr>
+            <w:tcW w:w="826" w:type="dxa"/>
+          </w:tcPr>
+          <w:p>
+            <w:r>
+              <w:t>3</w:t>
+            </w:r>
+          </w:p>
+        </w:tc>
+        <w:tc>
+          <w:tcPr>
+            <w:tcW w:w="1800" w:type="dxa"/>
+          </w:tcPr>
+          <w:p>
+            <w:r>
+              <w:t>Operator Team</w:t>
+            </w:r>
+          </w:p>
+        </w:tc>
+        <w:tc>
+          <w:tcPr>
+            <w:tcW w:w="1779" w:type="dxa"/>
+          </w:tcPr>
+          <w:p>
+            <w:r>
+              <w:t>Maintain manual occupancy update fallback (WBS 2.2.3) as a backup for any garage who has unreliable hardware.</w:t>
+            </w:r>
+          </w:p>
+        </w:tc>
+        <w:tc>
+          <w:tcPr>
+            <w:tcW w:w="1428" w:type="dxa"/>
+          </w:tcPr>
+          <w:p>
+            <w:r>
+              <w:t>Fallback already to be implemented, just needs to be maintained when the app releases.</w:t>
+            </w:r>
+          </w:p>
+        </w:tc>
+      </w:tr>
+      <w:tr>
+        <w:tc>
+          <w:tcPr>
+            <w:tcW w:w="581" w:type="dxa"/>
+          </w:tcPr>
+          <w:p>
+            <w:r>
+              <w:t>2</w:t>
+            </w:r>
+          </w:p>
+        </w:tc>
+        <w:tc>
+          <w:tcPr>
+            <w:tcW w:w="1800" w:type="dxa"/>
+          </w:tcPr>
+          <w:p>
+            <w:r>
+              <w:t>A flaw with the payment gateway integration could expose cardholder data or transaction details, which could result in a PCI-DSS compliance violation.</w:t>
+            </w:r>
+          </w:p>
+        </w:tc>
+        <w:tc>
+          <w:tcPr>
+            <w:tcW w:w="1136" w:type="dxa"/>
+          </w:tcPr>
+          <w:p>
+            <w:r>
+              <w:t>2</w:t>
+            </w:r>
+          </w:p>
+        </w:tc>
+        <w:tc>
+          <w:tcPr>
+            <w:tcW w:w="826" w:type="dxa"/>
+          </w:tcPr>
+          <w:p>
+            <w:r>
+              <w:t>5</w:t>
+            </w:r>
+          </w:p>
+        </w:tc>
+        <w:tc>
+          <w:tcPr>
+            <w:tcW w:w="1800" w:type="dxa"/>
+          </w:tcPr>
+          <w:p>
+            <w:r>
+              <w:t>Security Team</w:t>
+            </w:r>
+          </w:p>
+        </w:tc>
+        <w:tc>
+          <w:tcPr>
+            <w:tcW w:w="1779" w:type="dxa"/>
+          </w:tcPr>
+          <w:p>
+            <w:r>
+              <w:t>Use a PCI-DSS compliant gateway provider that’s well-established and conduct penetration testing when developing payment functions.</w:t>
+            </w:r>
+          </w:p>
+        </w:tc>
+        <w:tc>
+          <w:tcPr>
+            <w:tcW w:w="1428" w:type="dxa"/>
+          </w:tcPr>
+          <w:p>
+            <w:r>
+              <w:t>Highest impact technical risk</w:t>
+            </w:r>
+          </w:p>
+        </w:tc>
+      </w:tr>
+      <w:tr>
+        <w:tc>
+          <w:tcPr>
+            <w:tcW w:w="581" w:type="dxa"/>
+          </w:tcPr>
+          <w:p>
+            <w:r>
+              <w:t>3</w:t>
+            </w:r>
+          </w:p>
+        </w:tc>
+        <w:tc>
+          <w:tcPr>
+            <w:tcW w:w="1800" w:type="dxa"/>
+          </w:tcPr>
+          <w:p>
+            <w:r>
+              <w:t>If backend infrastructure doesn’t scale as designed, the system could slow or fail under high loads</w:t>
+            </w:r>
+          </w:p>
+        </w:tc>
+        <w:tc>
+          <w:tcPr>
+            <w:tcW w:w="1136" w:type="dxa"/>
+          </w:tcPr>
+          <w:p>
+            <w:r>
+              <w:t>3</w:t>
+            </w:r>
+          </w:p>
+        </w:tc>
+        <w:tc>
+          <w:tcPr>
+            <w:tcW w:w="826" w:type="dxa"/>
+          </w:tcPr>
+          <w:p>
+            <w:r>
+              <w:t>4</w:t>
+            </w:r>
+          </w:p>
+        </w:tc>
+        <w:tc>
+          <w:tcPr>
+            <w:tcW w:w="1800" w:type="dxa"/>
+          </w:tcPr>
+          <w:p>
+            <w:r>
+              <w:t>QA Team &amp; DevOps</w:t>
+            </w:r>
+          </w:p>
+        </w:tc>
+        <w:tc>
+          <w:tcPr>
+            <w:tcW w:w="1779" w:type="dxa"/>
+          </w:tcPr>
+          <w:p>
+            <w:r>
+              <w:t xml:space="preserve">Conduct performance/load testing (WBS 3.7.3) </w:t>
+            </w:r>
+            <w:r>
+              <w:t>against an estimated peak number of concurrent users before launch.</w:t>
+            </w:r>
+          </w:p>
+        </w:tc>
+        <w:tc>
+          <w:tcPr>
+            <w:tcW w:w="1428" w:type="dxa"/>
+          </w:tcPr>
+          <w:p>
+            <w:r>
+              <w:t>Response strategy is already accounted for in WBS.</w:t>
+            </w:r>
+          </w:p>
+        </w:tc>
+      </w:tr>
+      <w:tr>
+        <w:tc>
+          <w:tcPr>
+            <w:tcW w:w="581" w:type="dxa"/>
+          </w:tcPr>
+          <w:p>
+            <w:r>
+              <w:t>4</w:t>
+            </w:r>
+          </w:p>
+        </w:tc>
+        <w:tc>
+          <w:tcPr>
+            <w:tcW w:w="1800" w:type="dxa"/>
+          </w:tcPr>
+          <w:p>
+            <w:r>
+              <w:t xml:space="preserve">A defect in role-based </w:t>
+            </w:r>
+            <w:r>
+              <w:lastRenderedPageBreak/>
+              <w:t>access control could allow a user to access data outside their assigned role, which could be catastrophic for operators.</w:t>
+            </w:r>
+          </w:p>
+        </w:tc>
+        <w:tc>
+          <w:tcPr>
+            <w:tcW w:w="1136" w:type="dxa"/>
+          </w:tcPr>
+          <w:p>
+            <w:r>
+              <w:lastRenderedPageBreak/>
+              <w:t>2</w:t>
+            </w:r>
+          </w:p>
+        </w:tc>
+        <w:tc>
+          <w:tcPr>
+            <w:tcW w:w="826" w:type="dxa"/>
+          </w:tcPr>
+          <w:p>
+            <w:r>
+              <w:t>5</w:t>
+            </w:r>
+          </w:p>
+        </w:tc>
+        <w:tc>
+          <w:tcPr>
+            <w:tcW w:w="1800" w:type="dxa"/>
+          </w:tcPr>
+          <w:p>
+            <w:r>
+              <w:t>Security Team</w:t>
+            </w:r>
+          </w:p>
+        </w:tc>
+        <w:tc>
+          <w:tcPr>
+            <w:tcW w:w="1779" w:type="dxa"/>
+          </w:tcPr>
+          <w:p>
+            <w:r>
+              <w:t xml:space="preserve">Enforce RBAC at the backend </w:t>
+            </w:r>
+            <w:r>
+              <w:lastRenderedPageBreak/>
+              <w:t>level instead of just in the UI. Also conduct testing during RBAC implementation and development.</w:t>
+            </w:r>
+          </w:p>
+        </w:tc>
+        <w:tc>
+          <w:tcPr>
+            <w:tcW w:w="1428" w:type="dxa"/>
+          </w:tcPr>
+          <w:p>
+            <w:r>
+              <w:lastRenderedPageBreak/>
+              <w:t xml:space="preserve">RBAC gates nearly all </w:t>
+            </w:r>
+            <w:r>
+              <w:lastRenderedPageBreak/>
+              <w:t>downstream features.</w:t>
+            </w:r>
+          </w:p>
+        </w:tc>
+      </w:tr>
+      <w:tr>
+        <w:tc>
+          <w:tcPr>
+            <w:tcW w:w="581" w:type="dxa"/>
+          </w:tcPr>
+          <w:p>
+            <w:r>
+              <w:lastRenderedPageBreak/>
+              <w:t>5</w:t>
+            </w:r>
+          </w:p>
+        </w:tc>
+        <w:tc>
+          <w:tcPr>
+            <w:tcW w:w="1800" w:type="dxa"/>
+          </w:tcPr>
+          <w:p>
+            <w:r>
+              <w:t>Failures or outages in the database or third-party APIs could disrupt core functionality the app depends on.</w:t>
+            </w:r>
+          </w:p>
+        </w:tc>
+        <w:tc>
+          <w:tcPr>
+            <w:tcW w:w="1136" w:type="dxa"/>
+          </w:tcPr>
+          <w:p>
+            <w:r>
+              <w:t>3</w:t>
+            </w:r>
+          </w:p>
+        </w:tc>
+        <w:tc>
+          <w:tcPr>
+            <w:tcW w:w="826" w:type="dxa"/>
+          </w:tcPr>
+          <w:p>
+            <w:r>
+              <w:t>3</w:t>
+            </w:r>
+          </w:p>
+        </w:tc>
+        <w:tc>
+          <w:tcPr>
+            <w:tcW w:w="1800" w:type="dxa"/>
+          </w:tcPr>
+          <w:p>
+            <w:r>
+              <w:t>Architecture Team</w:t>
+            </w:r>
+          </w:p>
+        </w:tc>
+        <w:tc>
+          <w:tcPr>
+            <w:tcW w:w="1779" w:type="dxa"/>
+          </w:tcPr>
+          <w:p>
+            <w:r>
+              <w:t>Implement retry logic and maintain regular database backups and a documented recovery procedure.</w:t>
+            </w:r>
+          </w:p>
+        </w:tc>
+        <w:tc>
+          <w:tcPr>
+            <w:tcW w:w="1428" w:type="dxa"/>
+          </w:tcPr>
+          <w:p>
+            <w:r>
+              <w:t>If more granularity is needed, splitting database outage and API outage risks into separate risks is possible, they generally fall under the same category of risk though.</w:t>
+            </w:r>
+          </w:p>
+        </w:tc>
+      </w:tr>
+      <w:tr>
+        <w:tc>
+          <w:tcPr>
+            <w:tcW w:w="581" w:type="dxa"/>
+          </w:tcPr>
+          <w:p>
+            <w:r>
+              <w:t>6</w:t>
+            </w:r>
+          </w:p>
+        </w:tc>
+        <w:tc>
+          <w:tcPr>
+            <w:tcW w:w="1800" w:type="dxa"/>
+          </w:tcPr>
+          <w:p>
+            <w:r>
+              <w:t xml:space="preserve">The semester-long timeline is already tightly loaded as shown by the Gantt chart, which leaves little slack </w:t>
+            </w:r>
+            <w:r>
+              <w:t>for any delays.</w:t>
+            </w:r>
+          </w:p>
+        </w:tc>
+        <w:tc>
+          <w:tcPr>
+            <w:tcW w:w="1136" w:type="dxa"/>
+          </w:tcPr>
+          <w:p>
+            <w:r>
+              <w:t>4</w:t>
+            </w:r>
+          </w:p>
+        </w:tc>
+        <w:tc>
+          <w:tcPr>
+            <w:tcW w:w="826" w:type="dxa"/>
+          </w:tcPr>
+          <w:p>
+            <w:r>
+              <w:t>4</w:t>
+            </w:r>
+          </w:p>
+        </w:tc>
+        <w:tc>
+          <w:tcPr>
+            <w:tcW w:w="1800" w:type="dxa"/>
+          </w:tcPr>
+          <w:p>
+            <w:r>
+              <w:t>Project Manager</w:t>
+            </w:r>
+          </w:p>
+        </w:tc>
+        <w:tc>
+          <w:tcPr>
+            <w:tcW w:w="1779" w:type="dxa"/>
+          </w:tcPr>
+          <w:p>
+            <w:r>
+              <w:t xml:space="preserve">Track schedule variance </w:t>
+            </w:r>
+            <w:r>
+              <w:t>across sprints and escalate immediately if any task stops other tasks from starting, since delays in those can cascade broadly.</w:t>
+            </w:r>
+          </w:p>
+        </w:tc>
+        <w:tc>
+          <w:tcPr>
+            <w:tcW w:w="1428" w:type="dxa"/>
+          </w:tcPr>
+          <w:p>
+            <w:r>
+              <w:t>Given that the Gantt chart had to be compressed multiple times to fit the timeline requirement, this has a high likelihood to occur and must be prioritized.</w:t>
+            </w:r>
+          </w:p>
+        </w:tc>
+      </w:tr>
+      <w:tr>
+        <w:tc>
+          <w:tcPr>
+            <w:tcW w:w="581" w:type="dxa"/>
+          </w:tcPr>
+          <w:p>
+            <w:r>
+              <w:lastRenderedPageBreak/>
+              <w:t>7</w:t>
+            </w:r>
+          </w:p>
+        </w:tc>
+        <w:tc>
+          <w:tcPr>
+            <w:tcW w:w="1800" w:type="dxa"/>
+          </w:tcPr>
+          <w:p>
+            <w:r>
+              <w:t xml:space="preserve">Sprint-level time estimates could prove to be overly optimistic once real development begins. </w:t>
+            </w:r>
+          </w:p>
+        </w:tc>
+        <w:tc>
+          <w:tcPr>
+            <w:tcW w:w="1136" w:type="dxa"/>
+          </w:tcPr>
+          <w:p>
+            <w:r>
+              <w:t>4</w:t>
+            </w:r>
+          </w:p>
+        </w:tc>
+        <w:tc>
+          <w:tcPr>
+            <w:tcW w:w="826" w:type="dxa"/>
+          </w:tcPr>
+          <w:p>
+            <w:r>
+              <w:t>3</w:t>
+            </w:r>
+          </w:p>
+        </w:tc>
+        <w:tc>
+          <w:tcPr>
+            <w:tcW w:w="1800" w:type="dxa"/>
+          </w:tcPr>
+          <w:p>
+            <w:r>
+              <w:t>Project Manager</w:t>
+            </w:r>
+          </w:p>
+        </w:tc>
+        <w:tc>
+          <w:tcPr>
+            <w:tcW w:w="1779" w:type="dxa"/>
+          </w:tcPr>
+          <w:p>
+            <w:r>
+              <w:t>Might be possible to revisit estimates after Sprint 1 after using actual velocity data. From there, later sprints can be adjusted accordingly.</w:t>
+            </w:r>
+          </w:p>
+        </w:tc>
+        <w:tc>
+          <w:tcPr>
+            <w:tcW w:w="1428" w:type="dxa"/>
+          </w:tcPr>
+          <w:p>
+            <w:r>
+              <w:t>No velocity history exists yet, so the first sprint will have to occur to mitigate this risk.</w:t>
+            </w:r>
+          </w:p>
+        </w:tc>
+      </w:tr>
+      <w:tr>
+        <w:tc>
+          <w:tcPr>
+            <w:tcW w:w="581" w:type="dxa"/>
+          </w:tcPr>
+          <w:p>
+            <w:r>
+              <w:t>8</w:t>
+            </w:r>
+          </w:p>
+        </w:tc>
+        <w:tc>
+          <w:tcPr>
+            <w:tcW w:w="1800" w:type="dxa"/>
+          </w:tcPr>
+          <w:p>
+            <w:r>
+              <w:t>New</w:t>
+            </w:r>
+            <w:r>
+              <w:t xml:space="preserve"> additions </w:t>
+            </w:r>
+            <w:r>
+              <w:t xml:space="preserve">to scope </w:t>
+            </w:r>
+            <w:r>
+              <w:t>could continue to be introduced</w:t>
+            </w:r>
+            <w:r>
+              <w:t xml:space="preserve"> during planning and development, which could threaten the timeline target.</w:t>
+            </w:r>
+          </w:p>
+        </w:tc>
+        <w:tc>
+          <w:tcPr>
+            <w:tcW w:w="1136" w:type="dxa"/>
+          </w:tcPr>
+          <w:p>
+            <w:r>
+              <w:t>4</w:t>
+            </w:r>
+          </w:p>
+        </w:tc>
+        <w:tc>
+          <w:tcPr>
+            <w:tcW w:w="826" w:type="dxa"/>
+          </w:tcPr>
+          <w:p>
+            <w:r>
+              <w:t>3</w:t>
+            </w:r>
+          </w:p>
+        </w:tc>
+        <w:tc>
+          <w:tcPr>
+            <w:tcW w:w="1800" w:type="dxa"/>
+          </w:tcPr>
+          <w:p>
+            <w:r>
+              <w:t>Project Manager</w:t>
+            </w:r>
+          </w:p>
+        </w:tc>
+        <w:tc>
+          <w:tcPr>
+            <w:tcW w:w="1779" w:type="dxa"/>
+          </w:tcPr>
+          <w:p>
+            <w:r>
+              <w:t>Route all new scope requests through a change-control step (maybe introduced as its own task or section of the project) before altering the WBS or schedule.</w:t>
+            </w:r>
+          </w:p>
+        </w:tc>
+        <w:tc>
+          <w:tcPr>
+            <w:tcW w:w="1428" w:type="dxa"/>
+          </w:tcPr>
+          <w:p>
+            <w:r>
+              <w:t xml:space="preserve">Has already occurred before when developing the WBS. </w:t>
+            </w:r>
+          </w:p>
+        </w:tc>
+      </w:tr>
+      <w:tr>
+        <w:tc>
+          <w:tcPr>
+            <w:tcW w:w="581" w:type="dxa"/>
+          </w:tcPr>
+          <w:p>
+            <w:r>
+              <w:t>9</w:t>
+            </w:r>
+          </w:p>
+        </w:tc>
+        <w:tc>
+          <w:tcPr>
+            <w:tcW w:w="1800" w:type="dxa"/>
+          </w:tcPr>
+          <w:p>
+            <w:r>
+              <w:t xml:space="preserve">Third-party services such as App Store and Play Store </w:t>
+            </w:r>
+            <w:r>
+              <w:t xml:space="preserve">have </w:t>
+            </w:r>
+            <w:r>
+              <w:t>review timelines</w:t>
+            </w:r>
+            <w:r>
+              <w:t xml:space="preserve"> that</w:t>
+            </w:r>
+            <w:r>
+              <w:t xml:space="preserve"> are controlled by Apple/Google, not our studio, meaning </w:t>
+            </w:r>
+            <w:r>
+              <w:t>tasks involving them could take longer than the single sprint currently allocated for it.</w:t>
+            </w:r>
+          </w:p>
+        </w:tc>
+        <w:tc>
+          <w:tcPr>
+            <w:tcW w:w="1136" w:type="dxa"/>
+          </w:tcPr>
+          <w:p>
+            <w:r>
+              <w:t>3</w:t>
+            </w:r>
+          </w:p>
+        </w:tc>
+        <w:tc>
+          <w:tcPr>
+            <w:tcW w:w="826" w:type="dxa"/>
+          </w:tcPr>
+          <w:p>
+            <w:r>
+              <w:t>3</w:t>
+            </w:r>
+          </w:p>
+        </w:tc>
+        <w:tc>
+          <w:tcPr>
+            <w:tcW w:w="1800" w:type="dxa"/>
+          </w:tcPr>
+          <w:p>
+            <w:r>
+              <w:t>DevOps</w:t>
+            </w:r>
+          </w:p>
+        </w:tc>
+        <w:tc>
+          <w:tcPr>
+            <w:tcW w:w="1779" w:type="dxa"/>
+          </w:tcPr>
+          <w:p>
+            <w:r>
+              <w:t>Submit builds for store review several days before the planned rollout date to account for review-time variability without changing the launch date.</w:t>
+            </w:r>
+          </w:p>
+        </w:tc>
+        <w:tc>
+          <w:tcPr>
+            <w:tcW w:w="1428" w:type="dxa"/>
+          </w:tcPr>
+          <w:p>
+            <w:r>
+              <w:t>Outside the team’s direct control.</w:t>
+            </w:r>
+          </w:p>
+        </w:tc>
+      </w:tr>
+      <w:tr>
+        <w:tc>
+          <w:tcPr>
+            <w:tcW w:w="581" w:type="dxa"/>
+          </w:tcPr>
+          <w:p>
+            <w:r>
+              <w:lastRenderedPageBreak/>
+              <w:t>10</w:t>
+            </w:r>
+          </w:p>
+        </w:tc>
+        <w:tc>
+          <w:tcPr>
+            <w:tcW w:w="1800" w:type="dxa"/>
+          </w:tcPr>
+          <w:p>
+            <w:r>
+              <w:t>Project team members’ actual availability may not align with when the schedule needs them, especially for single-person roles such as Compliance/Legal Liaison.</w:t>
+            </w:r>
+          </w:p>
+        </w:tc>
+        <w:tc>
+          <w:tcPr>
+            <w:tcW w:w="1136" w:type="dxa"/>
+          </w:tcPr>
+          <w:p>
+            <w:r>
+              <w:t>3</w:t>
+            </w:r>
+          </w:p>
+        </w:tc>
+        <w:tc>
+          <w:tcPr>
+            <w:tcW w:w="826" w:type="dxa"/>
+          </w:tcPr>
+          <w:p>
+            <w:r>
+              <w:t>3</w:t>
+            </w:r>
+          </w:p>
+        </w:tc>
+        <w:tc>
+          <w:tcPr>
+            <w:tcW w:w="1800" w:type="dxa"/>
+          </w:tcPr>
+          <w:p>
+            <w:r>
+              <w:t>Project Manager</w:t>
+            </w:r>
+          </w:p>
+        </w:tc>
+        <w:tc>
+          <w:tcPr>
+            <w:tcW w:w="1779" w:type="dxa"/>
+          </w:tcPr>
+          <w:p>
+            <w:r>
+              <w:t>Confirm key personnel availability at each sprint’s start. If possible, identify backup contact for single-owner roles.</w:t>
+            </w:r>
+          </w:p>
+        </w:tc>
+        <w:tc>
+          <w:tcPr>
+            <w:tcW w:w="1428" w:type="dxa"/>
+          </w:tcPr>
+          <w:p>
+            <w:r>
+              <w:t>Related to key-person dependency risk in the People risk category.</w:t>
+            </w:r>
+          </w:p>
+        </w:tc>
+      </w:tr>
+      <w:tr>
+        <w:tc>
+          <w:tcPr>
+            <w:tcW w:w="581" w:type="dxa"/>
+          </w:tcPr>
+          <w:p>
+            <w:r>
+              <w:t>11</w:t>
+            </w:r>
+          </w:p>
+        </w:tc>
+        <w:tc>
+          <w:tcPr>
+            <w:tcW w:w="1800" w:type="dxa"/>
+          </w:tcPr>
+          <w:p>
+            <w:r>
+              <w:t>Costs for third-party services such as payment gateway fees or cloud hosting are usage-based and could spike unpredictably, leading to increased financial costs.</w:t>
+            </w:r>
+          </w:p>
+        </w:tc>
+        <w:tc>
+          <w:tcPr>
+            <w:tcW w:w="1136" w:type="dxa"/>
+          </w:tcPr>
+          <w:p>
+            <w:r>
+              <w:t>3</w:t>
+            </w:r>
+          </w:p>
+        </w:tc>
+        <w:tc>
+          <w:tcPr>
+            <w:tcW w:w="826" w:type="dxa"/>
+          </w:tcPr>
+          <w:p>
+            <w:r>
+              <w:t>2</w:t>
+            </w:r>
+          </w:p>
+        </w:tc>
+        <w:tc>
+          <w:tcPr>
+            <w:tcW w:w="1800" w:type="dxa"/>
+          </w:tcPr>
+          <w:p>
+            <w:r>
+              <w:t>Project Manager</w:t>
+            </w:r>
+          </w:p>
+        </w:tc>
+        <w:tc>
+          <w:tcPr>
+            <w:tcW w:w="1779" w:type="dxa"/>
+          </w:tcPr>
+          <w:p>
+            <w:r>
+              <w:t>Monitor usage-based billing monthly and set budget alert thresholds with each provider.</w:t>
+            </w:r>
+          </w:p>
+        </w:tc>
+        <w:tc>
+          <w:tcPr>
+            <w:tcW w:w="1428" w:type="dxa"/>
+          </w:tcPr>
+          <w:p>
+            <w:r>
+              <w:t xml:space="preserve">Cost scales with success, which makes this easily </w:t>
+            </w:r>
+            <w:r>
+              <w:t>manageable</w:t>
+            </w:r>
+            <w:r>
+              <w:t>.</w:t>
+            </w:r>
+          </w:p>
+        </w:tc>
+      </w:tr>
+      <w:tr>
+        <w:tc>
+          <w:tcPr>
+            <w:tcW w:w="581" w:type="dxa"/>
+          </w:tcPr>
+          <w:p>
+            <w:r>
+              <w:t>12</w:t>
+            </w:r>
+          </w:p>
+        </w:tc>
+        <w:tc>
+          <w:tcPr>
+            <w:tcW w:w="1800" w:type="dxa"/>
+          </w:tcPr>
+          <w:p>
+            <w:r>
+              <w:t>Regulatory compliance costs may vary significantly across the different municipalities the platform expands into, given different city ordinances.</w:t>
+            </w:r>
+          </w:p>
+        </w:tc>
+        <w:tc>
+          <w:tcPr>
+            <w:tcW w:w="1136" w:type="dxa"/>
+          </w:tcPr>
+          <w:p>
+            <w:r>
+              <w:t>3</w:t>
+            </w:r>
+          </w:p>
+        </w:tc>
+        <w:tc>
+          <w:tcPr>
+            <w:tcW w:w="826" w:type="dxa"/>
+          </w:tcPr>
+          <w:p>
+            <w:r>
+              <w:t>3</w:t>
+            </w:r>
+          </w:p>
+        </w:tc>
+        <w:tc>
+          <w:tcPr>
+            <w:tcW w:w="1800" w:type="dxa"/>
+          </w:tcPr>
+          <w:p>
+            <w:r>
+              <w:t>Compliance/Legal Liaison</w:t>
+            </w:r>
+          </w:p>
+        </w:tc>
+        <w:tc>
+          <w:tcPr>
+            <w:tcW w:w="1779" w:type="dxa"/>
+          </w:tcPr>
+          <w:p>
+            <w:r>
+              <w:t>Complete the Regulatory and City Ordinance Compliance</w:t>
+            </w:r>
+            <w:r>
+              <w:t xml:space="preserve"> Risk Assessment (WBS 3.5.3) for each market established in a new location before launch.</w:t>
+            </w:r>
+          </w:p>
+        </w:tc>
+        <w:tc>
+          <w:tcPr>
+            <w:tcW w:w="1428" w:type="dxa"/>
+          </w:tcPr>
+          <w:p>
+            <w:r>
+              <w:t>Directly tied to an existing WBS risk-assessment task.</w:t>
+            </w:r>
+          </w:p>
+        </w:tc>
+      </w:tr>
+      <w:tr>
+        <w:tc>
+          <w:tcPr>
+            <w:tcW w:w="581" w:type="dxa"/>
+          </w:tcPr>
+          <w:p>
+            <w:r>
+              <w:t>13</w:t>
+            </w:r>
+          </w:p>
+        </w:tc>
+        <w:tc>
+          <w:tcPr>
+            <w:tcW w:w="1800" w:type="dxa"/>
+          </w:tcPr>
+          <w:p>
+            <w:r>
+              <w:t xml:space="preserve">A data breach involving payment or personal information </w:t>
+            </w:r>
+            <w:r>
+              <w:lastRenderedPageBreak/>
+              <w:t>could result in direct financial exposure through fines, remediation costs, and reputational damage.</w:t>
+            </w:r>
+          </w:p>
+        </w:tc>
+        <w:tc>
+          <w:tcPr>
+            <w:tcW w:w="1136" w:type="dxa"/>
+          </w:tcPr>
+          <w:p>
+            <w:r>
+              <w:lastRenderedPageBreak/>
+              <w:t>2</w:t>
+            </w:r>
+          </w:p>
+        </w:tc>
+        <w:tc>
+          <w:tcPr>
+            <w:tcW w:w="826" w:type="dxa"/>
+          </w:tcPr>
+          <w:p>
+            <w:r>
+              <w:t>5</w:t>
+            </w:r>
+          </w:p>
+        </w:tc>
+        <w:tc>
+          <w:tcPr>
+            <w:tcW w:w="1800" w:type="dxa"/>
+          </w:tcPr>
+          <w:p>
+            <w:r>
+              <w:t>Security Team</w:t>
+            </w:r>
+          </w:p>
+        </w:tc>
+        <w:tc>
+          <w:tcPr>
+            <w:tcW w:w="1779" w:type="dxa"/>
+          </w:tcPr>
+          <w:p>
+            <w:r>
+              <w:t>Maintain PCI-DSS compliance (WBS 3.4.2).</w:t>
+            </w:r>
+          </w:p>
+        </w:tc>
+        <w:tc>
+          <w:tcPr>
+            <w:tcW w:w="1428" w:type="dxa"/>
+          </w:tcPr>
+          <w:p>
+            <w:r>
+              <w:t>High impact, but lower probability.</w:t>
+            </w:r>
+          </w:p>
+        </w:tc>
+      </w:tr>
+      <w:tr>
+        <w:tc>
+          <w:tcPr>
+            <w:tcW w:w="581" w:type="dxa"/>
+          </w:tcPr>
+          <w:p>
+            <w:r>
+              <w:t>14</w:t>
+            </w:r>
+          </w:p>
+        </w:tc>
+        <w:tc>
+          <w:tcPr>
+            <w:tcW w:w="1800" w:type="dxa"/>
+          </w:tcPr>
+          <w:p>
+            <w:r>
+              <w:t>Technical shortcuts taken to keep up with compressed sprint deadlines could accumulate technical debt, which would require expensive fixes later in the project.</w:t>
+            </w:r>
+          </w:p>
+        </w:tc>
+        <w:tc>
+          <w:tcPr>
+            <w:tcW w:w="1136" w:type="dxa"/>
+          </w:tcPr>
+          <w:p>
+            <w:r>
+              <w:t>3</w:t>
+            </w:r>
+          </w:p>
+        </w:tc>
+        <w:tc>
+          <w:tcPr>
+            <w:tcW w:w="826" w:type="dxa"/>
+          </w:tcPr>
+          <w:p>
+            <w:r>
+              <w:t>3</w:t>
+            </w:r>
+          </w:p>
+        </w:tc>
+        <w:tc>
+          <w:tcPr>
+            <w:tcW w:w="1800" w:type="dxa"/>
+          </w:tcPr>
+          <w:p>
+            <w:r>
+              <w:t>Project Manager</w:t>
+            </w:r>
+          </w:p>
+        </w:tc>
+        <w:tc>
+          <w:tcPr>
+            <w:tcW w:w="1779" w:type="dxa"/>
+          </w:tcPr>
+          <w:p>
+            <w:r>
+              <w:t xml:space="preserve">Document any shortcuts taken in the backlog rather than leaving them undocumented. </w:t>
+            </w:r>
+            <w:r>
+              <w:t>Before any major releases, revisit these.</w:t>
+            </w:r>
+          </w:p>
+        </w:tc>
+        <w:tc>
+          <w:tcPr>
+            <w:tcW w:w="1428" w:type="dxa"/>
+          </w:tcPr>
+          <w:p>
+            <w:r>
+              <w:t>If possible, the aim would be to not have to resort to shortcuts, this is mainly a precaution.</w:t>
+            </w:r>
+          </w:p>
+        </w:tc>
+      </w:tr>
+      <w:tr>
+        <w:tc>
+          <w:tcPr>
+            <w:tcW w:w="581" w:type="dxa"/>
+          </w:tcPr>
+          <w:p>
+            <w:r>
+              <w:t>15</w:t>
+            </w:r>
+          </w:p>
+        </w:tc>
+        <w:tc>
+          <w:tcPr>
+            <w:tcW w:w="1800" w:type="dxa"/>
+          </w:tcPr>
+          <w:p>
+            <w:r>
+              <w:t>Failing to maintain regulatory compliance such as accessibility standards and municipal ordinances could lead to legal fines or costly emergency fixes.</w:t>
+            </w:r>
+          </w:p>
+        </w:tc>
+        <w:tc>
+          <w:tcPr>
+            <w:tcW w:w="1136" w:type="dxa"/>
+          </w:tcPr>
+          <w:p>
+            <w:r>
+              <w:t>2</w:t>
+            </w:r>
+          </w:p>
+        </w:tc>
+        <w:tc>
+          <w:tcPr>
+            <w:tcW w:w="826" w:type="dxa"/>
+          </w:tcPr>
+          <w:p>
+            <w:r>
+              <w:t>4</w:t>
+            </w:r>
+          </w:p>
+        </w:tc>
+        <w:tc>
+          <w:tcPr>
+            <w:tcW w:w="1800" w:type="dxa"/>
+          </w:tcPr>
+          <w:p>
+            <w:r>
+              <w:t>Compliance/Legal Liaison</w:t>
+            </w:r>
+          </w:p>
+        </w:tc>
+        <w:tc>
+          <w:tcPr>
+            <w:tcW w:w="1779" w:type="dxa"/>
+          </w:tcPr>
+          <w:p>
+            <w:r>
+              <w:t>Validate city ordinance compliance during QA rather than only at launch, so that gaps are caught early while they’re still cheap to fix.</w:t>
+            </w:r>
+          </w:p>
+        </w:tc>
+        <w:tc>
+          <w:tcPr>
+            <w:tcW w:w="1428" w:type="dxa"/>
+          </w:tcPr>
+          <w:p>
+            <w:r>
+              <w:t>Independent from any type of security breaches,</w:t>
+            </w:r>
+            <w:r>
+              <w:t xml:space="preserve"> this is simply making sure the app follows what’s legally required.</w:t>
+            </w:r>
+          </w:p>
+        </w:tc>
+      </w:tr>
+      <w:tr>
+        <w:tc>
+          <w:tcPr>
+            <w:tcW w:w="581" w:type="dxa"/>
+          </w:tcPr>
+          <w:p>
+            <w:r>
+              <w:t>16</w:t>
+            </w:r>
+          </w:p>
+        </w:tc>
+        <w:tc>
+          <w:tcPr>
+            <w:tcW w:w="1800" w:type="dxa"/>
+          </w:tcPr>
+          <w:p>
+            <w:r>
+              <w:t xml:space="preserve">A shortage of specialized technical skills such as penetration testing or software </w:t>
+            </w:r>
+            <w:r>
+              <w:lastRenderedPageBreak/>
+              <w:t>engineering could lead to lower system quality or delays when developing the platform.</w:t>
+            </w:r>
+          </w:p>
+        </w:tc>
+        <w:tc>
+          <w:tcPr>
+            <w:tcW w:w="1136" w:type="dxa"/>
+          </w:tcPr>
+          <w:p>
+            <w:r>
+              <w:lastRenderedPageBreak/>
+              <w:t>3</w:t>
+            </w:r>
+          </w:p>
+        </w:tc>
+        <w:tc>
+          <w:tcPr>
+            <w:tcW w:w="826" w:type="dxa"/>
+          </w:tcPr>
+          <w:p>
+            <w:r>
+              <w:t>3</w:t>
+            </w:r>
+          </w:p>
+        </w:tc>
+        <w:tc>
+          <w:tcPr>
+            <w:tcW w:w="1800" w:type="dxa"/>
+          </w:tcPr>
+          <w:p>
+            <w:r>
+              <w:t>Project Manager</w:t>
+            </w:r>
+          </w:p>
+        </w:tc>
+        <w:tc>
+          <w:tcPr>
+            <w:tcW w:w="1779" w:type="dxa"/>
+          </w:tcPr>
+          <w:p>
+            <w:r>
+              <w:t xml:space="preserve">Identify training needs or contractor support for specialized work early instead of </w:t>
+            </w:r>
+            <w:r>
+              <w:lastRenderedPageBreak/>
+              <w:t>assuming existing staff can learn everything needed throughout working on the platform.</w:t>
+            </w:r>
+          </w:p>
+        </w:tc>
+        <w:tc>
+          <w:tcPr>
+            <w:tcW w:w="1428" w:type="dxa"/>
+          </w:tcPr>
+          <w:p>
+            <w:r>
+              <w:lastRenderedPageBreak/>
+              <w:t xml:space="preserve">This may extend beyond technical skills; however, poor </w:t>
+            </w:r>
+            <w:r>
+              <w:lastRenderedPageBreak/>
+              <w:t>technical skills are what would slow down progress the most.</w:t>
+            </w:r>
+          </w:p>
+        </w:tc>
+      </w:tr>
+      <w:tr>
+        <w:tc>
+          <w:tcPr>
+            <w:tcW w:w="581" w:type="dxa"/>
+          </w:tcPr>
+          <w:p>
+            <w:r>
+              <w:lastRenderedPageBreak/>
+              <w:t>17</w:t>
+            </w:r>
+          </w:p>
+        </w:tc>
+        <w:tc>
+          <w:tcPr>
+            <w:tcW w:w="1800" w:type="dxa"/>
+          </w:tcPr>
+          <w:p>
+            <w:r>
+              <w:t>Heavy task parallelization across many small sub-teams requires increased coordination efforts needed to stay in sync, which could result in communication falling out of alignment.</w:t>
+            </w:r>
+          </w:p>
+        </w:tc>
+        <w:tc>
+          <w:tcPr>
+            <w:tcW w:w="1136" w:type="dxa"/>
+          </w:tcPr>
+          <w:p>
+            <w:r>
+              <w:t>4</w:t>
+            </w:r>
+          </w:p>
+        </w:tc>
+        <w:tc>
+          <w:tcPr>
+            <w:tcW w:w="826" w:type="dxa"/>
+          </w:tcPr>
+          <w:p>
+            <w:r>
+              <w:t>3</w:t>
+            </w:r>
+          </w:p>
+        </w:tc>
+        <w:tc>
+          <w:tcPr>
+            <w:tcW w:w="1800" w:type="dxa"/>
+          </w:tcPr>
+          <w:p>
+            <w:r>
+              <w:t>Project Manager</w:t>
+            </w:r>
+          </w:p>
+        </w:tc>
+        <w:tc>
+          <w:tcPr>
+            <w:tcW w:w="1779" w:type="dxa"/>
+          </w:tcPr>
+          <w:p>
+            <w:r>
+              <w:t>Hold daily check-ins across parallel sub-teams and use the shared backlog and Gantt chart as a source of truth for status.</w:t>
+            </w:r>
+          </w:p>
+        </w:tc>
+        <w:tc>
+          <w:tcPr>
+            <w:tcW w:w="1428" w:type="dxa"/>
+          </w:tcPr>
+          <w:p>
+            <w:r>
+              <w:t>It’s up to debate between teams and the project manager to decide where daily check-ins will take place (MS Teams, Slack, etc.).</w:t>
+            </w:r>
+          </w:p>
+        </w:tc>
+      </w:tr>
+      <w:tr>
+        <w:tc>
+          <w:tcPr>
+            <w:tcW w:w="581" w:type="dxa"/>
+          </w:tcPr>
+          <w:p>
+            <w:r>
+              <w:t>18</w:t>
+            </w:r>
+          </w:p>
+        </w:tc>
+        <w:tc>
+          <w:tcPr>
+            <w:tcW w:w="1800" w:type="dxa"/>
+          </w:tcPr>
+          <w:p>
+            <w:r>
+              <w:t>Low stakeholder engagement during design or acceptance testing could result in a system that doesn’t meet business requirements.</w:t>
+            </w:r>
+          </w:p>
+        </w:tc>
+        <w:tc>
+          <w:tcPr>
+            <w:tcW w:w="1136" w:type="dxa"/>
+          </w:tcPr>
+          <w:p>
+            <w:r>
+              <w:t>2</w:t>
+            </w:r>
+          </w:p>
+        </w:tc>
+        <w:tc>
+          <w:tcPr>
+            <w:tcW w:w="826" w:type="dxa"/>
+          </w:tcPr>
+          <w:p>
+            <w:r>
+              <w:t>4</w:t>
+            </w:r>
+          </w:p>
+        </w:tc>
+        <w:tc>
+          <w:tcPr>
+            <w:tcW w:w="1800" w:type="dxa"/>
+          </w:tcPr>
+          <w:p>
+            <w:r>
+              <w:t>Project Manager</w:t>
+            </w:r>
+          </w:p>
+        </w:tc>
+        <w:tc>
+          <w:tcPr>
+            <w:tcW w:w="1779" w:type="dxa"/>
+          </w:tcPr>
+          <w:p>
+            <w:r>
+              <w:t xml:space="preserve">Treat Design Review and Sign-Off (WBS 3.2.3) and Full System User Acceptance Testing (WBS 3.7.2) as hard gates. No further work should be done without </w:t>
+            </w:r>
+            <w:r>
+              <w:t>stakeholder feedback.</w:t>
+            </w:r>
+          </w:p>
+        </w:tc>
+        <w:tc>
+          <w:tcPr>
+            <w:tcW w:w="1428" w:type="dxa"/>
+          </w:tcPr>
+          <w:p>
+            <w:r>
+              <w:t>Both gated tasks exist already in the WBS, the risk is just treating them as something to just check off instead of prioritizing them.</w:t>
+            </w:r>
+          </w:p>
+        </w:tc>
+      </w:tr>
+      <w:tr>
+        <w:tc>
+          <w:tcPr>
+            <w:tcW w:w="581" w:type="dxa"/>
+          </w:tcPr>
+          <w:p>
+            <w:r>
+              <w:t>19</w:t>
+            </w:r>
+          </w:p>
+        </w:tc>
+        <w:tc>
+          <w:tcPr>
+            <w:tcW w:w="1800" w:type="dxa"/>
+          </w:tcPr>
+          <w:p>
+            <w:r>
+              <w:t xml:space="preserve">Staff turnover could cause delays, knowledge gaps, and added tension in teams, especially for </w:t>
+            </w:r>
+            <w:r>
+              <w:lastRenderedPageBreak/>
+              <w:t>single-owner roles with no documented backup.</w:t>
+            </w:r>
+          </w:p>
+        </w:tc>
+        <w:tc>
+          <w:tcPr>
+            <w:tcW w:w="1136" w:type="dxa"/>
+          </w:tcPr>
+          <w:p>
+            <w:r>
+              <w:lastRenderedPageBreak/>
+              <w:t>3</w:t>
+            </w:r>
+          </w:p>
+        </w:tc>
+        <w:tc>
+          <w:tcPr>
+            <w:tcW w:w="826" w:type="dxa"/>
+          </w:tcPr>
+          <w:p>
+            <w:r>
+              <w:t>4</w:t>
+            </w:r>
+          </w:p>
+        </w:tc>
+        <w:tc>
+          <w:tcPr>
+            <w:tcW w:w="1800" w:type="dxa"/>
+          </w:tcPr>
+          <w:p>
+            <w:r>
+              <w:t>Project Manager</w:t>
+            </w:r>
+          </w:p>
+        </w:tc>
+        <w:tc>
+          <w:tcPr>
+            <w:tcW w:w="1779" w:type="dxa"/>
+          </w:tcPr>
+          <w:p>
+            <w:r>
+              <w:t xml:space="preserve">Document each team’s work in shared project records so knowledge isn’t lost when someone </w:t>
+            </w:r>
+            <w:r>
+              <w:lastRenderedPageBreak/>
+              <w:t>leaves. After anyone leaves, redistribute tasks across the team and hold a brief check-in to address workload and morale. For single-owner roles, we will assign a named backup to fill the space in case they can’t work anymore.</w:t>
+            </w:r>
+          </w:p>
+        </w:tc>
+        <w:tc>
+          <w:tcPr>
+            <w:tcW w:w="1428" w:type="dxa"/>
+          </w:tcPr>
+          <w:p>
+            <w:r>
+              <w:lastRenderedPageBreak/>
+              <w:t xml:space="preserve">This could potentially belong to the schedule category; however, this more </w:t>
+            </w:r>
+            <w:r>
+              <w:lastRenderedPageBreak/>
+              <w:t>so involves how the team is affected internally rather than just schedule issues.</w:t>
+            </w:r>
+          </w:p>
+        </w:tc>
+      </w:tr>
+      <w:tr>
+        <w:tc>
+          <w:tcPr>
+            <w:tcW w:w="581" w:type="dxa"/>
+          </w:tcPr>
+          <w:p>
+            <w:r>
+              <w:lastRenderedPageBreak/>
+              <w:t>20</w:t>
+            </w:r>
+          </w:p>
+        </w:tc>
+        <w:tc>
+          <w:tcPr>
+            <w:tcW w:w="1800" w:type="dxa"/>
+          </w:tcPr>
+          <w:p>
+            <w:r>
+              <w:t>The QA Team is reused sequentially across nearly every feature in the schedule and could result in burnout from team members from being allocated too many tasks throughout the project.</w:t>
+            </w:r>
+          </w:p>
+        </w:tc>
+        <w:tc>
+          <w:tcPr>
+            <w:tcW w:w="1136" w:type="dxa"/>
+          </w:tcPr>
+          <w:p>
+            <w:r>
+              <w:t>3</w:t>
+            </w:r>
+          </w:p>
+        </w:tc>
+        <w:tc>
+          <w:tcPr>
+            <w:tcW w:w="826" w:type="dxa"/>
+          </w:tcPr>
+          <w:p>
+            <w:r>
+              <w:t>3</w:t>
+            </w:r>
+          </w:p>
+        </w:tc>
+        <w:tc>
+          <w:tcPr>
+            <w:tcW w:w="1800" w:type="dxa"/>
+          </w:tcPr>
+          <w:p>
+            <w:r>
+              <w:t>Project Manager</w:t>
+            </w:r>
+          </w:p>
+        </w:tc>
+        <w:tc>
+          <w:tcPr>
+            <w:tcW w:w="1779" w:type="dxa"/>
+          </w:tcPr>
+          <w:p>
+            <w:r>
+              <w:t xml:space="preserve">Monitor QA workload distribution across sprints. Consider splitting QA into </w:t>
+            </w:r>
+            <w:r>
+              <w:t xml:space="preserve">more </w:t>
+            </w:r>
+            <w:r>
+              <w:t>sub-teams if the bottleneck becomes severe.</w:t>
+            </w:r>
+          </w:p>
+        </w:tc>
+        <w:tc>
+          <w:tcPr>
+            <w:tcW w:w="1428" w:type="dxa"/>
+          </w:tcPr>
+          <w:p>
+            <w:r>
+              <w:t xml:space="preserve">QA is the most heavily </w:t>
+            </w:r>
+            <w:r>
+              <w:t>shared resource across the entire project schedule.</w:t>
+            </w:r>
+          </w:p>
+        </w:tc>
+      </w:tr>
+    </w:tbl>
+    <w:p/>
+    <w:p>
+      <w:r>
+        <w:br w:type="page"/>
+      </w:r>
+    </w:p>
+    <w:p>
+      <w:pPr>
+        <w:pStyle w:val="Heading1"/>
+        <w:rPr>
+          <w:b/>
+          <w:bCs/>
+          <w:sz w:val="48"/>
+          <w:szCs w:val="48"/>
+        </w:rPr>
+      </w:pPr>
+      <w:r>
+        <w:rPr>
+          <w:b/>
+          <w:bCs/>
+          <w:noProof/>
+        </w:rPr>
+        <w:lastRenderedPageBreak/>
+        <mc:AlternateContent>
+          <mc:Choice Requires="wps">
+            <w:drawing>
+              <wp:anchor distT="0" distB="0" distL="114300" distR="114300" simplePos="0" relativeHeight="251673600" behindDoc="0" locked="0" layoutInCell="1" allowOverlap="1" wp14:anchorId="312DEEC7" wp14:editId="4A2E1D56">
+                <wp:simplePos x="0" y="0"/>
+                <wp:positionH relativeFrom="margin">
+                  <wp:align>center</wp:align>
+                </wp:positionH>
+                <wp:positionV relativeFrom="paragraph">
+                  <wp:posOffset>361950</wp:posOffset>
+                </wp:positionV>
+                <wp:extent cx="6286500" cy="9525"/>
+                <wp:effectExtent l="0" t="0" r="19050" b="28575"/>
+                <wp:wrapNone/>
+                <wp:docPr id="52227674" name="Straight Connector 52227674"/>
+                <wp:cNvGraphicFramePr/>
+                <a:graphic xmlns:a="http://schemas.openxmlformats.org/drawingml/2006/main">
+                  <a:graphicData uri="http://schemas.microsoft.com/office/word/2010/wordprocessingShape">
+                    <wps:wsp>
+                      <wps:cNvCnPr/>
+                      <wps:spPr>
+                        <a:xfrm>
+                          <a:off x="0" y="0"/>
+                          <a:ext cx="6286500" cy="9525"/>
+                        </a:xfrm>
+                        <a:prstGeom prst="line">
+                          <a:avLst/>
+                        </a:prstGeom>
+                      </wps:spPr>
+                      <wps:style>
+                        <a:lnRef idx="1">
+                          <a:schemeClr val="accent1"/>
+                        </a:lnRef>
+                        <a:fillRef idx="0">
+                          <a:schemeClr val="accent1"/>
+                        </a:fillRef>
+                        <a:effectRef idx="0">
+                          <a:schemeClr val="accent1"/>
+                        </a:effectRef>
+                        <a:fontRef idx="minor">
+                          <a:schemeClr val="tx1"/>
+                        </a:fontRef>
+                      </wps:style>
+                      <wps:bodyPr/>
+                    </wps:wsp>
+                  </a:graphicData>
+                </a:graphic>
+              </wp:anchor>
+            </w:drawing>
+          </mc:Choice>
+          <mc:Fallback>
+            <w:pict>
+              <v:line w14:anchorId="54BCBEB7" id="Straight Connector 52227674" o:spid="_x0000_s1026" style="position:absolute;z-index:251673600;visibility:visible;mso-wrap-style:square;mso-wrap-distance-left:9pt;mso-wrap-distance-top:0;mso-wrap-distance-right:9pt;mso-wrap-distance-bottom:0;mso-position-horizontal:center;mso-position-horizontal-relative:margin;mso-position-vertical:absolute;mso-position-vertical-relative:text" from="0,28.5pt" to="495pt,29.25pt" o:gfxdata="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" strokecolor="#156082 [3204]" strokeweight=".5pt">
+                <v:stroke joinstyle="miter"/>
+                <w10:wrap anchorx="margin"/>
+              </v:line>
+            </w:pict>
+          </mc:Fallback>
+        </mc:AlternateContent>
+      </w:r>
+      <w:r>
+        <w:rPr>
+          <w:b/>
+          <w:bCs/>
+          <w:sz w:val="48"/>
+          <w:szCs w:val="48"/>
+        </w:rPr>
+        <w:t>Communication Plan</w:t>
+      </w:r>
+    </w:p>
+    <w:p>
+      <w:pPr>
+        <w:pStyle w:val="Heading3"/>
+      </w:pPr>
+      <w:r>
+        <w:t>Meeting Cadence</w:t>
+      </w:r>
+    </w:p>
+    <w:p>
+      <w:r>
+        <w:t>Platform Delivery Teams: Design Teams A/B, Architecture Team, Backend Teams A/B/C/D, Security Teams A/B, QA Teams A/B, DevOps A/B, Support Team</w:t>
+      </w:r>
+    </w:p>
+    <w:p>
+      <w:r>
+        <w:t>Driver Delivery Teams: Driver Team, Driver Team – Frontend, Driver Teams – Backend A/B</w:t>
+      </w:r>
+      <w:r>
+        <w:t>, Driver Teams – Payments A/B</w:t>
+      </w:r>
+    </w:p>
+    <w:p>
+      <w:r>
+        <w:t>Operator Delivery Teams: Operator Team, Operator Team – Onboarding, Operation Teams – Monitoring A/B, Reporting Teams A/B/C/D/E</w:t>
+      </w:r>
+    </w:p>
+    <w:p>
+      <w:r>
+        <w:t>Leadership Roles: Project Manager, Risk Manager, Compliance/Legal Liaison</w:t>
+      </w:r>
+    </w:p>
+    <w:p>
+      <w:r>
+        <w:t xml:space="preserve">Business </w:t>
+      </w:r>
+      <w:r>
+        <w:t>Stakeholders: Parking Operators, Sponsors</w:t>
+      </w:r>
+      <w:r>
+        <w:t xml:space="preserve"> and </w:t>
+      </w:r>
+      <w:r>
+        <w:t>Leadership</w:t>
+      </w:r>
+    </w:p>
+    <w:tbl>
+      <w:tblPr>
+        <w:tblStyle w:val="TableGrid"/>
+        <w:tblW w:w="0" w:type="auto"/>
+        <w:tblLook w:val="04A0" w:firstRow="1" w:lastRow="0" w:firstColumn="1" w:lastColumn="0" w:noHBand="0" w:noVBand="1"/>
+      </w:tblPr>
+      <w:tblGrid>
+        <w:gridCol w:w="2337"/>
+        <w:gridCol w:w="2337"/>
+        <w:gridCol w:w="2338"/>
+        <w:gridCol w:w="2338"/>
+      </w:tblGrid>
+      <w:tr>
+        <w:tc>
+          <w:tcPr>
+            <w:tcW w:w="2337" w:type="dxa"/>
+          </w:tcPr>
+          <w:p>
+            <w:r>
+              <w:t>Meeting Topic</w:t>
+            </w:r>
+          </w:p>
+        </w:tc>
+        <w:tc>
+          <w:tcPr>
+            <w:tcW w:w="2337" w:type="dxa"/>
+          </w:tcPr>
+          <w:p>
+            <w:r>
+              <w:t>Attendees</w:t>
+            </w:r>
+          </w:p>
+        </w:tc>
+        <w:tc>
+          <w:tcPr>
+            <w:tcW w:w="2338" w:type="dxa"/>
+          </w:tcPr>
+          <w:p>
+            <w:r>
+              <w:t>Frequency</w:t>
+            </w:r>
+          </w:p>
+        </w:tc>
+        <w:tc>
+          <w:tcPr>
+            <w:tcW w:w="2338" w:type="dxa"/>
+          </w:tcPr>
+          <w:p>
+            <w:r>
+              <w:t>Purpose</w:t>
+            </w:r>
+          </w:p>
+        </w:tc>
+      </w:tr>
+      <w:tr>
+        <w:tc>
+          <w:tcPr>
+            <w:tcW w:w="2337" w:type="dxa"/>
+          </w:tcPr>
+          <w:p>
+            <w:r>
+              <w:t>Daily Standup</w:t>
+            </w:r>
+          </w:p>
+        </w:tc>
+        <w:tc>
+          <w:tcPr>
+            <w:tcW w:w="2337" w:type="dxa"/>
+          </w:tcPr>
+          <w:p>
+            <w:r>
+              <w:t>Each individual sub-team.</w:t>
+            </w:r>
+          </w:p>
+        </w:tc>
+        <w:tc>
+          <w:tcPr>
+            <w:tcW w:w="2338" w:type="dxa"/>
+          </w:tcPr>
+          <w:p>
+            <w:r>
+              <w:t>Daily</w:t>
+            </w:r>
+          </w:p>
+        </w:tc>
+        <w:tc>
+          <w:tcPr>
+            <w:tcW w:w="2338" w:type="dxa"/>
+          </w:tcPr>
+          <w:p>
+            <w:r>
+              <w:t xml:space="preserve">Quick </w:t>
+            </w:r>
+            <w:r>
+              <w:t>meetings</w:t>
+            </w:r>
+            <w:r>
+              <w:t xml:space="preserve"> for everyone to brief the team on what work was done and any blockers faced.</w:t>
+            </w:r>
+          </w:p>
+        </w:tc>
+      </w:tr>
+      <w:tr>
+        <w:tc>
+          <w:tcPr>
+            <w:tcW w:w="2337" w:type="dxa"/>
+          </w:tcPr>
+          <w:p>
+            <w:r>
+              <w:t>Scrum of Scrums</w:t>
+            </w:r>
+          </w:p>
+        </w:tc>
+        <w:tc>
+          <w:tcPr>
+            <w:tcW w:w="2337" w:type="dxa"/>
+          </w:tcPr>
+          <w:p>
+            <w:r>
+              <w:t xml:space="preserve">One representative from each active </w:t>
+            </w:r>
+            <w:r>
+              <w:t>sub-team</w:t>
+            </w:r>
+            <w:r>
+              <w:t xml:space="preserve"> </w:t>
+            </w:r>
+          </w:p>
+        </w:tc>
+        <w:tc>
+          <w:tcPr>
+            <w:tcW w:w="2338" w:type="dxa"/>
+          </w:tcPr>
+          <w:p>
+            <w:r>
+              <w:t>3x/week</w:t>
+            </w:r>
+          </w:p>
+        </w:tc>
+        <w:tc>
+          <w:tcPr>
+            <w:tcW w:w="2338" w:type="dxa"/>
+          </w:tcPr>
+          <w:p>
+            <w:r>
+              <w:t>Brief about</w:t>
+            </w:r>
+            <w:r>
+              <w:t xml:space="preserve"> cross-team dependencies and blockers before</w:t>
+            </w:r>
+            <w:r>
+              <w:t xml:space="preserve"> they cause resource and timing conflicts.</w:t>
+            </w:r>
+            <w:r>
+              <w:t xml:space="preserve"> </w:t>
+            </w:r>
+          </w:p>
+        </w:tc>
+      </w:tr>
+      <w:tr>
+        <w:tc>
+          <w:tcPr>
+            <w:tcW w:w="2337" w:type="dxa"/>
+          </w:tcPr>
+          <w:p>
+            <w:r>
+              <w:t>Sprint Planning</w:t>
+            </w:r>
+          </w:p>
+        </w:tc>
+        <w:tc>
+          <w:tcPr>
+            <w:tcW w:w="2337" w:type="dxa"/>
+          </w:tcPr>
+          <w:p>
+            <w:r>
+              <w:t>All teams that are active in upcoming sprints</w:t>
+            </w:r>
+          </w:p>
+        </w:tc>
+        <w:tc>
+          <w:tcPr>
+            <w:tcW w:w="2338" w:type="dxa"/>
+          </w:tcPr>
+          <w:p>
+            <w:r>
+              <w:t>Weekly (Start of every sprint.)</w:t>
+            </w:r>
+          </w:p>
+        </w:tc>
+        <w:tc>
+          <w:tcPr>
+            <w:tcW w:w="2338" w:type="dxa"/>
+          </w:tcPr>
+          <w:p>
+            <w:r>
+              <w:t>Confirm which backlog items will be worked on and by whom.</w:t>
+            </w:r>
+          </w:p>
+        </w:tc>
+      </w:tr>
+      <w:tr>
+        <w:tc>
+          <w:tcPr>
+            <w:tcW w:w="2337" w:type="dxa"/>
+          </w:tcPr>
+          <w:p>
+            <w:r>
+              <w:t>Backlog Refinement</w:t>
+            </w:r>
+          </w:p>
+        </w:tc>
+        <w:tc>
+          <w:tcPr>
+            <w:tcW w:w="2337" w:type="dxa"/>
+          </w:tcPr>
+          <w:p>
+            <w:r>
+              <w:t xml:space="preserve">Project Manager, </w:t>
+            </w:r>
+          </w:p>
+          <w:p>
+            <w:r>
+              <w:t>Team Leaders</w:t>
+            </w:r>
+          </w:p>
+        </w:tc>
+        <w:tc>
+          <w:tcPr>
+            <w:tcW w:w="2338" w:type="dxa"/>
+          </w:tcPr>
+          <w:p>
+            <w:r>
+              <w:t>Once per sprint (Mid-sprint.)</w:t>
+            </w:r>
+          </w:p>
+        </w:tc>
+        <w:tc>
+          <w:tcPr>
+            <w:tcW w:w="2338" w:type="dxa"/>
+          </w:tcPr>
+          <w:p>
+            <w:r>
+              <w:t>Re-prioritize upcoming backlog items before they’re needed.</w:t>
+            </w:r>
+          </w:p>
+        </w:tc>
+      </w:tr>
+      <w:tr>
+        <w:tc>
+          <w:tcPr>
+            <w:tcW w:w="2337" w:type="dxa"/>
+          </w:tcPr>
+          <w:p>
+            <w:r>
+              <w:t>Sprint Review</w:t>
+            </w:r>
+          </w:p>
+        </w:tc>
+        <w:tc>
+          <w:tcPr>
+            <w:tcW w:w="2337" w:type="dxa"/>
+          </w:tcPr>
+          <w:p>
+            <w:r>
+              <w:t>All teams active in the sprint,</w:t>
+            </w:r>
+          </w:p>
+          <w:p>
+            <w:r>
+              <w:t>Stakeholders</w:t>
+            </w:r>
+          </w:p>
+        </w:tc>
+        <w:tc>
+          <w:tcPr>
+            <w:tcW w:w="2338" w:type="dxa"/>
+          </w:tcPr>
+          <w:p>
+            <w:r>
+              <w:t>Once per sprint (End of sprint.)</w:t>
+            </w:r>
+          </w:p>
+        </w:tc>
+        <w:tc>
+          <w:tcPr>
+            <w:tcW w:w="2338" w:type="dxa"/>
+          </w:tcPr>
+          <w:p>
+            <w:r>
+              <w:t>Go over what was completed and gather stakeholder feedback.</w:t>
+            </w:r>
+          </w:p>
+        </w:tc>
+      </w:tr>
+      <w:tr>
+        <w:tc>
+          <w:tcPr>
+            <w:tcW w:w="2337" w:type="dxa"/>
+          </w:tcPr>
+          <w:p>
+            <w:r>
+              <w:t>Sprint Retrospective</w:t>
+            </w:r>
+          </w:p>
+        </w:tc>
+        <w:tc>
+          <w:tcPr>
+            <w:tcW w:w="2337" w:type="dxa"/>
+          </w:tcPr>
+          <w:p>
+            <w:r>
+              <w:t>All teams active in the sprint</w:t>
+            </w:r>
+          </w:p>
+        </w:tc>
+        <w:tc>
+          <w:tcPr>
+            <w:tcW w:w="2338" w:type="dxa"/>
+          </w:tcPr>
+          <w:p>
+            <w:r>
+              <w:t>Once per sprint (End of sprint, right after Sprint Review.)</w:t>
+            </w:r>
+          </w:p>
+        </w:tc>
+        <w:tc>
+          <w:tcPr>
+            <w:tcW w:w="2338" w:type="dxa"/>
+          </w:tcPr>
+          <w:p>
+            <w:r>
+              <w:t xml:space="preserve">Reflect on what worked and what didn’t work to adjust </w:t>
+            </w:r>
+            <w:r>
+              <w:lastRenderedPageBreak/>
+              <w:t>future processes accordingly.</w:t>
+            </w:r>
+          </w:p>
+        </w:tc>
+      </w:tr>
+      <w:tr>
+        <w:tc>
+          <w:tcPr>
+            <w:tcW w:w="2337" w:type="dxa"/>
+          </w:tcPr>
+          <w:p>
+            <w:r>
+              <w:lastRenderedPageBreak/>
+              <w:t>Risk Review</w:t>
+            </w:r>
+          </w:p>
+        </w:tc>
+        <w:tc>
+          <w:tcPr>
+            <w:tcW w:w="2337" w:type="dxa"/>
+          </w:tcPr>
+          <w:p>
+            <w:r>
+              <w:t>Risk Manager,</w:t>
+            </w:r>
+          </w:p>
+          <w:p>
+            <w:r>
+              <w:t>Project Manager</w:t>
+            </w:r>
+          </w:p>
+        </w:tc>
+        <w:tc>
+          <w:tcPr>
+            <w:tcW w:w="2338" w:type="dxa"/>
+          </w:tcPr>
+          <w:p>
+            <w:r>
+              <w:t>Weekly</w:t>
+            </w:r>
+          </w:p>
+        </w:tc>
+        <w:tc>
+          <w:tcPr>
+            <w:tcW w:w="2338" w:type="dxa"/>
+          </w:tcPr>
+          <w:p>
+            <w:r>
+              <w:t>Go through the Risk Register, update Status/Notes column, and escalate any risk that has been noted to start occurring.</w:t>
+            </w:r>
+          </w:p>
+        </w:tc>
+      </w:tr>
+      <w:tr>
+        <w:tc>
+          <w:tcPr>
+            <w:tcW w:w="2337" w:type="dxa"/>
+          </w:tcPr>
+          <w:p>
+            <w:r>
+              <w:t>Security &amp; Compliance Sync</w:t>
+            </w:r>
+          </w:p>
+        </w:tc>
+        <w:tc>
+          <w:tcPr>
+            <w:tcW w:w="2337" w:type="dxa"/>
+          </w:tcPr>
+          <w:p>
+            <w:r>
+              <w:t>Security Team,</w:t>
+            </w:r>
+          </w:p>
+          <w:p>
+            <w:r>
+              <w:t>Compliance/Legal Liaison,</w:t>
+            </w:r>
+          </w:p>
+          <w:p>
+            <w:r>
+              <w:t>Project Manager</w:t>
+            </w:r>
+          </w:p>
+        </w:tc>
+        <w:tc>
+          <w:tcPr>
+            <w:tcW w:w="2338" w:type="dxa"/>
+          </w:tcPr>
+          <w:p>
+            <w:r>
+              <w:t xml:space="preserve">2x/week </w:t>
+            </w:r>
+          </w:p>
+        </w:tc>
+        <w:tc>
+          <w:tcPr>
+            <w:tcW w:w="2338" w:type="dxa"/>
+          </w:tcPr>
+          <w:p>
+            <w:r>
+              <w:t>Review the status of security work, confirm PCI-DSS and city ordinance compliance items are on track, and decide whether any findings need to be escalated.</w:t>
+            </w:r>
+          </w:p>
+        </w:tc>
+      </w:tr>
+      <w:tr>
+        <w:tc>
+          <w:tcPr>
+            <w:tcW w:w="2337" w:type="dxa"/>
+          </w:tcPr>
+          <w:p>
+            <w:r>
+              <w:t>Stakeholder Update</w:t>
+            </w:r>
+          </w:p>
+        </w:tc>
+        <w:tc>
+          <w:tcPr>
+            <w:tcW w:w="2337" w:type="dxa"/>
+          </w:tcPr>
+          <w:p>
+            <w:r>
+              <w:t>Project Manager,</w:t>
+            </w:r>
+          </w:p>
+          <w:p>
+            <w:r>
+              <w:t>Stakeholders</w:t>
+            </w:r>
+          </w:p>
+        </w:tc>
+        <w:tc>
+          <w:tcPr>
+            <w:tcW w:w="2338" w:type="dxa"/>
+          </w:tcPr>
+          <w:p>
+            <w:r>
+              <w:t>2x/week</w:t>
+            </w:r>
+          </w:p>
+        </w:tc>
+        <w:tc>
+          <w:tcPr>
+            <w:tcW w:w="2338" w:type="dxa"/>
+          </w:tcPr>
+          <w:p>
+            <w:r>
+              <w:t>Summarize high-level progress to stakeholders to keep them up to speed.</w:t>
+            </w:r>
+          </w:p>
+        </w:tc>
+      </w:tr>
+    </w:tbl>
+    <w:p/>
+    <w:p>
+      <w:pPr>
+        <w:pStyle w:val="Heading3"/>
+      </w:pPr>
+      <w:r>
+        <w:t>Reporting Methods</w:t>
+      </w:r>
+    </w:p>
+    <w:tbl>
+      <w:tblPr>
+        <w:tblStyle w:val="TableGrid"/>
+        <w:tblW w:w="0" w:type="auto"/>
+        <w:tblLook w:val="04A0" w:firstRow="1" w:lastRow="0" w:firstColumn="1" w:lastColumn="0" w:noHBand="0" w:noVBand="1"/>
+      </w:tblPr>
+      <w:tblGrid>
+        <w:gridCol w:w="2337"/>
+        <w:gridCol w:w="2337"/>
+        <w:gridCol w:w="2338"/>
+        <w:gridCol w:w="2338"/>
+      </w:tblGrid>
+      <w:tr>
+        <w:tc>
+          <w:tcPr>
+            <w:tcW w:w="2337" w:type="dxa"/>
+          </w:tcPr>
+          <w:p>
+            <w:r>
+              <w:t>Method</w:t>
+            </w:r>
+          </w:p>
+        </w:tc>
+        <w:tc>
+          <w:tcPr>
+            <w:tcW w:w="2337" w:type="dxa"/>
+          </w:tcPr>
+          <w:p>
+            <w:r>
+              <w:t>Content</w:t>
+            </w:r>
+          </w:p>
+        </w:tc>
+        <w:tc>
+          <w:tcPr>
+            <w:tcW w:w="2338" w:type="dxa"/>
+          </w:tcPr>
+          <w:p>
+            <w:r>
+              <w:t>Audience</w:t>
+            </w:r>
+          </w:p>
+        </w:tc>
+        <w:tc>
+          <w:tcPr>
+            <w:tcW w:w="2338" w:type="dxa"/>
+          </w:tcPr>
+          <w:p>
+            <w:r>
+              <w:t>Frequency</w:t>
+            </w:r>
+          </w:p>
+        </w:tc>
+      </w:tr>
+      <w:tr>
+        <w:tc>
+          <w:tcPr>
+            <w:tcW w:w="2337" w:type="dxa"/>
+          </w:tcPr>
+          <w:p>
+            <w:r>
+              <w:t>Sprint Summary Report</w:t>
+            </w:r>
+          </w:p>
+        </w:tc>
+        <w:tc>
+          <w:tcPr>
+            <w:tcW w:w="2337" w:type="dxa"/>
+          </w:tcPr>
+          <w:p>
+            <w:r>
+              <w:t xml:space="preserve">Goals met, items completed, blockers, and </w:t>
+            </w:r>
+            <w:r>
+              <w:t>a preview for next sprint.</w:t>
+            </w:r>
+          </w:p>
+        </w:tc>
+        <w:tc>
+          <w:tcPr>
+            <w:tcW w:w="2338" w:type="dxa"/>
+          </w:tcPr>
+          <w:p>
+            <w:r>
+              <w:t>Team members who couldn’t attend Sprint Review</w:t>
+            </w:r>
+          </w:p>
+        </w:tc>
+        <w:tc>
+          <w:tcPr>
+            <w:tcW w:w="2338" w:type="dxa"/>
+          </w:tcPr>
+          <w:p>
+            <w:r>
+              <w:t>End of every sprint</w:t>
+            </w:r>
+          </w:p>
+        </w:tc>
+      </w:tr>
+      <w:tr>
+        <w:tc>
+          <w:tcPr>
+            <w:tcW w:w="2337" w:type="dxa"/>
+          </w:tcPr>
+          <w:p>
+            <w:r>
+              <w:t>Jira Board &amp; Backlog</w:t>
+            </w:r>
+          </w:p>
+        </w:tc>
+        <w:tc>
+          <w:tcPr>
+            <w:tcW w:w="2337" w:type="dxa"/>
+          </w:tcPr>
+          <w:p>
+            <w:r>
+              <w:t>Real-time status of every backlog item.</w:t>
+            </w:r>
+          </w:p>
+        </w:tc>
+        <w:tc>
+          <w:tcPr>
+            <w:tcW w:w="2338" w:type="dxa"/>
+          </w:tcPr>
+          <w:p>
+            <w:r>
+              <w:t>Active teams,</w:t>
+            </w:r>
+          </w:p>
+          <w:p>
+            <w:r>
+              <w:t>Project Manager</w:t>
+            </w:r>
+          </w:p>
+        </w:tc>
+        <w:tc>
+          <w:tcPr>
+            <w:tcW w:w="2338" w:type="dxa"/>
+          </w:tcPr>
+          <w:p>
+            <w:r>
+              <w:t>Always active, though subject to update every Backlog Refinement meeting</w:t>
+            </w:r>
+          </w:p>
+        </w:tc>
+      </w:tr>
+      <w:tr>
+        <w:tc>
+          <w:tcPr>
+            <w:tcW w:w="2337" w:type="dxa"/>
+          </w:tcPr>
+          <w:p>
+            <w:r>
+              <w:t>Risk Register</w:t>
+            </w:r>
+          </w:p>
+        </w:tc>
+        <w:tc>
+          <w:tcPr>
+            <w:tcW w:w="2337" w:type="dxa"/>
+          </w:tcPr>
+          <w:p>
+            <w:r>
+              <w:t>Risk descriptions</w:t>
+            </w:r>
+            <w:r>
+              <w:t xml:space="preserve"> as well as their respective status/notes.</w:t>
+            </w:r>
+          </w:p>
+        </w:tc>
+        <w:tc>
+          <w:tcPr>
+            <w:tcW w:w="2338" w:type="dxa"/>
+          </w:tcPr>
+          <w:p>
+            <w:r>
+              <w:t>Risk Manager,</w:t>
+            </w:r>
+          </w:p>
+          <w:p>
+            <w:r>
+              <w:t>Project Manager</w:t>
+            </w:r>
+          </w:p>
+        </w:tc>
+        <w:tc>
+          <w:tcPr>
+            <w:tcW w:w="2338" w:type="dxa"/>
+          </w:tcPr>
+          <w:p>
+            <w:r>
+              <w:t>Weekly (Per Risk Review meeting.)</w:t>
+            </w:r>
+          </w:p>
+        </w:tc>
+      </w:tr>
+      <w:tr>
+        <w:tc>
+          <w:tcPr>
+            <w:tcW w:w="2337" w:type="dxa"/>
+          </w:tcPr>
+          <w:p>
+            <w:r>
+              <w:lastRenderedPageBreak/>
+              <w:t>Escalation Report</w:t>
+            </w:r>
+          </w:p>
+        </w:tc>
+        <w:tc>
+          <w:tcPr>
+            <w:tcW w:w="2337" w:type="dxa"/>
+          </w:tcPr>
+          <w:p>
+            <w:r>
+              <w:t>Any issues serious enough to warrant focused attention.</w:t>
+            </w:r>
+          </w:p>
+        </w:tc>
+        <w:tc>
+          <w:tcPr>
+            <w:tcW w:w="2338" w:type="dxa"/>
+          </w:tcPr>
+          <w:p>
+            <w:r>
+              <w:t xml:space="preserve">Project Manager, Risk Manager, </w:t>
+            </w:r>
+          </w:p>
+          <w:p>
+            <w:r>
+              <w:t>Security Team,</w:t>
+            </w:r>
+          </w:p>
+          <w:p>
+            <w:r>
+              <w:t>Stakeholders (Depends if issue is scope related.)</w:t>
+            </w:r>
+          </w:p>
+        </w:tc>
+        <w:tc>
+          <w:tcPr>
+            <w:tcW w:w="2338" w:type="dxa"/>
+          </w:tcPr>
+          <w:p>
+            <w:r>
+              <w:t>Ad hoc (Only occurs when needed.)</w:t>
+            </w:r>
+          </w:p>
+        </w:tc>
+      </w:tr>
+      <w:tr>
+        <w:tc>
+          <w:tcPr>
+            <w:tcW w:w="2337" w:type="dxa"/>
+          </w:tcPr>
+          <w:p>
+            <w:r>
+              <w:t>Milestone Report</w:t>
+            </w:r>
+          </w:p>
+        </w:tc>
+        <w:tc>
+          <w:tcPr>
+            <w:tcW w:w="2337" w:type="dxa"/>
+          </w:tcPr>
+          <w:p>
+            <w:r>
+              <w:t>Summary of major checkpoints and milestones.</w:t>
+            </w:r>
+          </w:p>
+        </w:tc>
+        <w:tc>
+          <w:tcPr>
+            <w:tcW w:w="2338" w:type="dxa"/>
+          </w:tcPr>
+          <w:p>
+            <w:r>
+              <w:t>Stakeholders</w:t>
+            </w:r>
+          </w:p>
+        </w:tc>
+        <w:tc>
+          <w:tcPr>
+            <w:tcW w:w="2338" w:type="dxa"/>
+          </w:tcPr>
+          <w:p>
+            <w:r>
+              <w:t>After each major milestone</w:t>
+            </w:r>
+          </w:p>
+        </w:tc>
+      </w:tr>
+    </w:tbl>
+    <w:p/>
     <w:sectPr>
       <w:pgSz w:w="12240" w:h="15840"/>
       <w:pgMar w:top="1440" w:right="1440" w:bottom="1440" w:left="1440" w:header="720" w:footer="720" w:gutter="0"/>
@@ -6731,6 +9705,95 @@
     </w:lvl>
   </w:abstractNum>
   <w:abstractNum w:abstractNumId="13" w15:restartNumberingAfterBreak="0">
+    <w:nsid w:val="34637CA2"/>
+    <w:multiLevelType w:val="hybridMultilevel"/>
+    <w:tmpl w:val="648A991E"/>
+    <w:lvl w:ilvl="0" w:tplc="0409000F">
+      <w:start w:val="1"/>
+      <w:numFmt w:val="decimal"/>
+      <w:lvlText w:val="%1."/>
+      <w:lvlJc w:val="left"/>
+      <w:pPr>
+        <w:ind w:left="720" w:hanging="360"/>
+      </w:pPr>
+      <w:rPr>
+        <w:rFonts w:hint="default"/>
+      </w:rPr>
+    </w:lvl>
+    <w:lvl w:ilvl="1" w:tplc="04090019" w:tentative="1">
+      <w:start w:val="1"/>
+      <w:numFmt w:val="lowerLetter"/>
+      <w:lvlText w:val="%2."/>
+      <w:lvlJc w:val="left"/>
+      <w:pPr>
+        <w:ind w:left="1440" w:hanging="360"/>
+      </w:pPr>
+    </w:lvl>
+    <w:lvl w:ilvl="2" w:tplc="0409001B" w:tentative="1">
+      <w:start w:val="1"/>
+      <w:numFmt w:val="lowerRoman"/>
+      <w:lvlText w:val="%3."/>
+      <w:lvlJc w:val="right"/>
+      <w:pPr>
+        <w:ind w:left="2160" w:hanging="180"/>
+      </w:pPr>
+    </w:lvl>
+    <w:lvl w:ilvl="3" w:tplc="0409000F" w:tentative="1">
+      <w:start w:val="1"/>
+      <w:numFmt w:val="decimal"/>
+      <w:lvlText w:val="%4."/>
+      <w:lvlJc w:val="left"/>
+      <w:pPr>
+        <w:ind w:left="2880" w:hanging="360"/>
+      </w:pPr>
+    </w:lvl>
+    <w:lvl w:ilvl="4" w:tplc="04090019" w:tentative="1">
+      <w:start w:val="1"/>
+      <w:numFmt w:val="lowerLetter"/>
+      <w:lvlText w:val="%5."/>
+      <w:lvlJc w:val="left"/>
+      <w:pPr>
+        <w:ind w:left="3600" w:hanging="360"/>
+      </w:pPr>
+    </w:lvl>
+    <w:lvl w:ilvl="5" w:tplc="0409001B" w:tentative="1">
+      <w:start w:val="1"/>
+      <w:numFmt w:val="lowerRoman"/>
+      <w:lvlText w:val="%6."/>
+      <w:lvlJc w:val="right"/>
+      <w:pPr>
+        <w:ind w:left="4320" w:hanging="180"/>
+      </w:pPr>
+    </w:lvl>
+    <w:lvl w:ilvl="6" w:tplc="0409000F" w:tentative="1">
+      <w:start w:val="1"/>
+      <w:numFmt w:val="decimal"/>
+      <w:lvlText w:val="%7."/>
+      <w:lvlJc w:val="left"/>
+      <w:pPr>
+        <w:ind w:left="5040" w:hanging="360"/>
+      </w:pPr>
+    </w:lvl>
+    <w:lvl w:ilvl="7" w:tplc="04090019" w:tentative="1">
+      <w:start w:val="1"/>
+      <w:numFmt w:val="lowerLetter"/>
+      <w:lvlText w:val="%8."/>
+      <w:lvlJc w:val="left"/>
+      <w:pPr>
+        <w:ind w:left="5760" w:hanging="360"/>
+      </w:pPr>
+    </w:lvl>
+    <w:lvl w:ilvl="8" w:tplc="0409001B" w:tentative="1">
+      <w:start w:val="1"/>
+      <w:numFmt w:val="lowerRoman"/>
+      <w:lvlText w:val="%9."/>
+      <w:lvlJc w:val="right"/>
+      <w:pPr>
+        <w:ind w:left="6480" w:hanging="180"/>
+      </w:pPr>
+    </w:lvl>
+  </w:abstractNum>
+  <w:abstractNum w:abstractNumId="14" w15:restartNumberingAfterBreak="0">
     <w:nsid w:val="3C2D4A7D"/>
     <w:multiLevelType w:val="hybridMultilevel"/>
     <w:tmpl w:val="2AA8E718"/>
@@ -6819,7 +9882,7 @@
       </w:pPr>
     </w:lvl>
   </w:abstractNum>
-  <w:abstractNum w:abstractNumId="14" w15:restartNumberingAfterBreak="0">
+  <w:abstractNum w:abstractNumId="15" w15:restartNumberingAfterBreak="0">
     <w:nsid w:val="430A23CE"/>
     <w:multiLevelType w:val="hybridMultilevel"/>
     <w:tmpl w:val="83502BC2"/>
@@ -6908,7 +9971,7 @@
       </w:pPr>
     </w:lvl>
   </w:abstractNum>
-  <w:abstractNum w:abstractNumId="15" w15:restartNumberingAfterBreak="0">
+  <w:abstractNum w:abstractNumId="16" w15:restartNumberingAfterBreak="0">
     <w:nsid w:val="457734F1"/>
     <w:multiLevelType w:val="hybridMultilevel"/>
     <w:tmpl w:val="13A293C2"/>
@@ -6997,7 +10060,7 @@
       </w:pPr>
     </w:lvl>
   </w:abstractNum>
-  <w:abstractNum w:abstractNumId="16" w15:restartNumberingAfterBreak="0">
+  <w:abstractNum w:abstractNumId="17" w15:restartNumberingAfterBreak="0">
     <w:nsid w:val="46C23F93"/>
     <w:multiLevelType w:val="hybridMultilevel"/>
     <w:tmpl w:val="684821EE"/>
@@ -7086,7 +10149,7 @@
       </w:pPr>
     </w:lvl>
   </w:abstractNum>
-  <w:abstractNum w:abstractNumId="17" w15:restartNumberingAfterBreak="0">
+  <w:abstractNum w:abstractNumId="18" w15:restartNumberingAfterBreak="0">
     <w:nsid w:val="47512CDC"/>
     <w:multiLevelType w:val="hybridMultilevel"/>
     <w:tmpl w:val="AA8E84D8"/>
@@ -7175,7 +10238,7 @@
       </w:pPr>
     </w:lvl>
   </w:abstractNum>
-  <w:abstractNum w:abstractNumId="18" w15:restartNumberingAfterBreak="0">
+  <w:abstractNum w:abstractNumId="19" w15:restartNumberingAfterBreak="0">
     <w:nsid w:val="4D562A4C"/>
     <w:multiLevelType w:val="hybridMultilevel"/>
     <w:tmpl w:val="1CDEB7AA"/>
@@ -7288,7 +10351,96 @@
       </w:rPr>
     </w:lvl>
   </w:abstractNum>
-  <w:abstractNum w:abstractNumId="19" w15:restartNumberingAfterBreak="0">
+  <w:abstractNum w:abstractNumId="20" w15:restartNumberingAfterBreak="0">
+    <w:nsid w:val="51E92EB7"/>
+    <w:multiLevelType w:val="hybridMultilevel"/>
+    <w:tmpl w:val="C68A3CD4"/>
+    <w:lvl w:ilvl="0" w:tplc="0409000F">
+      <w:start w:val="1"/>
+      <w:numFmt w:val="decimal"/>
+      <w:lvlText w:val="%1."/>
+      <w:lvlJc w:val="left"/>
+      <w:pPr>
+        <w:ind w:left="720" w:hanging="360"/>
+      </w:pPr>
+      <w:rPr>
+        <w:rFonts w:hint="default"/>
+      </w:rPr>
+    </w:lvl>
+    <w:lvl w:ilvl="1" w:tplc="04090019" w:tentative="1">
+      <w:start w:val="1"/>
+      <w:numFmt w:val="lowerLetter"/>
+      <w:lvlText w:val="%2."/>
+      <w:lvlJc w:val="left"/>
+      <w:pPr>
+        <w:ind w:left="1440" w:hanging="360"/>
+      </w:pPr>
+    </w:lvl>
+    <w:lvl w:ilvl="2" w:tplc="0409001B" w:tentative="1">
+      <w:start w:val="1"/>
+      <w:numFmt w:val="lowerRoman"/>
+      <w:lvlText w:val="%3."/>
+      <w:lvlJc w:val="right"/>
+      <w:pPr>
+        <w:ind w:left="2160" w:hanging="180"/>
+      </w:pPr>
+    </w:lvl>
+    <w:lvl w:ilvl="3" w:tplc="0409000F" w:tentative="1">
+      <w:start w:val="1"/>
+      <w:numFmt w:val="decimal"/>
+      <w:lvlText w:val="%4."/>
+      <w:lvlJc w:val="left"/>
+      <w:pPr>
+        <w:ind w:left="2880" w:hanging="360"/>
+      </w:pPr>
+    </w:lvl>
+    <w:lvl w:ilvl="4" w:tplc="04090019" w:tentative="1">
+      <w:start w:val="1"/>
+      <w:numFmt w:val="lowerLetter"/>
+      <w:lvlText w:val="%5."/>
+      <w:lvlJc w:val="left"/>
+      <w:pPr>
+        <w:ind w:left="3600" w:hanging="360"/>
+      </w:pPr>
+    </w:lvl>
+    <w:lvl w:ilvl="5" w:tplc="0409001B" w:tentative="1">
+      <w:start w:val="1"/>
+      <w:numFmt w:val="lowerRoman"/>
+      <w:lvlText w:val="%6."/>
+      <w:lvlJc w:val="right"/>
+      <w:pPr>
+        <w:ind w:left="4320" w:hanging="180"/>
+      </w:pPr>
+    </w:lvl>
+    <w:lvl w:ilvl="6" w:tplc="0409000F" w:tentative="1">
+      <w:start w:val="1"/>
+      <w:numFmt w:val="decimal"/>
+      <w:lvlText w:val="%7."/>
+      <w:lvlJc w:val="left"/>
+      <w:pPr>
+        <w:ind w:left="5040" w:hanging="360"/>
+      </w:pPr>
+    </w:lvl>
+    <w:lvl w:ilvl="7" w:tplc="04090019" w:tentative="1">
+      <w:start w:val="1"/>
+      <w:numFmt w:val="lowerLetter"/>
+      <w:lvlText w:val="%8."/>
+      <w:lvlJc w:val="left"/>
+      <w:pPr>
+        <w:ind w:left="5760" w:hanging="360"/>
+      </w:pPr>
+    </w:lvl>
+    <w:lvl w:ilvl="8" w:tplc="0409001B" w:tentative="1">
+      <w:start w:val="1"/>
+      <w:numFmt w:val="lowerRoman"/>
+      <w:lvlText w:val="%9."/>
+      <w:lvlJc w:val="right"/>
+      <w:pPr>
+        <w:ind w:left="6480" w:hanging="180"/>
+      </w:pPr>
+    </w:lvl>
+  </w:abstractNum>
+  <w:abstractNum w:abstractNumId="21" w15:restartNumberingAfterBreak="0">
     <w:nsid w:val="57BD252E"/>
     <w:multiLevelType w:val="hybridMultilevel"/>
     <w:tmpl w:val="EC087AE0"/>
@@ -7377,7 +10529,7 @@
       </w:pPr>
     </w:lvl>
   </w:abstractNum>
-  <w:abstractNum w:abstractNumId="20" w15:restartNumberingAfterBreak="0">
+  <w:abstractNum w:abstractNumId="22" w15:restartNumberingAfterBreak="0">
     <w:nsid w:val="5A0B3075"/>
     <w:multiLevelType w:val="hybridMultilevel"/>
     <w:tmpl w:val="A6DCD23A"/>
@@ -7490,7 +10642,7 @@
       </w:rPr>
     </w:lvl>
   </w:abstractNum>
-  <w:abstractNum w:abstractNumId="21" w15:restartNumberingAfterBreak="0">
+  <w:abstractNum w:abstractNumId="23" w15:restartNumberingAfterBreak="0">
     <w:nsid w:val="5E761FA3"/>
     <w:multiLevelType w:val="hybridMultilevel"/>
     <w:tmpl w:val="DA7AF96C"/>
@@ -7579,7 +10731,7 @@
       </w:pPr>
     </w:lvl>
   </w:abstractNum>
-  <w:abstractNum w:abstractNumId="22" w15:restartNumberingAfterBreak="0">
+  <w:abstractNum w:abstractNumId="24" w15:restartNumberingAfterBreak="0">
     <w:nsid w:val="61827201"/>
     <w:multiLevelType w:val="hybridMultilevel"/>
     <w:tmpl w:val="CFAA42D4"/>
@@ -7668,7 +10820,7 @@
       </w:pPr>
     </w:lvl>
   </w:abstractNum>
-  <w:abstractNum w:abstractNumId="23" w15:restartNumberingAfterBreak="0">
+  <w:abstractNum w:abstractNumId="25" w15:restartNumberingAfterBreak="0">
     <w:nsid w:val="6B2D7D2E"/>
     <w:multiLevelType w:val="multilevel"/>
     <w:tmpl w:val="1F429998"/>
@@ -7781,7 +10933,7 @@
       </w:rPr>
     </w:lvl>
   </w:abstractNum>
-  <w:abstractNum w:abstractNumId="24" w15:restartNumberingAfterBreak="0">
+  <w:abstractNum w:abstractNumId="26" w15:restartNumberingAfterBreak="0">
     <w:nsid w:val="6B7531CF"/>
     <w:multiLevelType w:val="hybridMultilevel"/>
     <w:tmpl w:val="0C661E4E"/>
@@ -7894,7 +11046,7 @@
       </w:rPr>
     </w:lvl>
   </w:abstractNum>
-  <w:abstractNum w:abstractNumId="25" w15:restartNumberingAfterBreak="0">
+  <w:abstractNum w:abstractNumId="27" w15:restartNumberingAfterBreak="0">
     <w:nsid w:val="75B32A7A"/>
     <w:multiLevelType w:val="multilevel"/>
     <w:tmpl w:val="CA28FF00"/>
@@ -8016,13 +11168,13 @@
     </w:lvl>
   </w:abstractNum>
   <w:num w:numId="1" w16cid:durableId="1979450348">
-    <w:abstractNumId w:val="25"/>
+    <w:abstractNumId w:val="27"/>
   </w:num>
   <w:num w:numId="2" w16cid:durableId="1097408708">
-    <w:abstractNumId w:val="20"/>
+    <w:abstractNumId w:val="22"/>
   </w:num>
   <w:num w:numId="3" w16cid:durableId="2040886575">
-    <w:abstractNumId w:val="18"/>
+    <w:abstractNumId w:val="19"/>
   </w:num>
   <w:num w:numId="4" w16cid:durableId="237984452">
     <w:abstractNumId w:val="12"/>
@@ -8031,7 +11183,7 @@
     <w:abstractNumId w:val="8"/>
   </w:num>
   <w:num w:numId="6" w16cid:durableId="1305087170">
-    <w:abstractNumId w:val="16"/>
+    <w:abstractNumId w:val="17"/>
   </w:num>
   <w:num w:numId="7" w16cid:durableId="1507748982">
     <w:abstractNumId w:val="4"/>
@@ -8046,19 +11198,19 @@
     <w:abstractNumId w:val="6"/>
   </w:num>
   <w:num w:numId="11" w16cid:durableId="1979412746">
-    <w:abstractNumId w:val="17"/>
+    <w:abstractNumId w:val="18"/>
   </w:num>
   <w:num w:numId="12" w16cid:durableId="480343513">
     <w:abstractNumId w:val="5"/>
   </w:num>
   <w:num w:numId="13" w16cid:durableId="1515414818">
-    <w:abstractNumId w:val="15"/>
+    <w:abstractNumId w:val="16"/>
   </w:num>
   <w:num w:numId="14" w16cid:durableId="591204239">
     <w:abstractNumId w:val="9"/>
   </w:num>
   <w:num w:numId="15" w16cid:durableId="1752120828">
-    <w:abstractNumId w:val="13"/>
+    <w:abstractNumId w:val="14"/>
   </w:num>
   <w:num w:numId="16" w16cid:durableId="384258906">
     <w:abstractNumId w:val="11"/>
@@ -8070,28 +11222,34 @@
     <w:abstractNumId w:val="3"/>
   </w:num>
   <w:num w:numId="19" w16cid:durableId="624894307">
-    <w:abstractNumId w:val="14"/>
+    <w:abstractNumId w:val="15"/>
   </w:num>
   <w:num w:numId="20" w16cid:durableId="2052874863">
-    <w:abstractNumId w:val="21"/>
+    <w:abstractNumId w:val="23"/>
   </w:num>
   <w:num w:numId="21" w16cid:durableId="61561100">
     <w:abstractNumId w:val="2"/>
   </w:num>
   <w:num w:numId="22" w16cid:durableId="841941311">
-    <w:abstractNumId w:val="22"/>
+    <w:abstractNumId w:val="24"/>
   </w:num>
   <w:num w:numId="23" w16cid:durableId="248199759">
     <w:abstractNumId w:val="1"/>
   </w:num>
   <w:num w:numId="24" w16cid:durableId="1670867755">
-    <w:abstractNumId w:val="23"/>
+    <w:abstractNumId w:val="25"/>
   </w:num>
   <w:num w:numId="25" w16cid:durableId="52317453">
-    <w:abstractNumId w:val="24"/>
+    <w:abstractNumId w:val="26"/>
   </w:num>
   <w:num w:numId="26" w16cid:durableId="1889028053">
-    <w:abstractNumId w:val="19"/>
+    <w:abstractNumId w:val="21"/>
+  </w:num>
+  <w:num w:numId="27" w16cid:durableId="1923296696">
+    <w:abstractNumId w:val="13"/>
+  </w:num>
+  <w:num w:numId="28" w16cid:durableId="591201819">
+    <w:abstractNumId w:val="20"/>
   </w:num>
 </w:numbering>
 </file>
@@ -8546,7 +11704,6 @@
     <w:next w:val="Normal"/>
     <w:link w:val="Heading3Char"/>
     <w:uiPriority w:val="9"/>
-    <w:semiHidden/>
     <w:unhideWhenUsed/>
     <w:qFormat/>
     <w:rsid w:val="00274FE4"/>
@@ -8698,6 +11855,7 @@
   <w:style w:type="character" w:default="1" w:styleId="DefaultParagraphFont">
     <w:name w:val="Default Paragraph Font"/>
     <w:uiPriority w:val="1"/>
+    <w:semiHidden/>
     <w:unhideWhenUsed/>
   </w:style>
   <w:style w:type="table" w:default="1" w:styleId="TableNormal">
@@ -8752,7 +11910,6 @@
     <w:basedOn w:val="DefaultParagraphFont"/>
     <w:link w:val="Heading3"/>
     <w:uiPriority w:val="9"/>
-    <w:semiHidden/>
     <w:rsid w:val="00274FE4"/>
     <w:rPr>
       <w:rFonts w:eastAsiaTheme="majorEastAsia" w:cstheme="majorBidi"/>
@@ -9009,6 +12166,25 @@
       <w:color w:val="0F4761" w:themeColor="accent1" w:themeShade="BF"/>
       <w:spacing w:val="5"/>
     </w:rPr>
+  </w:style>
+  <w:style w:type="table" w:styleId="TableGrid">
+    <w:name w:val="Table Grid"/>
+    <w:basedOn w:val="TableNormal"/>
+    <w:uiPriority w:val="39"/>
+    <w:rsid w:val="00F20128"/>
+    <w:pPr>
+      <w:spacing w:after="0" w:line="240" w:lineRule="auto"/>
+    </w:pPr>
+    <w:tblPr>
+      <w:tblBorders>
+        <w:top w:val="single" w:sz="4" w:space="0" w:color="auto"/>
+        <w:left w:val="single" w:sz="4" w:space="0" w:color="auto"/>
+        <w:bottom w:val="single" w:sz="4" w:space="0" w:color="auto"/>
+        <w:right w:val="single" w:sz="4" w:space="0" w:color="auto"/>
+        <w:insideH w:val="single" w:sz="4" w:space="0" w:color="auto"/>
+        <w:insideV w:val="single" w:sz="4" w:space="0" w:color="auto"/>
+      </w:tblBorders>
+    </w:tblPr>
   </w:style>
 </w:styles>
 </file>

</xml_diff>